<commit_message>
Update CLAUDE.md for Step 7; sync canonical docs from Drive
</commit_message>
<xml_diff>
--- a/docs/Oros - CKM Data Readiness - Methodology Architecture.docx
+++ b/docs/Oros - CKM Data Readiness - Methodology Architecture.docx
@@ -1,13 +1,13 @@
 
 <file path=word/document.xml><?xml version="1.0" encoding="utf-8"?>
-<w:document xmlns:wpc="http://schemas.microsoft.com/office/word/2010/wordprocessingCanvas" xmlns:mc="http://schemas.openxmlformats.org/markup-compatibility/2006" xmlns:o="urn:schemas-microsoft-com:office:office" xmlns:r="http://schemas.openxmlformats.org/officeDocument/2006/relationships" xmlns:m="http://schemas.openxmlformats.org/officeDocument/2006/math" xmlns:v="urn:schemas-microsoft-com:vml" xmlns:wp14="http://schemas.microsoft.com/office/word/2010/wordprocessingDrawing" xmlns:wp="http://schemas.openxmlformats.org/drawingml/2006/wordprocessingDrawing" xmlns:w10="urn:schemas-microsoft-com:office:word" xmlns:w="http://schemas.openxmlformats.org/wordprocessingml/2006/main" xmlns:w14="http://schemas.microsoft.com/office/word/2010/wordml" xmlns:w15="http://schemas.microsoft.com/office/word/2012/wordml" xmlns:wpg="http://schemas.microsoft.com/office/word/2010/wordprocessingGroup" xmlns:wpi="http://schemas.microsoft.com/office/word/2010/wordprocessingInk" xmlns:wne="http://schemas.microsoft.com/office/word/2006/wordml" xmlns:wps="http://schemas.microsoft.com/office/word/2010/wordprocessingShape" xmlns:cx="http://schemas.microsoft.com/office/drawing/2014/chartex" xmlns:cx1="http://schemas.microsoft.com/office/drawing/2015/9/8/chartex" xmlns:cx2="http://schemas.microsoft.com/office/drawing/2015/10/21/chartex" xmlns:cx3="http://schemas.microsoft.com/office/drawing/2016/5/9/chartex" xmlns:cx4="http://schemas.microsoft.com/office/drawing/2016/5/10/chartex" xmlns:cx5="http://schemas.microsoft.com/office/drawing/2016/5/11/chartex" xmlns:cx6="http://schemas.microsoft.com/office/drawing/2016/5/12/chartex" xmlns:cx7="http://schemas.microsoft.com/office/drawing/2016/5/13/chartex" xmlns:cx8="http://schemas.microsoft.com/office/drawing/2016/5/14/chartex" xmlns:aink="http://schemas.microsoft.com/office/drawing/2016/ink" xmlns:am3d="http://schemas.microsoft.com/office/drawing/2017/model3d" xmlns:w16cex="http://schemas.microsoft.com/office/word/2018/wordml/cex" xmlns:w16cid="http://schemas.microsoft.com/office/word/2016/wordml/cid" xmlns:w16="http://schemas.microsoft.com/office/word/2018/wordml" xmlns:w16sdtdh="http://schemas.microsoft.com/office/word/2020/wordml/sdtdatahash" xmlns:w16se="http://schemas.microsoft.com/office/word/2015/wordml/symex" mc:Ignorable="w14 w15 wp14">
+<w:document xmlns:wpc="http://schemas.microsoft.com/office/word/2010/wordprocessingCanvas" xmlns:cx="http://schemas.microsoft.com/office/drawing/2014/chartex" xmlns:cx1="http://schemas.microsoft.com/office/drawing/2015/9/8/chartex" xmlns:cx2="http://schemas.microsoft.com/office/drawing/2015/10/21/chartex" xmlns:cx3="http://schemas.microsoft.com/office/drawing/2016/5/9/chartex" xmlns:cx4="http://schemas.microsoft.com/office/drawing/2016/5/10/chartex" xmlns:cx5="http://schemas.microsoft.com/office/drawing/2016/5/11/chartex" xmlns:cx6="http://schemas.microsoft.com/office/drawing/2016/5/12/chartex" xmlns:cx7="http://schemas.microsoft.com/office/drawing/2016/5/13/chartex" xmlns:cx8="http://schemas.microsoft.com/office/drawing/2016/5/14/chartex" xmlns:mc="http://schemas.openxmlformats.org/markup-compatibility/2006" xmlns:aink="http://schemas.microsoft.com/office/drawing/2016/ink" xmlns:am3d="http://schemas.microsoft.com/office/drawing/2017/model3d" xmlns:o="urn:schemas-microsoft-com:office:office" xmlns:oel="http://schemas.microsoft.com/office/2019/extlst" xmlns:r="http://schemas.openxmlformats.org/officeDocument/2006/relationships" xmlns:m="http://schemas.openxmlformats.org/officeDocument/2006/math" xmlns:v="urn:schemas-microsoft-com:vml" xmlns:wp14="http://schemas.microsoft.com/office/word/2010/wordprocessingDrawing" xmlns:wp="http://schemas.openxmlformats.org/drawingml/2006/wordprocessingDrawing" xmlns:w10="urn:schemas-microsoft-com:office:word" xmlns:w="http://schemas.openxmlformats.org/wordprocessingml/2006/main" xmlns:w14="http://schemas.microsoft.com/office/word/2010/wordml" xmlns:w15="http://schemas.microsoft.com/office/word/2012/wordml" xmlns:w16cex="http://schemas.microsoft.com/office/word/2018/wordml/cex" xmlns:w16cid="http://schemas.microsoft.com/office/word/2016/wordml/cid" xmlns:w16="http://schemas.microsoft.com/office/word/2018/wordml" xmlns:w16du="http://schemas.microsoft.com/office/word/2023/wordml/word16du" xmlns:w16sdtdh="http://schemas.microsoft.com/office/word/2020/wordml/sdtdatahash" xmlns:w16sdtfl="http://schemas.microsoft.com/office/word/2024/wordml/sdtformatlock" xmlns:w16se="http://schemas.microsoft.com/office/word/2015/wordml/symex" xmlns:wpg="http://schemas.microsoft.com/office/word/2010/wordprocessingGroup" xmlns:wpi="http://schemas.microsoft.com/office/word/2010/wordprocessingInk" xmlns:wne="http://schemas.microsoft.com/office/word/2006/wordml" xmlns:wps="http://schemas.microsoft.com/office/word/2010/wordprocessingShape" mc:Ignorable="w14 w15 w16se w16cid w16 w16cex w16sdtdh w16sdtfl w16du wp14">
   <w:body>
     <w:p>
       <w:pPr>
         <w:pStyle w:val="Heading1"/>
       </w:pPr>
       <w:r>
-        <w:t xml:space="preserve">Methodology Architecture</w:t>
+        <w:t>Methodology Architecture</w:t>
       </w:r>
     </w:p>
     <w:p>
@@ -20,23 +20,20 @@
           <w:sz w:val="24"/>
           <w:szCs w:val="24"/>
         </w:rPr>
-        <w:t xml:space="preserve">CKM Data Readiness Infrastructure Pilot</w:t>
-      </w:r>
-    </w:p>
-    <w:p>
-      <w:pPr>
-        <w:spacing w:after="80"/>
-      </w:pPr>
-      <w:r>
-        <w:t xml:space="preserve"/>
-      </w:r>
+        <w:t>CKM Data Readiness Infrastructure Pilot</w:t>
+      </w:r>
+    </w:p>
+    <w:p>
+      <w:pPr>
+        <w:spacing w:after="80"/>
+      </w:pPr>
     </w:p>
     <w:p>
       <w:pPr>
         <w:pStyle w:val="Heading2"/>
       </w:pPr>
       <w:r>
-        <w:t xml:space="preserve">Purpose</w:t>
+        <w:t>Purpose</w:t>
       </w:r>
     </w:p>
     <w:p>
@@ -44,15 +41,7 @@
         <w:spacing w:after="100"/>
       </w:pPr>
       <w:r>
-        <w:t xml:space="preserve">The CKM Data Readiness methodology evaluates whether available clinical data is fit for purpose for specific operational programs. Rather than producing abstract data quality metrics, it answers a concrete operational question: can a given site run a specific clinical program with its current data — and if not, what needs to change?</w:t>
-      </w:r>
-    </w:p>
-    <w:p>
-      <w:pPr>
-        <w:spacing w:after="80"/>
-      </w:pPr>
-      <w:r>
-        <w:t xml:space="preserve"/>
+        <w:t>The CKM Data Readiness methodology evaluates whether available clinical data is fit for purpose for specific operational programs. Rather than producing abstract data quality metrics, it answers a concrete operational question: can a given site run a specific clinical program with its current data — and if not, what needs to change?</w:t>
       </w:r>
     </w:p>
     <w:p>
@@ -60,44 +49,64 @@
         <w:spacing w:after="100"/>
       </w:pPr>
       <w:r>
-        <w:t xml:space="preserve">The methodology is structured around three stages: evaluating each clinical variable, assessing whether the full set of variables required by a use case is ready, and generating targeted remediation guidance when it is not.</w:t>
-      </w:r>
-    </w:p>
-    <w:p>
-      <w:pPr>
-        <w:spacing w:after="80"/>
-      </w:pPr>
-      <w:r>
-        <w:t xml:space="preserve"/>
-      </w:r>
+        <w:t xml:space="preserve">This document provides the narrative architecture and </w:t>
+      </w:r>
+      <w:proofErr w:type="gramStart"/>
+      <w:r>
+        <w:t>worked</w:t>
+      </w:r>
+      <w:proofErr w:type="gramEnd"/>
+      <w:r>
+        <w:t xml:space="preserve"> examples for the methodology. The canonical object model — Variable, Condition Module, and Use Case Specification — is defined in the Architecture Specification (v1.2, April 2026), which is the authoritative reference for implementation and clinical collaboration.</w:t>
+      </w:r>
+    </w:p>
+    <w:p>
+      <w:pPr>
+        <w:spacing w:after="80"/>
+      </w:pPr>
+    </w:p>
+    <w:p>
+      <w:pPr>
+        <w:spacing w:after="100"/>
+      </w:pPr>
+      <w:r>
+        <w:t>The methodology is structured around three stages: evaluating each clinical variable, assessing whether the full set of variables required by a use case is ready, and generating targeted remediation guidance when it is not.</w:t>
+      </w:r>
+    </w:p>
+    <w:p>
+      <w:pPr>
+        <w:spacing w:after="80"/>
+      </w:pPr>
     </w:p>
     <w:p>
       <w:pPr>
         <w:pStyle w:val="Heading2"/>
       </w:pPr>
       <w:r>
-        <w:t xml:space="preserve">Core Model</w:t>
-      </w:r>
-    </w:p>
-    <w:p>
-      <w:pPr>
-        <w:spacing w:after="80"/>
-      </w:pPr>
-      <w:r>
-        <w:t xml:space="preserve"/>
-      </w:r>
+        <w:t>Core Model</w:t>
+      </w:r>
+    </w:p>
+    <w:p>
+      <w:pPr>
+        <w:spacing w:after="80"/>
+      </w:pPr>
     </w:p>
     <w:tbl>
       <w:tblPr>
-        <w:tblW w:type="dxa" w:w="9360"/>
+        <w:tblW w:w="9360" w:type="dxa"/>
         <w:tblBorders>
-          <w:top w:val="single" w:color="auto" w:sz="4"/>
-          <w:left w:val="single" w:color="auto" w:sz="4"/>
-          <w:bottom w:val="single" w:color="auto" w:sz="4"/>
-          <w:right w:val="single" w:color="auto" w:sz="4"/>
-          <w:insideH w:val="single" w:color="auto" w:sz="4"/>
-          <w:insideV w:val="single" w:color="auto" w:sz="4"/>
+          <w:top w:val="single" w:sz="4" w:space="0" w:color="auto"/>
+          <w:left w:val="single" w:sz="4" w:space="0" w:color="auto"/>
+          <w:bottom w:val="single" w:sz="4" w:space="0" w:color="auto"/>
+          <w:right w:val="single" w:sz="4" w:space="0" w:color="auto"/>
+          <w:insideH w:val="single" w:sz="4" w:space="0" w:color="auto"/>
+          <w:insideV w:val="single" w:sz="4" w:space="0" w:color="auto"/>
         </w:tblBorders>
+        <w:tblCellMar>
+          <w:left w:w="10" w:type="dxa"/>
+          <w:right w:w="10" w:type="dxa"/>
+        </w:tblCellMar>
+        <w:tblLook w:val="0000" w:firstRow="0" w:lastRow="0" w:firstColumn="0" w:lastColumn="0" w:noHBand="0" w:noVBand="0"/>
       </w:tblPr>
       <w:tblGrid>
         <w:gridCol w:w="3000"/>
@@ -105,21 +114,27 @@
         <w:gridCol w:w="3360"/>
       </w:tblGrid>
       <w:tr>
+        <w:tblPrEx>
+          <w:tblCellMar>
+            <w:top w:w="0" w:type="dxa"/>
+            <w:bottom w:w="0" w:type="dxa"/>
+          </w:tblCellMar>
+        </w:tblPrEx>
         <w:tc>
           <w:tcPr>
-            <w:tcW w:type="dxa" w:w="3000"/>
+            <w:tcW w:w="3000" w:type="dxa"/>
             <w:tcBorders>
-              <w:top w:val="single" w:color="2E5F9E" w:sz="4"/>
-              <w:left w:val="single" w:color="2E5F9E" w:sz="4"/>
-              <w:bottom w:val="none" w:color="2E5F9E" w:sz="0"/>
-              <w:right w:val="single" w:color="2E5F9E" w:sz="4"/>
+              <w:top w:val="single" w:sz="4" w:space="0" w:color="2E5F9E"/>
+              <w:left w:val="single" w:sz="4" w:space="0" w:color="2E5F9E"/>
+              <w:bottom w:val="none" w:sz="0" w:space="0" w:color="2E5F9E"/>
+              <w:right w:val="single" w:sz="4" w:space="0" w:color="2E5F9E"/>
             </w:tcBorders>
-            <w:shd w:fill="2E5F9E" w:val="clear"/>
+            <w:shd w:val="clear" w:color="auto" w:fill="2E5F9E"/>
             <w:tcMar>
-              <w:top w:type="dxa" w:w="100"/>
-              <w:left w:type="dxa" w:w="140"/>
-              <w:bottom w:type="dxa" w:w="80"/>
-              <w:right w:type="dxa" w:w="140"/>
+              <w:top w:w="100" w:type="dxa"/>
+              <w:left w:w="140" w:type="dxa"/>
+              <w:bottom w:w="80" w:type="dxa"/>
+              <w:right w:w="140" w:type="dxa"/>
             </w:tcMar>
           </w:tcPr>
           <w:p>
@@ -131,25 +146,25 @@
                 <w:sz w:val="20"/>
                 <w:szCs w:val="20"/>
               </w:rPr>
-              <w:t xml:space="preserve">1. Variable-Level Evaluation</w:t>
+              <w:t>1. Variable-Level Evaluation</w:t>
             </w:r>
           </w:p>
         </w:tc>
         <w:tc>
           <w:tcPr>
-            <w:tcW w:type="dxa" w:w="3000"/>
+            <w:tcW w:w="3000" w:type="dxa"/>
             <w:tcBorders>
-              <w:top w:val="single" w:color="2A7A6F" w:sz="4"/>
-              <w:left w:val="single" w:color="2A7A6F" w:sz="4"/>
-              <w:bottom w:val="none" w:color="2A7A6F" w:sz="0"/>
-              <w:right w:val="single" w:color="2A7A6F" w:sz="4"/>
+              <w:top w:val="single" w:sz="4" w:space="0" w:color="2A7A6F"/>
+              <w:left w:val="single" w:sz="4" w:space="0" w:color="2A7A6F"/>
+              <w:bottom w:val="none" w:sz="0" w:space="0" w:color="2A7A6F"/>
+              <w:right w:val="single" w:sz="4" w:space="0" w:color="2A7A6F"/>
             </w:tcBorders>
-            <w:shd w:fill="2A7A6F" w:val="clear"/>
+            <w:shd w:val="clear" w:color="auto" w:fill="2A7A6F"/>
             <w:tcMar>
-              <w:top w:type="dxa" w:w="100"/>
-              <w:left w:type="dxa" w:w="140"/>
-              <w:bottom w:type="dxa" w:w="80"/>
-              <w:right w:type="dxa" w:w="140"/>
+              <w:top w:w="100" w:type="dxa"/>
+              <w:left w:w="140" w:type="dxa"/>
+              <w:bottom w:w="80" w:type="dxa"/>
+              <w:right w:w="140" w:type="dxa"/>
             </w:tcMar>
           </w:tcPr>
           <w:p>
@@ -161,25 +176,25 @@
                 <w:sz w:val="20"/>
                 <w:szCs w:val="20"/>
               </w:rPr>
-              <w:t xml:space="preserve">2. Use-Case Evaluation</w:t>
+              <w:t>2. Use-Case Evaluation</w:t>
             </w:r>
           </w:p>
         </w:tc>
         <w:tc>
           <w:tcPr>
-            <w:tcW w:type="dxa" w:w="3360"/>
+            <w:tcW w:w="3360" w:type="dxa"/>
             <w:tcBorders>
-              <w:top w:val="single" w:color="6A4CA0" w:sz="4"/>
-              <w:left w:val="single" w:color="6A4CA0" w:sz="4"/>
-              <w:bottom w:val="none" w:color="6A4CA0" w:sz="0"/>
-              <w:right w:val="single" w:color="6A4CA0" w:sz="4"/>
+              <w:top w:val="single" w:sz="4" w:space="0" w:color="6A4CA0"/>
+              <w:left w:val="single" w:sz="4" w:space="0" w:color="6A4CA0"/>
+              <w:bottom w:val="none" w:sz="0" w:space="0" w:color="6A4CA0"/>
+              <w:right w:val="single" w:sz="4" w:space="0" w:color="6A4CA0"/>
             </w:tcBorders>
-            <w:shd w:fill="6A4CA0" w:val="clear"/>
+            <w:shd w:val="clear" w:color="auto" w:fill="6A4CA0"/>
             <w:tcMar>
-              <w:top w:type="dxa" w:w="100"/>
-              <w:left w:type="dxa" w:w="140"/>
-              <w:bottom w:type="dxa" w:w="80"/>
-              <w:right w:type="dxa" w:w="140"/>
+              <w:top w:w="100" w:type="dxa"/>
+              <w:left w:w="140" w:type="dxa"/>
+              <w:bottom w:w="80" w:type="dxa"/>
+              <w:right w:w="140" w:type="dxa"/>
             </w:tcMar>
           </w:tcPr>
           <w:p>
@@ -191,27 +206,33 @@
                 <w:sz w:val="20"/>
                 <w:szCs w:val="20"/>
               </w:rPr>
-              <w:t xml:space="preserve">3. Remediation and Iteration</w:t>
+              <w:t>3. Remediation and Iteration</w:t>
             </w:r>
           </w:p>
         </w:tc>
       </w:tr>
       <w:tr>
+        <w:tblPrEx>
+          <w:tblCellMar>
+            <w:top w:w="0" w:type="dxa"/>
+            <w:bottom w:w="0" w:type="dxa"/>
+          </w:tblCellMar>
+        </w:tblPrEx>
         <w:tc>
           <w:tcPr>
-            <w:tcW w:type="dxa" w:w="3000"/>
+            <w:tcW w:w="3000" w:type="dxa"/>
             <w:tcBorders>
-              <w:top w:val="none" w:color="2E5F9E" w:sz="0"/>
-              <w:left w:val="single" w:color="2E5F9E" w:sz="4"/>
-              <w:bottom w:val="single" w:color="2E5F9E" w:sz="4"/>
-              <w:right w:val="single" w:color="2E5F9E" w:sz="4"/>
+              <w:top w:val="none" w:sz="0" w:space="0" w:color="2E5F9E"/>
+              <w:left w:val="single" w:sz="4" w:space="0" w:color="2E5F9E"/>
+              <w:bottom w:val="single" w:sz="4" w:space="0" w:color="2E5F9E"/>
+              <w:right w:val="single" w:sz="4" w:space="0" w:color="2E5F9E"/>
             </w:tcBorders>
-            <w:shd w:fill="EEF4FB" w:val="clear"/>
+            <w:shd w:val="clear" w:color="auto" w:fill="EEF4FB"/>
             <w:tcMar>
-              <w:top w:type="dxa" w:w="80"/>
-              <w:left w:type="dxa" w:w="140"/>
-              <w:bottom w:type="dxa" w:w="100"/>
-              <w:right w:type="dxa" w:w="140"/>
+              <w:top w:w="80" w:type="dxa"/>
+              <w:left w:w="140" w:type="dxa"/>
+              <w:bottom w:w="100" w:type="dxa"/>
+              <w:right w:w="140" w:type="dxa"/>
             </w:tcMar>
           </w:tcPr>
           <w:p>
@@ -225,7 +246,7 @@
                 <w:sz w:val="19"/>
                 <w:szCs w:val="19"/>
               </w:rPr>
-              <w:t xml:space="preserve">•  Technical: ingestion, mapping, identity resolution</w:t>
+              <w:t>•  Technical: ingestion, mapping, identity resolution</w:t>
             </w:r>
           </w:p>
           <w:p>
@@ -239,25 +260,25 @@
                 <w:sz w:val="19"/>
                 <w:szCs w:val="19"/>
               </w:rPr>
-              <w:t xml:space="preserve">•  Readiness (plausibility, temporal consistency, concordance)</w:t>
+              <w:t>•  Readiness (plausibility, temporal consistency, concordance)</w:t>
             </w:r>
           </w:p>
         </w:tc>
         <w:tc>
           <w:tcPr>
-            <w:tcW w:type="dxa" w:w="3000"/>
+            <w:tcW w:w="3000" w:type="dxa"/>
             <w:tcBorders>
-              <w:top w:val="none" w:color="2A7A6F" w:sz="0"/>
-              <w:left w:val="single" w:color="2A7A6F" w:sz="4"/>
-              <w:bottom w:val="single" w:color="2A7A6F" w:sz="4"/>
-              <w:right w:val="single" w:color="2A7A6F" w:sz="4"/>
+              <w:top w:val="none" w:sz="0" w:space="0" w:color="2A7A6F"/>
+              <w:left w:val="single" w:sz="4" w:space="0" w:color="2A7A6F"/>
+              <w:bottom w:val="single" w:sz="4" w:space="0" w:color="2A7A6F"/>
+              <w:right w:val="single" w:sz="4" w:space="0" w:color="2A7A6F"/>
             </w:tcBorders>
-            <w:shd w:fill="EAF4F1" w:val="clear"/>
+            <w:shd w:val="clear" w:color="auto" w:fill="EAF4F1"/>
             <w:tcMar>
-              <w:top w:type="dxa" w:w="80"/>
-              <w:left w:type="dxa" w:w="140"/>
-              <w:bottom w:type="dxa" w:w="100"/>
-              <w:right w:type="dxa" w:w="140"/>
+              <w:top w:w="80" w:type="dxa"/>
+              <w:left w:w="140" w:type="dxa"/>
+              <w:bottom w:w="100" w:type="dxa"/>
+              <w:right w:w="140" w:type="dxa"/>
             </w:tcMar>
           </w:tcPr>
           <w:p>
@@ -271,7 +292,7 @@
                 <w:sz w:val="19"/>
                 <w:szCs w:val="19"/>
               </w:rPr>
-              <w:t xml:space="preserve">•  Fit-for-purpose computed across required variables</w:t>
+              <w:t>•  Fit-for-purpose computed across required variables</w:t>
             </w:r>
           </w:p>
           <w:p>
@@ -285,25 +306,25 @@
                 <w:sz w:val="19"/>
                 <w:szCs w:val="19"/>
               </w:rPr>
-              <w:t xml:space="preserve">•  Use case blocked if one or more critical variables are not ready</w:t>
+              <w:t>•  Use case blocked if one or more critical variables are not ready</w:t>
             </w:r>
           </w:p>
         </w:tc>
         <w:tc>
           <w:tcPr>
-            <w:tcW w:type="dxa" w:w="3360"/>
+            <w:tcW w:w="3360" w:type="dxa"/>
             <w:tcBorders>
-              <w:top w:val="none" w:color="6A4CA0" w:sz="0"/>
-              <w:left w:val="single" w:color="6A4CA0" w:sz="4"/>
-              <w:bottom w:val="single" w:color="6A4CA0" w:sz="4"/>
-              <w:right w:val="single" w:color="6A4CA0" w:sz="4"/>
+              <w:top w:val="none" w:sz="0" w:space="0" w:color="6A4CA0"/>
+              <w:left w:val="single" w:sz="4" w:space="0" w:color="6A4CA0"/>
+              <w:bottom w:val="single" w:sz="4" w:space="0" w:color="6A4CA0"/>
+              <w:right w:val="single" w:sz="4" w:space="0" w:color="6A4CA0"/>
             </w:tcBorders>
-            <w:shd w:fill="F3EEF8" w:val="clear"/>
+            <w:shd w:val="clear" w:color="auto" w:fill="F3EEF8"/>
             <w:tcMar>
-              <w:top w:type="dxa" w:w="80"/>
-              <w:left w:type="dxa" w:w="140"/>
-              <w:bottom w:type="dxa" w:w="100"/>
-              <w:right w:type="dxa" w:w="140"/>
+              <w:top w:w="80" w:type="dxa"/>
+              <w:left w:w="140" w:type="dxa"/>
+              <w:bottom w:w="100" w:type="dxa"/>
+              <w:right w:w="140" w:type="dxa"/>
             </w:tcMar>
           </w:tcPr>
           <w:p>
@@ -317,7 +338,7 @@
                 <w:sz w:val="19"/>
                 <w:szCs w:val="19"/>
               </w:rPr>
-              <w:t xml:space="preserve">•  Scoring identifies specific blockers</w:t>
+              <w:t>•  Scoring identifies specific blockers</w:t>
             </w:r>
           </w:p>
           <w:p>
@@ -331,7 +352,7 @@
                 <w:sz w:val="19"/>
                 <w:szCs w:val="19"/>
               </w:rPr>
-              <w:t xml:space="preserve">•  Remediation targets variables or pipeline steps</w:t>
+              <w:t>•  Remediation targets variables or pipeline steps</w:t>
             </w:r>
           </w:p>
           <w:p>
@@ -345,7 +366,7 @@
                 <w:sz w:val="19"/>
                 <w:szCs w:val="19"/>
               </w:rPr>
-              <w:t xml:space="preserve">•  Capability unlocked after re-scoring</w:t>
+              <w:t>•  Capability unlocked after re-scoring</w:t>
             </w:r>
           </w:p>
         </w:tc>
@@ -355,43 +376,34 @@
       <w:pPr>
         <w:spacing w:after="80"/>
       </w:pPr>
-      <w:r>
-        <w:t xml:space="preserve"/>
-      </w:r>
     </w:p>
     <w:p>
       <w:pPr>
         <w:spacing w:after="100"/>
       </w:pPr>
       <w:r>
-        <w:t xml:space="preserve">Note: The technical pipeline (ingestion, harmonization, identity resolution) is a precondition for variable-level evaluation. Depending on regional infrastructure maturity, some pipeline steps may already be in place at the regional aggregation node. Oros modules are deployed only where gaps exist.</w:t>
-      </w:r>
-    </w:p>
-    <w:p>
-      <w:pPr>
-        <w:spacing w:after="80"/>
-      </w:pPr>
-      <w:r>
-        <w:t xml:space="preserve"/>
-      </w:r>
+        <w:t>Note: The technical pipeline (ingestion, harmonization, identity resolution) is a precondition for variable-level evaluation. Depending on regional infrastructure maturity, some pipeline steps may already be in place at the regional aggregation node. Oros modules are deployed only where gaps exist.</w:t>
+      </w:r>
+    </w:p>
+    <w:p>
+      <w:pPr>
+        <w:spacing w:after="80"/>
+      </w:pPr>
     </w:p>
     <w:p>
       <w:pPr>
         <w:pBdr>
-          <w:bottom w:val="single" w:color="D0DCE8" w:sz="4" w:space="1"/>
+          <w:bottom w:val="single" w:sz="4" w:space="1" w:color="D0DCE8"/>
         </w:pBdr>
-        <w:spacing w:after="120" w:before="120"/>
-      </w:pPr>
-      <w:r>
-        <w:t xml:space="preserve"/>
-      </w:r>
+        <w:spacing w:before="120" w:after="120"/>
+      </w:pPr>
     </w:p>
     <w:p>
       <w:pPr>
         <w:pStyle w:val="Heading2"/>
       </w:pPr>
       <w:r>
-        <w:t xml:space="preserve">1. Variable-Level Evaluation</w:t>
+        <w:t>Object Model</w:t>
       </w:r>
     </w:p>
     <w:p>
@@ -399,23 +411,111 @@
         <w:spacing w:after="100"/>
       </w:pPr>
       <w:r>
-        <w:t xml:space="preserve">Each clinical variable relevant to a use case is evaluated independently across two dimensions before use-case fitness is assessed.</w:t>
-      </w:r>
-    </w:p>
-    <w:p>
-      <w:pPr>
-        <w:spacing w:after="80"/>
-      </w:pPr>
-      <w:r>
-        <w:t xml:space="preserve"/>
-      </w:r>
+        <w:t xml:space="preserve">The three stages of the methodology are implemented through three objects. The full object model is defined in the Architecture Specification (v1.2, April 2026). </w:t>
+      </w:r>
+      <w:proofErr w:type="gramStart"/>
+      <w:r>
+        <w:t>A brief summary</w:t>
+      </w:r>
+      <w:proofErr w:type="gramEnd"/>
+      <w:r>
+        <w:t xml:space="preserve"> follows for reference.</w:t>
+      </w:r>
+    </w:p>
+    <w:p>
+      <w:pPr>
+        <w:spacing w:after="100"/>
+      </w:pPr>
+      <w:r>
+        <w:rPr>
+          <w:b/>
+        </w:rPr>
+        <w:t>Variable Library</w:t>
+      </w:r>
+      <w:r>
+        <w:t xml:space="preserve"> — a shared, reusable library of clinical data elements defined independently of any condition or use case. Each variable carries its code sets, implementation logic (how to extract it from raw data), data sources, and default data quality checks that apply regardless of use case. Variables are defined once and referenced by any condition that needs them. </w:t>
+      </w:r>
+      <w:r>
+        <w:lastRenderedPageBreak/>
+        <w:t>Smoking status, for example, is defined once and used by diabetes, hypertension, and any future condition.</w:t>
+      </w:r>
+    </w:p>
+    <w:p>
+      <w:pPr>
+        <w:spacing w:after="100"/>
+      </w:pPr>
+      <w:r>
+        <w:rPr>
+          <w:b/>
+        </w:rPr>
+        <w:t>Condition Module</w:t>
+      </w:r>
+      <w:r>
+        <w:t xml:space="preserve"> — the organizing layer for a clinical condition. It references the relevant variables from the shared library and scopes the use cases supported. It does not own execution logic. It is implemented as a config file in the repository and is the governance artifact reviewed before a condition is incorporated into the platform. It is also the fundable deliverable that condition-specific contributors and funders can point to.</w:t>
+      </w:r>
+    </w:p>
+    <w:p>
+      <w:pPr>
+        <w:spacing w:after="100"/>
+      </w:pPr>
+      <w:r>
+        <w:rPr>
+          <w:b/>
+        </w:rPr>
+        <w:t>Use Case Specification</w:t>
+      </w:r>
+      <w:r>
+        <w:t xml:space="preserve"> — the core operational object and the unit of execution in the system. All readiness evaluation, blocking logic, and output generation occur at this level. Each Use Case Specification defines: the population eligible for this use case (denominator rules, inclusion/exclusion criteria), which variables are required or optional, how each variable is applied (thresholds, recency, completeness), how variables combine into outputs (computation logic), and what the use case produces. This is the fit-for-purpose layer.</w:t>
+      </w:r>
+    </w:p>
+    <w:p>
+      <w:pPr>
+        <w:spacing w:after="100"/>
+      </w:pPr>
+      <w:r>
+        <w:t>Two-level logic separation: variable implementation logic (how to extract the variable from raw data) lives in the Variable definition. Use-case computation logic (how variables combine and what thresholds apply for a specific use case) lives in the Use Case Specification. This keeps variables clean and reusable across all conditions and ensures use-case-specific requirements do not fragment shared definitions.</w:t>
+      </w:r>
+    </w:p>
+    <w:p>
+      <w:pPr>
+        <w:spacing w:after="80"/>
+      </w:pPr>
+    </w:p>
+    <w:p>
+      <w:pPr>
+        <w:pBdr>
+          <w:bottom w:val="single" w:sz="4" w:space="1" w:color="D0DCE8"/>
+        </w:pBdr>
+        <w:spacing w:before="120" w:after="120"/>
+      </w:pPr>
+    </w:p>
+    <w:p>
+      <w:pPr>
+        <w:pStyle w:val="Heading2"/>
+      </w:pPr>
+      <w:r>
+        <w:t>1. Variable-Level Evaluation</w:t>
+      </w:r>
+    </w:p>
+    <w:p>
+      <w:pPr>
+        <w:spacing w:after="100"/>
+      </w:pPr>
+      <w:r>
+        <w:t>Each clinical variable relevant to a use case is evaluated independently across two dimensions before use-case fitness is assessed.</w:t>
+      </w:r>
+    </w:p>
+    <w:p>
+      <w:pPr>
+        <w:spacing w:after="80"/>
+      </w:pPr>
     </w:p>
     <w:p>
       <w:pPr>
         <w:pStyle w:val="Heading3"/>
       </w:pPr>
       <w:r>
-        <w:t xml:space="preserve">Technical Evaluation</w:t>
+        <w:t>Technical Evaluation</w:t>
       </w:r>
     </w:p>
     <w:p>
@@ -423,7 +523,7 @@
         <w:spacing w:after="100"/>
       </w:pPr>
       <w:r>
-        <w:t xml:space="preserve">Technical evaluation determines whether the variable's data has been correctly ingested, mapped, and linked to patients. Key checks include:</w:t>
+        <w:t>Technical evaluation determines whether the variable's data has been correctly ingested, mapped, and linked to patients. Key checks include:</w:t>
       </w:r>
     </w:p>
     <w:p>
@@ -435,7 +535,7 @@
         </w:numPr>
       </w:pPr>
       <w:r>
-        <w:t xml:space="preserve">Ingestion — is data arriving reliably from the source (EHR, device, lab)?</w:t>
+        <w:t>Ingestion — is data arriving reliably from the source (EHR, device, lab)?</w:t>
       </w:r>
     </w:p>
     <w:p>
@@ -447,7 +547,7 @@
         </w:numPr>
       </w:pPr>
       <w:r>
-        <w:t xml:space="preserve">Mapping — are values mapped to standard terminology (e.g., LOINC, SNOMED)?</w:t>
+        <w:t>Mapping — are values mapped to standard terminology (e.g., LOINC, SNOMED)?</w:t>
       </w:r>
     </w:p>
     <w:p>
@@ -459,7 +559,7 @@
         </w:numPr>
       </w:pPr>
       <w:r>
-        <w:t xml:space="preserve">Identity resolution — can records be reliably linked to the correct patient across sources?</w:t>
+        <w:t>Identity resolution — can records be reliably linked to the correct patient across sources?</w:t>
       </w:r>
     </w:p>
     <w:p>
@@ -471,23 +571,20 @@
         </w:numPr>
       </w:pPr>
       <w:r>
-        <w:t xml:space="preserve">Stability — is data consistent across repeated submissions over time?</w:t>
-      </w:r>
-    </w:p>
-    <w:p>
-      <w:pPr>
-        <w:spacing w:after="80"/>
-      </w:pPr>
-      <w:r>
-        <w:t xml:space="preserve"/>
-      </w:r>
+        <w:t>Stability — is data consistent across repeated submissions over time?</w:t>
+      </w:r>
+    </w:p>
+    <w:p>
+      <w:pPr>
+        <w:spacing w:after="80"/>
+      </w:pPr>
     </w:p>
     <w:p>
       <w:pPr>
         <w:pStyle w:val="Heading3"/>
       </w:pPr>
       <w:r>
-        <w:t xml:space="preserve">Readiness Evaluation</w:t>
+        <w:t>Readiness Evaluation</w:t>
       </w:r>
     </w:p>
     <w:p>
@@ -495,7 +592,7 @@
         <w:spacing w:after="100"/>
       </w:pPr>
       <w:r>
-        <w:t xml:space="preserve">Readiness evaluation determines whether the variable's values are clinically usable. Key checks include:</w:t>
+        <w:t>Readiness evaluation determines whether the variable's values are clinically usable. Key checks include:</w:t>
       </w:r>
     </w:p>
     <w:p>
@@ -507,7 +604,7 @@
         </w:numPr>
       </w:pPr>
       <w:r>
-        <w:t xml:space="preserve">Plausibility — do values fall within expected clinical ranges?</w:t>
+        <w:t>Plausibility — do values fall within expected clinical ranges?</w:t>
       </w:r>
     </w:p>
     <w:p>
@@ -519,7 +616,7 @@
         </w:numPr>
       </w:pPr>
       <w:r>
-        <w:t xml:space="preserve">Temporal consistency — is coverage sufficient and are gaps acceptable for the intended use?</w:t>
+        <w:t>Temporal consistency — is coverage sufficient and are gaps acceptable for the intended use?</w:t>
       </w:r>
     </w:p>
     <w:p>
@@ -531,50 +628,49 @@
         </w:numPr>
       </w:pPr>
       <w:r>
-        <w:t xml:space="preserve">Concordance — do dates and values align coherently across related records?</w:t>
-      </w:r>
-    </w:p>
-    <w:p>
-      <w:pPr>
-        <w:spacing w:after="80"/>
-      </w:pPr>
-      <w:r>
-        <w:t xml:space="preserve"/>
-      </w:r>
+        <w:t xml:space="preserve">Concordance — </w:t>
+      </w:r>
+      <w:proofErr w:type="spellStart"/>
+      <w:r>
+        <w:t>do</w:t>
+      </w:r>
+      <w:proofErr w:type="spellEnd"/>
+      <w:r>
+        <w:t xml:space="preserve"> dates and values align coherently across related records?</w:t>
+      </w:r>
+    </w:p>
+    <w:p>
+      <w:pPr>
+        <w:spacing w:after="80"/>
+      </w:pPr>
     </w:p>
     <w:p>
       <w:pPr>
         <w:spacing w:after="100"/>
       </w:pPr>
       <w:r>
-        <w:t xml:space="preserve">Each dimension produces a score (Technical score, Readiness score) and a set of flagged issues. These scores are inputs to use-case evaluation — they do not determine fitness independently.</w:t>
-      </w:r>
-    </w:p>
-    <w:p>
-      <w:pPr>
-        <w:spacing w:after="80"/>
-      </w:pPr>
-      <w:r>
-        <w:t xml:space="preserve"/>
-      </w:r>
+        <w:t>Each dimension produces a score (Technical score, Readiness score) and a set of flagged issues. These scores are inputs to use-case evaluation — they do not determine fitness independently.</w:t>
+      </w:r>
+    </w:p>
+    <w:p>
+      <w:pPr>
+        <w:spacing w:after="80"/>
+      </w:pPr>
     </w:p>
     <w:p>
       <w:pPr>
         <w:pBdr>
-          <w:bottom w:val="single" w:color="D0DCE8" w:sz="4" w:space="1"/>
+          <w:bottom w:val="single" w:sz="4" w:space="1" w:color="D0DCE8"/>
         </w:pBdr>
-        <w:spacing w:after="120" w:before="120"/>
-      </w:pPr>
-      <w:r>
-        <w:t xml:space="preserve"/>
-      </w:r>
+        <w:spacing w:before="120" w:after="120"/>
+      </w:pPr>
     </w:p>
     <w:p>
       <w:pPr>
         <w:pStyle w:val="Heading2"/>
       </w:pPr>
       <w:r>
-        <w:t xml:space="preserve">2. Use-Case Evaluation — Fit-for-Purpose</w:t>
+        <w:t>2. Use-Case Evaluation — Fit-for-Purpose</w:t>
       </w:r>
     </w:p>
     <w:p>
@@ -582,15 +678,7 @@
         <w:spacing w:after="100"/>
       </w:pPr>
       <w:r>
-        <w:t xml:space="preserve">Fit-for-purpose is computed at the use-case level, not the variable level. Each use case defines a required set of variables and a minimum readiness threshold for each. The use case is ready only when all critical variables meet their thresholds.</w:t>
-      </w:r>
-    </w:p>
-    <w:p>
-      <w:pPr>
-        <w:spacing w:after="80"/>
-      </w:pPr>
-      <w:r>
-        <w:t xml:space="preserve"/>
+        <w:t>Fit-for-purpose is computed at the use-case level, not the variable level. Each Use Case Specification defines a required set of variables, the population eligible for evaluation, and a minimum readiness threshold for each variable. The use case is ready only when all critical variables meet their thresholds for patients who meet the population definition.</w:t>
       </w:r>
     </w:p>
     <w:p>
@@ -598,7 +686,20 @@
         <w:spacing w:after="100"/>
       </w:pPr>
       <w:r>
-        <w:t xml:space="preserve">The three operational contexts evaluated in the pilot are:</w:t>
+        <w:t>Population Definition is the entry gate to every use case. It captures the eligibility and denominator rules that determine which patients are included in evaluation for that use case — for example, minimum encounter requirements, active diagnosis criteria, reporting period constraints, and inclusion/exclusion criteria. Population Definition is distinct from variable-level data quality checks: a patient may have high-quality BP data but still not qualify for a hypertension reporting use case if they do not meet denominator criteria.</w:t>
+      </w:r>
+    </w:p>
+    <w:p>
+      <w:pPr>
+        <w:spacing w:after="80"/>
+      </w:pPr>
+    </w:p>
+    <w:p>
+      <w:pPr>
+        <w:spacing w:after="100"/>
+      </w:pPr>
+      <w:r>
+        <w:t>The three operational contexts evaluated in the pilot are:</w:t>
       </w:r>
     </w:p>
     <w:p>
@@ -610,7 +711,7 @@
         </w:numPr>
       </w:pPr>
       <w:r>
-        <w:t xml:space="preserve">Risk Stratification — identify patients at elevated clinical risk using available data streams</w:t>
+        <w:t>Risk Stratification — identify patients at elevated clinical risk using available data streams</w:t>
       </w:r>
     </w:p>
     <w:p>
@@ -622,7 +723,7 @@
         </w:numPr>
       </w:pPr>
       <w:r>
-        <w:t xml:space="preserve">Care Coordination — support proactive outreach, medication review, and specialist escalation</w:t>
+        <w:t>Care Coordination — support proactive outreach, medication review, and specialist escalation</w:t>
       </w:r>
     </w:p>
     <w:p>
@@ -634,107 +735,103 @@
         </w:numPr>
       </w:pPr>
       <w:r>
-        <w:t xml:space="preserve">Value-Based Care Reporting — produce reliable data for CMS and other program reporting requirements</w:t>
-      </w:r>
-    </w:p>
-    <w:p>
-      <w:pPr>
-        <w:spacing w:after="80"/>
-      </w:pPr>
-      <w:r>
-        <w:t xml:space="preserve"/>
-      </w:r>
+        <w:t>Value-Based Care Reporting — produce reliable data for CMS and other program reporting requirements</w:t>
+      </w:r>
+    </w:p>
+    <w:p>
+      <w:pPr>
+        <w:spacing w:after="80"/>
+      </w:pPr>
     </w:p>
     <w:p>
       <w:pPr>
         <w:spacing w:after="100"/>
       </w:pPr>
       <w:r>
-        <w:t xml:space="preserve">For each use case, the methodology produces: a readiness status (Ready / Partially Ready / Not Ready), the specific variables that are blocking readiness, and the remediation steps that would unlock capability.</w:t>
-      </w:r>
-    </w:p>
-    <w:p>
-      <w:pPr>
-        <w:spacing w:after="80"/>
-      </w:pPr>
-      <w:r>
-        <w:t xml:space="preserve"/>
-      </w:r>
+        <w:t>For each use case, the methodology produces: a readiness status (Ready / Partially Ready / Not Ready), the specific variables that are blocking readiness, and the remediation steps that would unlock capability.</w:t>
+      </w:r>
+    </w:p>
+    <w:p>
+      <w:pPr>
+        <w:spacing w:after="80"/>
+      </w:pPr>
     </w:p>
     <w:p>
       <w:pPr>
         <w:pBdr>
-          <w:bottom w:val="single" w:color="D0DCE8" w:sz="4" w:space="1"/>
+          <w:bottom w:val="single" w:sz="4" w:space="1" w:color="D0DCE8"/>
         </w:pBdr>
-        <w:spacing w:after="120" w:before="120"/>
-      </w:pPr>
-      <w:r>
-        <w:t xml:space="preserve"/>
-      </w:r>
+        <w:spacing w:before="120" w:after="120"/>
+      </w:pPr>
     </w:p>
     <w:p>
       <w:pPr>
         <w:pStyle w:val="Heading2"/>
       </w:pPr>
       <w:r>
-        <w:t xml:space="preserve">3. Worked Example — Blood Pressure and Hypertension Risk Stratification</w:t>
-      </w:r>
-    </w:p>
-    <w:p>
-      <w:pPr>
-        <w:spacing w:after="80"/>
-      </w:pPr>
-      <w:r>
-        <w:t xml:space="preserve"/>
-      </w:r>
+        <w:t>3. Worked Example — Blood Pressure and Hypertension Risk Stratification</w:t>
+      </w:r>
+    </w:p>
+    <w:p>
+      <w:pPr>
+        <w:spacing w:after="80"/>
+      </w:pPr>
     </w:p>
     <w:p>
       <w:pPr>
         <w:pStyle w:val="Heading3"/>
       </w:pPr>
       <w:r>
-        <w:t xml:space="preserve">Variable: Blood Pressure (Systolic / Diastolic)</w:t>
-      </w:r>
-    </w:p>
-    <w:p>
-      <w:pPr>
-        <w:spacing w:after="80"/>
-      </w:pPr>
-      <w:r>
-        <w:t xml:space="preserve"/>
-      </w:r>
+        <w:t>Variable: Blood Pressure (Systolic / Diastolic)</w:t>
+      </w:r>
+    </w:p>
+    <w:p>
+      <w:pPr>
+        <w:spacing w:after="80"/>
+      </w:pPr>
     </w:p>
     <w:tbl>
       <w:tblPr>
-        <w:tblW w:type="dxa" w:w="9360"/>
+        <w:tblW w:w="9360" w:type="dxa"/>
         <w:tblBorders>
-          <w:top w:val="single" w:color="auto" w:sz="4"/>
-          <w:left w:val="single" w:color="auto" w:sz="4"/>
-          <w:bottom w:val="single" w:color="auto" w:sz="4"/>
-          <w:right w:val="single" w:color="auto" w:sz="4"/>
-          <w:insideH w:val="single" w:color="auto" w:sz="4"/>
-          <w:insideV w:val="single" w:color="auto" w:sz="4"/>
+          <w:top w:val="single" w:sz="4" w:space="0" w:color="auto"/>
+          <w:left w:val="single" w:sz="4" w:space="0" w:color="auto"/>
+          <w:bottom w:val="single" w:sz="4" w:space="0" w:color="auto"/>
+          <w:right w:val="single" w:sz="4" w:space="0" w:color="auto"/>
+          <w:insideH w:val="single" w:sz="4" w:space="0" w:color="auto"/>
+          <w:insideV w:val="single" w:sz="4" w:space="0" w:color="auto"/>
         </w:tblBorders>
+        <w:tblCellMar>
+          <w:left w:w="10" w:type="dxa"/>
+          <w:right w:w="10" w:type="dxa"/>
+        </w:tblCellMar>
+        <w:tblLook w:val="0000" w:firstRow="0" w:lastRow="0" w:firstColumn="0" w:lastColumn="0" w:noHBand="0" w:noVBand="0"/>
       </w:tblPr>
       <w:tblGrid>
         <w:gridCol w:w="9360"/>
       </w:tblGrid>
       <w:tr>
+        <w:tblPrEx>
+          <w:tblCellMar>
+            <w:top w:w="0" w:type="dxa"/>
+            <w:bottom w:w="0" w:type="dxa"/>
+          </w:tblCellMar>
+        </w:tblPrEx>
         <w:tc>
           <w:tcPr>
-            <w:tcW w:type="dxa" w:w="9360"/>
+            <w:tcW w:w="9360" w:type="dxa"/>
             <w:tcBorders>
-              <w:top w:val="single" w:color="2C5282" w:sz="4"/>
-              <w:left w:val="single" w:color="2C5282" w:sz="8"/>
-              <w:bottom w:val="single" w:color="2C5282" w:sz="4"/>
-              <w:right w:val="single" w:color="2C5282" w:sz="4"/>
+              <w:top w:val="single" w:sz="4" w:space="0" w:color="2C5282"/>
+              <w:left w:val="single" w:sz="8" w:space="0" w:color="2C5282"/>
+              <w:bottom w:val="single" w:sz="4" w:space="0" w:color="2C5282"/>
+              <w:right w:val="single" w:sz="4" w:space="0" w:color="2C5282"/>
             </w:tcBorders>
-            <w:shd w:fill="EEF2F8" w:val="clear"/>
+            <w:shd w:val="clear" w:color="auto" w:fill="EEF2F8"/>
             <w:tcMar>
-              <w:top w:type="dxa" w:w="120"/>
-              <w:left w:type="dxa" w:w="200"/>
-              <w:bottom w:type="dxa" w:w="120"/>
-              <w:right w:type="dxa" w:w="200"/>
+              <w:top w:w="120" w:type="dxa"/>
+              <w:left w:w="200" w:type="dxa"/>
+              <w:bottom w:w="120" w:type="dxa"/>
+              <w:right w:w="200" w:type="dxa"/>
             </w:tcMar>
           </w:tcPr>
           <w:p>
@@ -749,7 +846,7 @@
                 <w:sz w:val="20"/>
                 <w:szCs w:val="20"/>
               </w:rPr>
-              <w:t xml:space="preserve">Technical Evaluation</w:t>
+              <w:t>Technical Evaluation</w:t>
             </w:r>
           </w:p>
           <w:p>
@@ -763,7 +860,7 @@
                 <w:sz w:val="20"/>
                 <w:szCs w:val="20"/>
               </w:rPr>
-              <w:t xml:space="preserve">•  BP values are ingested from EHR and device feeds</w:t>
+              <w:t>•  BP values are ingested from EHR and device feeds</w:t>
             </w:r>
           </w:p>
           <w:p>
@@ -777,7 +874,7 @@
                 <w:sz w:val="20"/>
                 <w:szCs w:val="20"/>
               </w:rPr>
-              <w:t xml:space="preserve">•  Systolic and diastolic values are mapped to standard terminology (LOINC)</w:t>
+              <w:t>•  Systolic and diastolic values are mapped to standard terminology (LOINC)</w:t>
             </w:r>
           </w:p>
           <w:p>
@@ -791,7 +888,7 @@
                 <w:sz w:val="20"/>
                 <w:szCs w:val="20"/>
               </w:rPr>
-              <w:t xml:space="preserve">•  Some records fail to link to the correct patient due to inconsistent identifiers across sources</w:t>
+              <w:t>•  Some records fail to link to the correct patient due to inconsistent identifiers across sources</w:t>
             </w:r>
           </w:p>
         </w:tc>
@@ -801,41 +898,49 @@
       <w:pPr>
         <w:spacing w:after="80"/>
       </w:pPr>
-      <w:r>
-        <w:t xml:space="preserve"/>
-      </w:r>
     </w:p>
     <w:tbl>
       <w:tblPr>
-        <w:tblW w:type="dxa" w:w="9360"/>
+        <w:tblW w:w="9360" w:type="dxa"/>
         <w:tblBorders>
-          <w:top w:val="single" w:color="auto" w:sz="4"/>
-          <w:left w:val="single" w:color="auto" w:sz="4"/>
-          <w:bottom w:val="single" w:color="auto" w:sz="4"/>
-          <w:right w:val="single" w:color="auto" w:sz="4"/>
-          <w:insideH w:val="single" w:color="auto" w:sz="4"/>
-          <w:insideV w:val="single" w:color="auto" w:sz="4"/>
+          <w:top w:val="single" w:sz="4" w:space="0" w:color="auto"/>
+          <w:left w:val="single" w:sz="4" w:space="0" w:color="auto"/>
+          <w:bottom w:val="single" w:sz="4" w:space="0" w:color="auto"/>
+          <w:right w:val="single" w:sz="4" w:space="0" w:color="auto"/>
+          <w:insideH w:val="single" w:sz="4" w:space="0" w:color="auto"/>
+          <w:insideV w:val="single" w:sz="4" w:space="0" w:color="auto"/>
         </w:tblBorders>
+        <w:tblCellMar>
+          <w:left w:w="10" w:type="dxa"/>
+          <w:right w:w="10" w:type="dxa"/>
+        </w:tblCellMar>
+        <w:tblLook w:val="0000" w:firstRow="0" w:lastRow="0" w:firstColumn="0" w:lastColumn="0" w:noHBand="0" w:noVBand="0"/>
       </w:tblPr>
       <w:tblGrid>
         <w:gridCol w:w="9360"/>
       </w:tblGrid>
       <w:tr>
+        <w:tblPrEx>
+          <w:tblCellMar>
+            <w:top w:w="0" w:type="dxa"/>
+            <w:bottom w:w="0" w:type="dxa"/>
+          </w:tblCellMar>
+        </w:tblPrEx>
         <w:tc>
           <w:tcPr>
-            <w:tcW w:type="dxa" w:w="9360"/>
+            <w:tcW w:w="9360" w:type="dxa"/>
             <w:tcBorders>
-              <w:top w:val="single" w:color="4A80B0" w:sz="4"/>
-              <w:left w:val="single" w:color="4A80B0" w:sz="8"/>
-              <w:bottom w:val="single" w:color="4A80B0" w:sz="4"/>
-              <w:right w:val="single" w:color="4A80B0" w:sz="4"/>
+              <w:top w:val="single" w:sz="4" w:space="0" w:color="4A80B0"/>
+              <w:left w:val="single" w:sz="8" w:space="0" w:color="4A80B0"/>
+              <w:bottom w:val="single" w:sz="4" w:space="0" w:color="4A80B0"/>
+              <w:right w:val="single" w:sz="4" w:space="0" w:color="4A80B0"/>
             </w:tcBorders>
-            <w:shd w:fill="EBF4FB" w:val="clear"/>
+            <w:shd w:val="clear" w:color="auto" w:fill="EBF4FB"/>
             <w:tcMar>
-              <w:top w:type="dxa" w:w="120"/>
-              <w:left w:type="dxa" w:w="200"/>
-              <w:bottom w:type="dxa" w:w="120"/>
-              <w:right w:type="dxa" w:w="200"/>
+              <w:top w:w="120" w:type="dxa"/>
+              <w:left w:w="200" w:type="dxa"/>
+              <w:bottom w:w="120" w:type="dxa"/>
+              <w:right w:w="200" w:type="dxa"/>
             </w:tcMar>
           </w:tcPr>
           <w:p>
@@ -850,7 +955,7 @@
                 <w:sz w:val="20"/>
                 <w:szCs w:val="20"/>
               </w:rPr>
-              <w:t xml:space="preserve">Readiness Evaluation</w:t>
+              <w:t>Readiness Evaluation</w:t>
             </w:r>
           </w:p>
           <w:p>
@@ -864,7 +969,7 @@
                 <w:sz w:val="20"/>
                 <w:szCs w:val="20"/>
               </w:rPr>
-              <w:t xml:space="preserve">•  Most BP values fall within plausible clinical ranges</w:t>
+              <w:t>•  Most BP values fall within plausible clinical ranges</w:t>
             </w:r>
           </w:p>
           <w:p>
@@ -878,7 +983,7 @@
                 <w:sz w:val="20"/>
                 <w:szCs w:val="20"/>
               </w:rPr>
-              <w:t xml:space="preserve">•  Temporal coverage is inconsistent — large gaps between measurements for many patients</w:t>
+              <w:t>•  Temporal coverage is inconsistent — large gaps between measurements for many patients</w:t>
             </w:r>
           </w:p>
           <w:p>
@@ -892,12 +997,12 @@
                 <w:sz w:val="20"/>
                 <w:szCs w:val="20"/>
               </w:rPr>
-              <w:t xml:space="preserve">•  Some timestamps are misaligned with encounter records</w:t>
-            </w:r>
-          </w:p>
-          <w:p>
-            <w:pPr>
-              <w:spacing w:after="0" w:before="80"/>
+              <w:t>•  Some timestamps are misaligned with encounter records</w:t>
+            </w:r>
+          </w:p>
+          <w:p>
+            <w:pPr>
+              <w:spacing w:before="80"/>
             </w:pPr>
             <w:r>
               <w:rPr>
@@ -915,7 +1020,7 @@
                 <w:sz w:val="20"/>
                 <w:szCs w:val="20"/>
               </w:rPr>
-              <w:t xml:space="preserve">Technical score: moderate (identity linkage issues). Readiness score: moderate (plausible values, insufficient temporal coverage).</w:t>
+              <w:t>Technical score: moderate (identity linkage issues). Readiness score: moderate (plausible values, insufficient temporal coverage).</w:t>
             </w:r>
           </w:p>
         </w:tc>
@@ -925,16 +1030,14 @@
       <w:pPr>
         <w:spacing w:after="80"/>
       </w:pPr>
-      <w:r>
-        <w:t xml:space="preserve"/>
-      </w:r>
     </w:p>
     <w:p>
       <w:pPr>
         <w:pStyle w:val="Heading3"/>
       </w:pPr>
       <w:r>
-        <w:t xml:space="preserve">Use Case: Hypertension Risk Stratification</w:t>
+        <w:lastRenderedPageBreak/>
+        <w:t>Use Case: Hypertension Risk Stratification</w:t>
       </w:r>
     </w:p>
     <w:p>
@@ -942,64 +1045,69 @@
         <w:spacing w:after="100"/>
       </w:pPr>
       <w:r>
-        <w:t xml:space="preserve">Objective: identify patients at risk of hypertension or likely undiagnosed hypertension using longitudinal clinical data.</w:t>
-      </w:r>
-    </w:p>
-    <w:p>
-      <w:pPr>
-        <w:spacing w:after="80"/>
-      </w:pPr>
-      <w:r>
-        <w:t xml:space="preserve"/>
-      </w:r>
+        <w:t>Objective: identify patients at risk of hypertension or likely undiagnosed hypertension using longitudinal clinical data.</w:t>
+      </w:r>
+    </w:p>
+    <w:p>
+      <w:pPr>
+        <w:spacing w:after="80"/>
+      </w:pPr>
     </w:p>
     <w:p>
       <w:pPr>
         <w:spacing w:after="100"/>
       </w:pPr>
       <w:r>
-        <w:t xml:space="preserve">Required variables: Blood pressure (systolic/diastolic), Age, Sex, Smoking status, Medication data (antihypertensives), Diabetes status. Optional: cholesterol measures.</w:t>
-      </w:r>
-    </w:p>
-    <w:p>
-      <w:pPr>
-        <w:spacing w:after="80"/>
-      </w:pPr>
-      <w:r>
-        <w:t xml:space="preserve"/>
-      </w:r>
+        <w:t>Required variables: Blood pressure (systolic/diastolic), Age, Sex, Smoking status, Medication data (antihypertensives), Diabetes status. Optional: cholesterol measures.</w:t>
+      </w:r>
+    </w:p>
+    <w:p>
+      <w:pPr>
+        <w:spacing w:after="80"/>
+      </w:pPr>
     </w:p>
     <w:tbl>
       <w:tblPr>
-        <w:tblW w:type="dxa" w:w="9360"/>
+        <w:tblW w:w="9360" w:type="dxa"/>
         <w:tblBorders>
-          <w:top w:val="single" w:color="auto" w:sz="4"/>
-          <w:left w:val="single" w:color="auto" w:sz="4"/>
-          <w:bottom w:val="single" w:color="auto" w:sz="4"/>
-          <w:right w:val="single" w:color="auto" w:sz="4"/>
-          <w:insideH w:val="single" w:color="auto" w:sz="4"/>
-          <w:insideV w:val="single" w:color="auto" w:sz="4"/>
+          <w:top w:val="single" w:sz="4" w:space="0" w:color="auto"/>
+          <w:left w:val="single" w:sz="4" w:space="0" w:color="auto"/>
+          <w:bottom w:val="single" w:sz="4" w:space="0" w:color="auto"/>
+          <w:right w:val="single" w:sz="4" w:space="0" w:color="auto"/>
+          <w:insideH w:val="single" w:sz="4" w:space="0" w:color="auto"/>
+          <w:insideV w:val="single" w:sz="4" w:space="0" w:color="auto"/>
         </w:tblBorders>
+        <w:tblCellMar>
+          <w:left w:w="10" w:type="dxa"/>
+          <w:right w:w="10" w:type="dxa"/>
+        </w:tblCellMar>
+        <w:tblLook w:val="0000" w:firstRow="0" w:lastRow="0" w:firstColumn="0" w:lastColumn="0" w:noHBand="0" w:noVBand="0"/>
       </w:tblPr>
       <w:tblGrid>
         <w:gridCol w:w="9360"/>
       </w:tblGrid>
       <w:tr>
+        <w:tblPrEx>
+          <w:tblCellMar>
+            <w:top w:w="0" w:type="dxa"/>
+            <w:bottom w:w="0" w:type="dxa"/>
+          </w:tblCellMar>
+        </w:tblPrEx>
         <w:tc>
           <w:tcPr>
-            <w:tcW w:type="dxa" w:w="9360"/>
+            <w:tcW w:w="9360" w:type="dxa"/>
             <w:tcBorders>
-              <w:top w:val="single" w:color="C0392B" w:sz="4"/>
-              <w:left w:val="single" w:color="C0392B" w:sz="8"/>
-              <w:bottom w:val="single" w:color="C0392B" w:sz="4"/>
-              <w:right w:val="single" w:color="C0392B" w:sz="4"/>
+              <w:top w:val="single" w:sz="4" w:space="0" w:color="C0392B"/>
+              <w:left w:val="single" w:sz="8" w:space="0" w:color="C0392B"/>
+              <w:bottom w:val="single" w:sz="4" w:space="0" w:color="C0392B"/>
+              <w:right w:val="single" w:sz="4" w:space="0" w:color="C0392B"/>
             </w:tcBorders>
-            <w:shd w:fill="FDE8E8" w:val="clear"/>
+            <w:shd w:val="clear" w:color="auto" w:fill="FDE8E8"/>
             <w:tcMar>
-              <w:top w:type="dxa" w:w="120"/>
-              <w:left w:type="dxa" w:w="200"/>
-              <w:bottom w:type="dxa" w:w="120"/>
-              <w:right w:type="dxa" w:w="200"/>
+              <w:top w:w="120" w:type="dxa"/>
+              <w:left w:w="200" w:type="dxa"/>
+              <w:bottom w:w="120" w:type="dxa"/>
+              <w:right w:w="200" w:type="dxa"/>
             </w:tcMar>
           </w:tcPr>
           <w:p>
@@ -1014,7 +1122,7 @@
                 <w:sz w:val="20"/>
                 <w:szCs w:val="20"/>
               </w:rPr>
-              <w:t xml:space="preserve">Before Remediation</w:t>
+              <w:t>Before Remediation</w:t>
             </w:r>
           </w:p>
           <w:p>
@@ -1028,7 +1136,7 @@
                 <w:sz w:val="20"/>
                 <w:szCs w:val="20"/>
               </w:rPr>
-              <w:t xml:space="preserve">•  BP data is incomplete and temporally sparse</w:t>
+              <w:t>•  BP data is incomplete and temporally sparse</w:t>
             </w:r>
           </w:p>
           <w:p>
@@ -1042,7 +1150,7 @@
                 <w:sz w:val="20"/>
                 <w:szCs w:val="20"/>
               </w:rPr>
-              <w:t xml:space="preserve">•  Patient identity mismatches reduce longitudinal continuity</w:t>
+              <w:t>•  Patient identity mismatches reduce longitudinal continuity</w:t>
             </w:r>
           </w:p>
           <w:p>
@@ -1056,7 +1164,7 @@
                 <w:sz w:val="20"/>
                 <w:szCs w:val="20"/>
               </w:rPr>
-              <w:t xml:space="preserve">•  Smoking status missing for a portion of patients</w:t>
+              <w:t>•  Smoking status missing for a portion of patients</w:t>
             </w:r>
           </w:p>
           <w:p>
@@ -1070,12 +1178,12 @@
                 <w:sz w:val="20"/>
                 <w:szCs w:val="20"/>
               </w:rPr>
-              <w:t xml:space="preserve">•  Blockers: insufficient BP coverage, identity linkage issues, missing key covariates</w:t>
-            </w:r>
-          </w:p>
-          <w:p>
-            <w:pPr>
-              <w:spacing w:after="0" w:before="80"/>
+              <w:t>•  Blockers: insufficient BP coverage, identity linkage issues, missing key covariates</w:t>
+            </w:r>
+          </w:p>
+          <w:p>
+            <w:pPr>
+              <w:spacing w:before="80"/>
             </w:pPr>
             <w:r>
               <w:rPr>
@@ -1093,7 +1201,7 @@
                 <w:sz w:val="20"/>
                 <w:szCs w:val="20"/>
               </w:rPr>
-              <w:t xml:space="preserve">Hypertension Risk Stratification — NOT READY</w:t>
+              <w:t>Hypertension Risk Stratification — NOT READY</w:t>
             </w:r>
           </w:p>
         </w:tc>
@@ -1103,41 +1211,49 @@
       <w:pPr>
         <w:spacing w:after="80"/>
       </w:pPr>
-      <w:r>
-        <w:t xml:space="preserve"/>
-      </w:r>
     </w:p>
     <w:tbl>
       <w:tblPr>
-        <w:tblW w:type="dxa" w:w="9360"/>
+        <w:tblW w:w="9360" w:type="dxa"/>
         <w:tblBorders>
-          <w:top w:val="single" w:color="auto" w:sz="4"/>
-          <w:left w:val="single" w:color="auto" w:sz="4"/>
-          <w:bottom w:val="single" w:color="auto" w:sz="4"/>
-          <w:right w:val="single" w:color="auto" w:sz="4"/>
-          <w:insideH w:val="single" w:color="auto" w:sz="4"/>
-          <w:insideV w:val="single" w:color="auto" w:sz="4"/>
+          <w:top w:val="single" w:sz="4" w:space="0" w:color="auto"/>
+          <w:left w:val="single" w:sz="4" w:space="0" w:color="auto"/>
+          <w:bottom w:val="single" w:sz="4" w:space="0" w:color="auto"/>
+          <w:right w:val="single" w:sz="4" w:space="0" w:color="auto"/>
+          <w:insideH w:val="single" w:sz="4" w:space="0" w:color="auto"/>
+          <w:insideV w:val="single" w:sz="4" w:space="0" w:color="auto"/>
         </w:tblBorders>
+        <w:tblCellMar>
+          <w:left w:w="10" w:type="dxa"/>
+          <w:right w:w="10" w:type="dxa"/>
+        </w:tblCellMar>
+        <w:tblLook w:val="0000" w:firstRow="0" w:lastRow="0" w:firstColumn="0" w:lastColumn="0" w:noHBand="0" w:noVBand="0"/>
       </w:tblPr>
       <w:tblGrid>
         <w:gridCol w:w="9360"/>
       </w:tblGrid>
       <w:tr>
+        <w:tblPrEx>
+          <w:tblCellMar>
+            <w:top w:w="0" w:type="dxa"/>
+            <w:bottom w:w="0" w:type="dxa"/>
+          </w:tblCellMar>
+        </w:tblPrEx>
         <w:tc>
           <w:tcPr>
-            <w:tcW w:type="dxa" w:w="9360"/>
+            <w:tcW w:w="9360" w:type="dxa"/>
             <w:tcBorders>
-              <w:top w:val="single" w:color="C08020" w:sz="4"/>
-              <w:left w:val="single" w:color="C08020" w:sz="8"/>
-              <w:bottom w:val="single" w:color="C08020" w:sz="4"/>
-              <w:right w:val="single" w:color="C08020" w:sz="4"/>
+              <w:top w:val="single" w:sz="4" w:space="0" w:color="C08020"/>
+              <w:left w:val="single" w:sz="8" w:space="0" w:color="C08020"/>
+              <w:bottom w:val="single" w:sz="4" w:space="0" w:color="C08020"/>
+              <w:right w:val="single" w:sz="4" w:space="0" w:color="C08020"/>
             </w:tcBorders>
-            <w:shd w:fill="FDF6E8" w:val="clear"/>
+            <w:shd w:val="clear" w:color="auto" w:fill="FDF6E8"/>
             <w:tcMar>
-              <w:top w:type="dxa" w:w="120"/>
-              <w:left w:type="dxa" w:w="200"/>
-              <w:bottom w:type="dxa" w:w="120"/>
-              <w:right w:type="dxa" w:w="200"/>
+              <w:top w:w="120" w:type="dxa"/>
+              <w:left w:w="200" w:type="dxa"/>
+              <w:bottom w:w="120" w:type="dxa"/>
+              <w:right w:w="200" w:type="dxa"/>
             </w:tcMar>
           </w:tcPr>
           <w:p>
@@ -1152,7 +1268,7 @@
                 <w:sz w:val="20"/>
                 <w:szCs w:val="20"/>
               </w:rPr>
-              <w:t xml:space="preserve">Remediation Actions</w:t>
+              <w:t>Remediation Actions</w:t>
             </w:r>
           </w:p>
           <w:p>
@@ -1166,7 +1282,7 @@
                 <w:sz w:val="20"/>
                 <w:szCs w:val="20"/>
               </w:rPr>
-              <w:t xml:space="preserve">•  Improve patient identity matching across EHR and device sources</w:t>
+              <w:t>•  Improve patient identity matching across EHR and device sources</w:t>
             </w:r>
           </w:p>
           <w:p>
@@ -1180,7 +1296,7 @@
                 <w:sz w:val="20"/>
                 <w:szCs w:val="20"/>
               </w:rPr>
-              <w:t xml:space="preserve">•  Increase BP completeness by incorporating additional device feeds</w:t>
+              <w:t>•  Increase BP completeness by incorporating additional device feeds</w:t>
             </w:r>
           </w:p>
           <w:p>
@@ -1194,7 +1310,7 @@
                 <w:sz w:val="20"/>
                 <w:szCs w:val="20"/>
               </w:rPr>
-              <w:t xml:space="preserve">•  Address missing smoking status through supplemental data sources where available</w:t>
+              <w:t>•  Address missing smoking status through supplemental data sources where available</w:t>
             </w:r>
           </w:p>
         </w:tc>
@@ -1204,41 +1320,49 @@
       <w:pPr>
         <w:spacing w:after="80"/>
       </w:pPr>
-      <w:r>
-        <w:t xml:space="preserve"/>
-      </w:r>
     </w:p>
     <w:tbl>
       <w:tblPr>
-        <w:tblW w:type="dxa" w:w="9360"/>
+        <w:tblW w:w="9360" w:type="dxa"/>
         <w:tblBorders>
-          <w:top w:val="single" w:color="auto" w:sz="4"/>
-          <w:left w:val="single" w:color="auto" w:sz="4"/>
-          <w:bottom w:val="single" w:color="auto" w:sz="4"/>
-          <w:right w:val="single" w:color="auto" w:sz="4"/>
-          <w:insideH w:val="single" w:color="auto" w:sz="4"/>
-          <w:insideV w:val="single" w:color="auto" w:sz="4"/>
+          <w:top w:val="single" w:sz="4" w:space="0" w:color="auto"/>
+          <w:left w:val="single" w:sz="4" w:space="0" w:color="auto"/>
+          <w:bottom w:val="single" w:sz="4" w:space="0" w:color="auto"/>
+          <w:right w:val="single" w:sz="4" w:space="0" w:color="auto"/>
+          <w:insideH w:val="single" w:sz="4" w:space="0" w:color="auto"/>
+          <w:insideV w:val="single" w:sz="4" w:space="0" w:color="auto"/>
         </w:tblBorders>
+        <w:tblCellMar>
+          <w:left w:w="10" w:type="dxa"/>
+          <w:right w:w="10" w:type="dxa"/>
+        </w:tblCellMar>
+        <w:tblLook w:val="0000" w:firstRow="0" w:lastRow="0" w:firstColumn="0" w:lastColumn="0" w:noHBand="0" w:noVBand="0"/>
       </w:tblPr>
       <w:tblGrid>
         <w:gridCol w:w="9360"/>
       </w:tblGrid>
       <w:tr>
+        <w:tblPrEx>
+          <w:tblCellMar>
+            <w:top w:w="0" w:type="dxa"/>
+            <w:bottom w:w="0" w:type="dxa"/>
+          </w:tblCellMar>
+        </w:tblPrEx>
         <w:tc>
           <w:tcPr>
-            <w:tcW w:type="dxa" w:w="9360"/>
+            <w:tcW w:w="9360" w:type="dxa"/>
             <w:tcBorders>
-              <w:top w:val="single" w:color="2A7A6F" w:sz="4"/>
-              <w:left w:val="single" w:color="2A7A6F" w:sz="8"/>
-              <w:bottom w:val="single" w:color="2A7A6F" w:sz="4"/>
-              <w:right w:val="single" w:color="2A7A6F" w:sz="4"/>
+              <w:top w:val="single" w:sz="4" w:space="0" w:color="2A7A6F"/>
+              <w:left w:val="single" w:sz="8" w:space="0" w:color="2A7A6F"/>
+              <w:bottom w:val="single" w:sz="4" w:space="0" w:color="2A7A6F"/>
+              <w:right w:val="single" w:sz="4" w:space="0" w:color="2A7A6F"/>
             </w:tcBorders>
-            <w:shd w:fill="EAF4F1" w:val="clear"/>
+            <w:shd w:val="clear" w:color="auto" w:fill="EAF4F1"/>
             <w:tcMar>
-              <w:top w:type="dxa" w:w="120"/>
-              <w:left w:type="dxa" w:w="200"/>
-              <w:bottom w:type="dxa" w:w="120"/>
-              <w:right w:type="dxa" w:w="200"/>
+              <w:top w:w="120" w:type="dxa"/>
+              <w:left w:w="200" w:type="dxa"/>
+              <w:bottom w:w="120" w:type="dxa"/>
+              <w:right w:w="200" w:type="dxa"/>
             </w:tcMar>
           </w:tcPr>
           <w:p>
@@ -1253,7 +1377,7 @@
                 <w:sz w:val="20"/>
                 <w:szCs w:val="20"/>
               </w:rPr>
-              <w:t xml:space="preserve">After Remediation</w:t>
+              <w:t>After Remediation</w:t>
             </w:r>
           </w:p>
           <w:p>
@@ -1267,7 +1391,7 @@
                 <w:sz w:val="20"/>
                 <w:szCs w:val="20"/>
               </w:rPr>
-              <w:t xml:space="preserve">•  Improved patient-level longitudinal records</w:t>
+              <w:t>•  Improved patient-level longitudinal records</w:t>
             </w:r>
           </w:p>
           <w:p>
@@ -1281,7 +1405,7 @@
                 <w:sz w:val="20"/>
                 <w:szCs w:val="20"/>
               </w:rPr>
-              <w:t xml:space="preserve">•  Increased BP coverage and temporal density</w:t>
+              <w:t>•  Increased BP coverage and temporal density</w:t>
             </w:r>
           </w:p>
           <w:p>
@@ -1295,7 +1419,7 @@
                 <w:sz w:val="20"/>
                 <w:szCs w:val="20"/>
               </w:rPr>
-              <w:t xml:space="preserve">•  Partial recovery of missing covariates</w:t>
+              <w:t>•  Partial recovery of missing covariates</w:t>
             </w:r>
           </w:p>
           <w:p>
@@ -1309,12 +1433,12 @@
                 <w:sz w:val="20"/>
                 <w:szCs w:val="20"/>
               </w:rPr>
-              <w:t xml:space="preserve">•  Capability unlocked: ability to run hypertension risk algorithms and identify high-risk or undiagnosed patients</w:t>
-            </w:r>
-          </w:p>
-          <w:p>
-            <w:pPr>
-              <w:spacing w:after="0" w:before="80"/>
+              <w:t>•  Capability unlocked: ability to run hypertension risk algorithms and identify high-risk or undiagnosed patients</w:t>
+            </w:r>
+          </w:p>
+          <w:p>
+            <w:pPr>
+              <w:spacing w:before="80"/>
             </w:pPr>
             <w:r>
               <w:rPr>
@@ -1332,7 +1456,7 @@
                 <w:sz w:val="20"/>
                 <w:szCs w:val="20"/>
               </w:rPr>
-              <w:t xml:space="preserve">Hypertension Risk Stratification — PARTIALLY READY → READY (depending on site thresholds)</w:t>
+              <w:t>Hypertension Risk Stratification — PARTIALLY READY → READY (depending on site thresholds)</w:t>
             </w:r>
           </w:p>
         </w:tc>
@@ -1342,27 +1466,21 @@
       <w:pPr>
         <w:spacing w:after="80"/>
       </w:pPr>
-      <w:r>
-        <w:t xml:space="preserve"/>
-      </w:r>
     </w:p>
     <w:p>
       <w:pPr>
         <w:pBdr>
-          <w:bottom w:val="single" w:color="D0DCE8" w:sz="4" w:space="1"/>
+          <w:bottom w:val="single" w:sz="4" w:space="1" w:color="D0DCE8"/>
         </w:pBdr>
-        <w:spacing w:after="120" w:before="120"/>
-      </w:pPr>
-      <w:r>
-        <w:t xml:space="preserve"/>
-      </w:r>
+        <w:spacing w:before="120" w:after="120"/>
+      </w:pPr>
     </w:p>
     <w:p>
       <w:pPr>
         <w:pStyle w:val="Heading2"/>
       </w:pPr>
       <w:r>
-        <w:t xml:space="preserve">4. Remediation and Iteration</w:t>
+        <w:t>4. Remediation and Iteration</w:t>
       </w:r>
     </w:p>
     <w:p>
@@ -1370,23 +1488,20 @@
         <w:spacing w:after="100"/>
       </w:pPr>
       <w:r>
-        <w:t xml:space="preserve">The methodology is designed for iterative improvement, not one-time assessment. When a use case is blocked, the system generates targeted remediation guidance for the specific variables and checks that are failing.</w:t>
-      </w:r>
-    </w:p>
-    <w:p>
-      <w:pPr>
-        <w:spacing w:after="80"/>
-      </w:pPr>
-      <w:r>
-        <w:t xml:space="preserve"/>
-      </w:r>
+        <w:t>The methodology is designed for iterative improvement, not one-time assessment. When a use case is blocked, the system generates targeted remediation guidance for the specific variables and checks that are failing.</w:t>
+      </w:r>
+    </w:p>
+    <w:p>
+      <w:pPr>
+        <w:spacing w:after="80"/>
+      </w:pPr>
     </w:p>
     <w:p>
       <w:pPr>
         <w:spacing w:after="100"/>
       </w:pPr>
       <w:r>
-        <w:t xml:space="preserve">For each identified gap, the methodology provides:</w:t>
+        <w:t>For each identified gap, the methodology provides:</w:t>
       </w:r>
     </w:p>
     <w:p>
@@ -1398,7 +1513,7 @@
         </w:numPr>
       </w:pPr>
       <w:r>
-        <w:t xml:space="preserve">The variable and check that is failing</w:t>
+        <w:t>The variable and check that is failing</w:t>
       </w:r>
     </w:p>
     <w:p>
@@ -1410,7 +1525,7 @@
         </w:numPr>
       </w:pPr>
       <w:r>
-        <w:t xml:space="preserve">The likely root cause (transmission failure, source system issue, terminology mapping error, workflow gap)</w:t>
+        <w:t>The likely root cause (transmission failure, source system issue, terminology mapping error, workflow gap)</w:t>
       </w:r>
     </w:p>
     <w:p>
@@ -1422,7 +1537,7 @@
         </w:numPr>
       </w:pPr>
       <w:r>
-        <w:t xml:space="preserve">The responsible actor or system layer, as defined in the governance framework</w:t>
+        <w:t>The responsible actor or system layer, as defined in the governance framework</w:t>
       </w:r>
     </w:p>
     <w:p>
@@ -1434,50 +1549,42 @@
         </w:numPr>
       </w:pPr>
       <w:r>
-        <w:t xml:space="preserve">A suggested next remediation step</w:t>
-      </w:r>
-    </w:p>
-    <w:p>
-      <w:pPr>
-        <w:spacing w:after="80"/>
-      </w:pPr>
-      <w:r>
-        <w:t xml:space="preserve"/>
-      </w:r>
+        <w:t>A suggested next remediation step</w:t>
+      </w:r>
+    </w:p>
+    <w:p>
+      <w:pPr>
+        <w:spacing w:after="80"/>
+      </w:pPr>
     </w:p>
     <w:p>
       <w:pPr>
         <w:spacing w:after="100"/>
       </w:pPr>
       <w:r>
-        <w:t xml:space="preserve">After remediation, variables are re-scored and use-case fitness is re-evaluated. The system tracks progress over time, showing which capabilities have been unlocked and what remains blocked.</w:t>
-      </w:r>
-    </w:p>
-    <w:p>
-      <w:pPr>
-        <w:spacing w:after="80"/>
-      </w:pPr>
-      <w:r>
-        <w:t xml:space="preserve"/>
-      </w:r>
+        <w:lastRenderedPageBreak/>
+        <w:t>After remediation, variables are re-scored and use-case fitness is re-evaluated. The system tracks progress over time, showing which capabilities have been unlocked and what remains blocked.</w:t>
+      </w:r>
+    </w:p>
+    <w:p>
+      <w:pPr>
+        <w:spacing w:after="80"/>
+      </w:pPr>
     </w:p>
     <w:p>
       <w:pPr>
         <w:pBdr>
-          <w:bottom w:val="single" w:color="D0DCE8" w:sz="4" w:space="1"/>
+          <w:bottom w:val="single" w:sz="4" w:space="1" w:color="D0DCE8"/>
         </w:pBdr>
-        <w:spacing w:after="120" w:before="120"/>
-      </w:pPr>
-      <w:r>
-        <w:t xml:space="preserve"/>
-      </w:r>
+        <w:spacing w:before="120" w:after="120"/>
+      </w:pPr>
     </w:p>
     <w:p>
       <w:pPr>
         <w:pStyle w:val="Heading2"/>
       </w:pPr>
       <w:r>
-        <w:t xml:space="preserve">5. Extension: Device and Wearable Data</w:t>
+        <w:t>5. Extension: Device and Wearable Data</w:t>
       </w:r>
     </w:p>
     <w:p>
@@ -1485,64 +1592,69 @@
         <w:spacing w:after="100"/>
       </w:pPr>
       <w:r>
-        <w:t xml:space="preserve">Device-derived data — CGM readings, connected weight scales, home blood pressure monitors — follows the same variable-level and use-case evaluation model as EHR data. Device variables introduce additional readiness requirements specific to time series data: temporal density, cross-manufacturer consistency, and reproducibility of derived metrics from raw data.</w:t>
-      </w:r>
-    </w:p>
-    <w:p>
-      <w:pPr>
-        <w:spacing w:after="80"/>
-      </w:pPr>
-      <w:r>
-        <w:t xml:space="preserve"/>
-      </w:r>
+        <w:t>Device-derived data — CGM readings, connected weight scales, home blood pressure monitors — follows the same variable-level and use-case evaluation model as EHR data. Device variables introduce additional readiness requirements specific to time series data: temporal density, cross-manufacturer consistency, and reproducibility of derived metrics from raw data.</w:t>
+      </w:r>
+    </w:p>
+    <w:p>
+      <w:pPr>
+        <w:spacing w:after="80"/>
+      </w:pPr>
     </w:p>
     <w:p>
       <w:pPr>
         <w:spacing w:after="100"/>
       </w:pPr>
       <w:r>
-        <w:t xml:space="preserve">In rural settings where EHR data is incomplete, inconsistent, or delayed, device data provides an early operational path for risk identification. This enables staged deployment: device-based signals support initial use cases while broader data infrastructure matures.</w:t>
-      </w:r>
-    </w:p>
-    <w:p>
-      <w:pPr>
-        <w:spacing w:after="80"/>
-      </w:pPr>
-      <w:r>
-        <w:t xml:space="preserve"/>
-      </w:r>
+        <w:t>In rural settings where EHR data is incomplete, inconsistent, or delayed, device data provides an early operational path for risk identification. This enables staged deployment: device-based signals support initial use cases while broader data infrastructure matures.</w:t>
+      </w:r>
+    </w:p>
+    <w:p>
+      <w:pPr>
+        <w:spacing w:after="80"/>
+      </w:pPr>
     </w:p>
     <w:tbl>
       <w:tblPr>
-        <w:tblW w:type="dxa" w:w="9360"/>
+        <w:tblW w:w="9360" w:type="dxa"/>
         <w:tblBorders>
-          <w:top w:val="single" w:color="auto" w:sz="4"/>
-          <w:left w:val="single" w:color="auto" w:sz="4"/>
-          <w:bottom w:val="single" w:color="auto" w:sz="4"/>
-          <w:right w:val="single" w:color="auto" w:sz="4"/>
-          <w:insideH w:val="single" w:color="auto" w:sz="4"/>
-          <w:insideV w:val="single" w:color="auto" w:sz="4"/>
+          <w:top w:val="single" w:sz="4" w:space="0" w:color="auto"/>
+          <w:left w:val="single" w:sz="4" w:space="0" w:color="auto"/>
+          <w:bottom w:val="single" w:sz="4" w:space="0" w:color="auto"/>
+          <w:right w:val="single" w:sz="4" w:space="0" w:color="auto"/>
+          <w:insideH w:val="single" w:sz="4" w:space="0" w:color="auto"/>
+          <w:insideV w:val="single" w:sz="4" w:space="0" w:color="auto"/>
         </w:tblBorders>
+        <w:tblCellMar>
+          <w:left w:w="10" w:type="dxa"/>
+          <w:right w:w="10" w:type="dxa"/>
+        </w:tblCellMar>
+        <w:tblLook w:val="0000" w:firstRow="0" w:lastRow="0" w:firstColumn="0" w:lastColumn="0" w:noHBand="0" w:noVBand="0"/>
       </w:tblPr>
       <w:tblGrid>
         <w:gridCol w:w="9360"/>
       </w:tblGrid>
       <w:tr>
+        <w:tblPrEx>
+          <w:tblCellMar>
+            <w:top w:w="0" w:type="dxa"/>
+            <w:bottom w:w="0" w:type="dxa"/>
+          </w:tblCellMar>
+        </w:tblPrEx>
         <w:tc>
           <w:tcPr>
-            <w:tcW w:type="dxa" w:w="9360"/>
+            <w:tcW w:w="9360" w:type="dxa"/>
             <w:tcBorders>
-              <w:top w:val="single" w:color="2A7A6F" w:sz="4"/>
-              <w:left w:val="single" w:color="2A7A6F" w:sz="12"/>
-              <w:bottom w:val="single" w:color="2A7A6F" w:sz="4"/>
-              <w:right w:val="single" w:color="2A7A6F" w:sz="4"/>
+              <w:top w:val="single" w:sz="4" w:space="0" w:color="2A7A6F"/>
+              <w:left w:val="single" w:sz="12" w:space="0" w:color="2A7A6F"/>
+              <w:bottom w:val="single" w:sz="4" w:space="0" w:color="2A7A6F"/>
+              <w:right w:val="single" w:sz="4" w:space="0" w:color="2A7A6F"/>
             </w:tcBorders>
-            <w:shd w:fill="EAF4F1" w:val="clear"/>
+            <w:shd w:val="clear" w:color="auto" w:fill="EAF4F1"/>
             <w:tcMar>
-              <w:top w:type="dxa" w:w="120"/>
-              <w:left w:type="dxa" w:w="200"/>
-              <w:bottom w:type="dxa" w:w="120"/>
-              <w:right w:type="dxa" w:w="200"/>
+              <w:top w:w="120" w:type="dxa"/>
+              <w:left w:w="200" w:type="dxa"/>
+              <w:bottom w:w="120" w:type="dxa"/>
+              <w:right w:w="200" w:type="dxa"/>
             </w:tcMar>
           </w:tcPr>
           <w:p>
@@ -1551,10 +1663,8 @@
                 <w:b/>
                 <w:bCs/>
                 <w:color w:val="1F3864"/>
-                <w:sz w:val="22"/>
-                <w:szCs w:val="22"/>
-              </w:rPr>
-              <w:t xml:space="preserve">Device data enables early operational capability in constrained environments — supporting risk stratification and remote monitoring before full EHR integration is in place.</w:t>
+              </w:rPr>
+              <w:t>Device data enables early operational capability in constrained environments — supporting risk stratification and remote monitoring before full EHR integration is in place.</w:t>
             </w:r>
           </w:p>
         </w:tc>
@@ -1564,57 +1674,62 @@
       <w:pPr>
         <w:spacing w:after="80"/>
       </w:pPr>
-      <w:r>
-        <w:t xml:space="preserve"/>
-      </w:r>
     </w:p>
     <w:p>
       <w:pPr>
         <w:pStyle w:val="Heading3"/>
       </w:pPr>
       <w:r>
-        <w:t xml:space="preserve">Variable: CGM Glucose Time Series</w:t>
-      </w:r>
-    </w:p>
-    <w:p>
-      <w:pPr>
-        <w:spacing w:after="80"/>
-      </w:pPr>
-      <w:r>
-        <w:t xml:space="preserve"/>
-      </w:r>
+        <w:t>Variable: CGM Glucose Time Series</w:t>
+      </w:r>
+    </w:p>
+    <w:p>
+      <w:pPr>
+        <w:spacing w:after="80"/>
+      </w:pPr>
     </w:p>
     <w:tbl>
       <w:tblPr>
-        <w:tblW w:type="dxa" w:w="9360"/>
+        <w:tblW w:w="9360" w:type="dxa"/>
         <w:tblBorders>
-          <w:top w:val="single" w:color="auto" w:sz="4"/>
-          <w:left w:val="single" w:color="auto" w:sz="4"/>
-          <w:bottom w:val="single" w:color="auto" w:sz="4"/>
-          <w:right w:val="single" w:color="auto" w:sz="4"/>
-          <w:insideH w:val="single" w:color="auto" w:sz="4"/>
-          <w:insideV w:val="single" w:color="auto" w:sz="4"/>
+          <w:top w:val="single" w:sz="4" w:space="0" w:color="auto"/>
+          <w:left w:val="single" w:sz="4" w:space="0" w:color="auto"/>
+          <w:bottom w:val="single" w:sz="4" w:space="0" w:color="auto"/>
+          <w:right w:val="single" w:sz="4" w:space="0" w:color="auto"/>
+          <w:insideH w:val="single" w:sz="4" w:space="0" w:color="auto"/>
+          <w:insideV w:val="single" w:sz="4" w:space="0" w:color="auto"/>
         </w:tblBorders>
+        <w:tblCellMar>
+          <w:left w:w="10" w:type="dxa"/>
+          <w:right w:w="10" w:type="dxa"/>
+        </w:tblCellMar>
+        <w:tblLook w:val="0000" w:firstRow="0" w:lastRow="0" w:firstColumn="0" w:lastColumn="0" w:noHBand="0" w:noVBand="0"/>
       </w:tblPr>
       <w:tblGrid>
         <w:gridCol w:w="9360"/>
       </w:tblGrid>
       <w:tr>
+        <w:tblPrEx>
+          <w:tblCellMar>
+            <w:top w:w="0" w:type="dxa"/>
+            <w:bottom w:w="0" w:type="dxa"/>
+          </w:tblCellMar>
+        </w:tblPrEx>
         <w:tc>
           <w:tcPr>
-            <w:tcW w:type="dxa" w:w="9360"/>
+            <w:tcW w:w="9360" w:type="dxa"/>
             <w:tcBorders>
-              <w:top w:val="single" w:color="2C5282" w:sz="4"/>
-              <w:left w:val="single" w:color="2C5282" w:sz="8"/>
-              <w:bottom w:val="single" w:color="2C5282" w:sz="4"/>
-              <w:right w:val="single" w:color="2C5282" w:sz="4"/>
+              <w:top w:val="single" w:sz="4" w:space="0" w:color="2C5282"/>
+              <w:left w:val="single" w:sz="8" w:space="0" w:color="2C5282"/>
+              <w:bottom w:val="single" w:sz="4" w:space="0" w:color="2C5282"/>
+              <w:right w:val="single" w:sz="4" w:space="0" w:color="2C5282"/>
             </w:tcBorders>
-            <w:shd w:fill="EEF2F8" w:val="clear"/>
+            <w:shd w:val="clear" w:color="auto" w:fill="EEF2F8"/>
             <w:tcMar>
-              <w:top w:type="dxa" w:w="120"/>
-              <w:left w:type="dxa" w:w="200"/>
-              <w:bottom w:type="dxa" w:w="120"/>
-              <w:right w:type="dxa" w:w="200"/>
+              <w:top w:w="120" w:type="dxa"/>
+              <w:left w:w="200" w:type="dxa"/>
+              <w:bottom w:w="120" w:type="dxa"/>
+              <w:right w:w="200" w:type="dxa"/>
             </w:tcMar>
           </w:tcPr>
           <w:p>
@@ -1629,7 +1744,7 @@
                 <w:sz w:val="20"/>
                 <w:szCs w:val="20"/>
               </w:rPr>
-              <w:t xml:space="preserve">Technical Evaluation</w:t>
+              <w:t>Technical Evaluation</w:t>
             </w:r>
           </w:p>
           <w:p>
@@ -1643,7 +1758,7 @@
                 <w:sz w:val="20"/>
                 <w:szCs w:val="20"/>
               </w:rPr>
-              <w:t xml:space="preserve">•  CGM readings are ingested from device API or file feed (e.g., Dexcom, Abbott)</w:t>
+              <w:t>•  CGM readings are ingested from device API or file feed (e.g., Dexcom, Abbott)</w:t>
             </w:r>
           </w:p>
           <w:p>
@@ -1657,7 +1772,25 @@
                 <w:sz w:val="20"/>
                 <w:szCs w:val="20"/>
               </w:rPr>
-              <w:t xml:space="preserve">•  Glucose values are tagged with UTC and local timestamps; timezone normalization is applied</w:t>
+              <w:t xml:space="preserve">•  Glucose values are tagged with UTC and local timestamps; </w:t>
+            </w:r>
+            <w:proofErr w:type="spellStart"/>
+            <w:r>
+              <w:rPr>
+                <w:color w:val="333333"/>
+                <w:sz w:val="20"/>
+                <w:szCs w:val="20"/>
+              </w:rPr>
+              <w:t>timezone</w:t>
+            </w:r>
+            <w:proofErr w:type="spellEnd"/>
+            <w:r>
+              <w:rPr>
+                <w:color w:val="333333"/>
+                <w:sz w:val="20"/>
+                <w:szCs w:val="20"/>
+              </w:rPr>
+              <w:t xml:space="preserve"> normalization is applied</w:t>
             </w:r>
           </w:p>
           <w:p>
@@ -1671,7 +1804,25 @@
                 <w:sz w:val="20"/>
                 <w:szCs w:val="20"/>
               </w:rPr>
-              <w:t xml:space="preserve">•  Patient-device linkage is confirmed via patient_id — inconsistent identifiers can cause linkage failures</w:t>
+              <w:t xml:space="preserve">•  Patient-device linkage is confirmed via </w:t>
+            </w:r>
+            <w:proofErr w:type="spellStart"/>
+            <w:r>
+              <w:rPr>
+                <w:color w:val="333333"/>
+                <w:sz w:val="20"/>
+                <w:szCs w:val="20"/>
+              </w:rPr>
+              <w:t>patient_id</w:t>
+            </w:r>
+            <w:proofErr w:type="spellEnd"/>
+            <w:r>
+              <w:rPr>
+                <w:color w:val="333333"/>
+                <w:sz w:val="20"/>
+                <w:szCs w:val="20"/>
+              </w:rPr>
+              <w:t xml:space="preserve"> — inconsistent identifiers can cause linkage failures</w:t>
             </w:r>
           </w:p>
           <w:p>
@@ -1685,7 +1836,7 @@
                 <w:sz w:val="20"/>
                 <w:szCs w:val="20"/>
               </w:rPr>
-              <w:t xml:space="preserve">•  Duplicate detection removes redundant records from overlapping feeds</w:t>
+              <w:t>•  Duplicate detection removes redundant records from overlapping feeds</w:t>
             </w:r>
           </w:p>
         </w:tc>
@@ -1695,41 +1846,49 @@
       <w:pPr>
         <w:spacing w:after="80"/>
       </w:pPr>
-      <w:r>
-        <w:t xml:space="preserve"/>
-      </w:r>
     </w:p>
     <w:tbl>
       <w:tblPr>
-        <w:tblW w:type="dxa" w:w="9360"/>
+        <w:tblW w:w="9360" w:type="dxa"/>
         <w:tblBorders>
-          <w:top w:val="single" w:color="auto" w:sz="4"/>
-          <w:left w:val="single" w:color="auto" w:sz="4"/>
-          <w:bottom w:val="single" w:color="auto" w:sz="4"/>
-          <w:right w:val="single" w:color="auto" w:sz="4"/>
-          <w:insideH w:val="single" w:color="auto" w:sz="4"/>
-          <w:insideV w:val="single" w:color="auto" w:sz="4"/>
+          <w:top w:val="single" w:sz="4" w:space="0" w:color="auto"/>
+          <w:left w:val="single" w:sz="4" w:space="0" w:color="auto"/>
+          <w:bottom w:val="single" w:sz="4" w:space="0" w:color="auto"/>
+          <w:right w:val="single" w:sz="4" w:space="0" w:color="auto"/>
+          <w:insideH w:val="single" w:sz="4" w:space="0" w:color="auto"/>
+          <w:insideV w:val="single" w:sz="4" w:space="0" w:color="auto"/>
         </w:tblBorders>
+        <w:tblCellMar>
+          <w:left w:w="10" w:type="dxa"/>
+          <w:right w:w="10" w:type="dxa"/>
+        </w:tblCellMar>
+        <w:tblLook w:val="0000" w:firstRow="0" w:lastRow="0" w:firstColumn="0" w:lastColumn="0" w:noHBand="0" w:noVBand="0"/>
       </w:tblPr>
       <w:tblGrid>
         <w:gridCol w:w="9360"/>
       </w:tblGrid>
       <w:tr>
+        <w:tblPrEx>
+          <w:tblCellMar>
+            <w:top w:w="0" w:type="dxa"/>
+            <w:bottom w:w="0" w:type="dxa"/>
+          </w:tblCellMar>
+        </w:tblPrEx>
         <w:tc>
           <w:tcPr>
-            <w:tcW w:type="dxa" w:w="9360"/>
+            <w:tcW w:w="9360" w:type="dxa"/>
             <w:tcBorders>
-              <w:top w:val="single" w:color="4A80B0" w:sz="4"/>
-              <w:left w:val="single" w:color="4A80B0" w:sz="8"/>
-              <w:bottom w:val="single" w:color="4A80B0" w:sz="4"/>
-              <w:right w:val="single" w:color="4A80B0" w:sz="4"/>
+              <w:top w:val="single" w:sz="4" w:space="0" w:color="4A80B0"/>
+              <w:left w:val="single" w:sz="8" w:space="0" w:color="4A80B0"/>
+              <w:bottom w:val="single" w:sz="4" w:space="0" w:color="4A80B0"/>
+              <w:right w:val="single" w:sz="4" w:space="0" w:color="4A80B0"/>
             </w:tcBorders>
-            <w:shd w:fill="EBF4FB" w:val="clear"/>
+            <w:shd w:val="clear" w:color="auto" w:fill="EBF4FB"/>
             <w:tcMar>
-              <w:top w:type="dxa" w:w="120"/>
-              <w:left w:type="dxa" w:w="200"/>
-              <w:bottom w:type="dxa" w:w="120"/>
-              <w:right w:type="dxa" w:w="200"/>
+              <w:top w:w="120" w:type="dxa"/>
+              <w:left w:w="200" w:type="dxa"/>
+              <w:bottom w:w="120" w:type="dxa"/>
+              <w:right w:w="200" w:type="dxa"/>
             </w:tcMar>
           </w:tcPr>
           <w:p>
@@ -1744,7 +1903,7 @@
                 <w:sz w:val="20"/>
                 <w:szCs w:val="20"/>
               </w:rPr>
-              <w:t xml:space="preserve">Readiness Evaluation</w:t>
+              <w:t>Readiness Evaluation</w:t>
             </w:r>
           </w:p>
           <w:p>
@@ -1758,7 +1917,7 @@
                 <w:sz w:val="20"/>
                 <w:szCs w:val="20"/>
               </w:rPr>
-              <w:t xml:space="preserve">•  Glucose values are checked against physiologic plausibility ranges</w:t>
+              <w:t>•  Glucose values are checked against physiologic plausibility ranges</w:t>
             </w:r>
           </w:p>
           <w:p>
@@ -1772,7 +1931,7 @@
                 <w:sz w:val="20"/>
                 <w:szCs w:val="20"/>
               </w:rPr>
-              <w:t xml:space="preserve">•  Temporal density is assessed: expected sampling frequency (e.g., every 5 minutes) and % coverage over a defined window (e.g., 14 days)</w:t>
+              <w:t>•  Temporal density is assessed: expected sampling frequency (e.g., every 5 minutes) and % coverage over a defined window (e.g., 14 days)</w:t>
             </w:r>
           </w:p>
           <w:p>
@@ -1786,7 +1945,25 @@
                 <w:sz w:val="20"/>
                 <w:szCs w:val="20"/>
               </w:rPr>
-              <w:t xml:space="preserve">•  Timestamps are checked for monotonic ordering and timezone consistency</w:t>
+              <w:t xml:space="preserve">•  Timestamps are checked for monotonic ordering and </w:t>
+            </w:r>
+            <w:proofErr w:type="spellStart"/>
+            <w:r>
+              <w:rPr>
+                <w:color w:val="333333"/>
+                <w:sz w:val="20"/>
+                <w:szCs w:val="20"/>
+              </w:rPr>
+              <w:t>timezone</w:t>
+            </w:r>
+            <w:proofErr w:type="spellEnd"/>
+            <w:r>
+              <w:rPr>
+                <w:color w:val="333333"/>
+                <w:sz w:val="20"/>
+                <w:szCs w:val="20"/>
+              </w:rPr>
+              <w:t xml:space="preserve"> consistency</w:t>
             </w:r>
           </w:p>
           <w:p>
@@ -1800,12 +1977,12 @@
                 <w:sz w:val="20"/>
                 <w:szCs w:val="20"/>
               </w:rPr>
-              <w:t xml:space="preserve">•  Derived metrics (TIR, GMI, variability) are recomputed from raw data rather than trusted from device output, to ensure cross-manufacturer consistency</w:t>
-            </w:r>
-          </w:p>
-          <w:p>
-            <w:pPr>
-              <w:spacing w:after="0" w:before="80"/>
+              <w:t>•  Derived metrics (TIR, GMI, variability) are recomputed from raw data rather than trusted from device output, to ensure cross-manufacturer consistency</w:t>
+            </w:r>
+          </w:p>
+          <w:p>
+            <w:pPr>
+              <w:spacing w:before="80"/>
             </w:pPr>
             <w:r>
               <w:rPr>
@@ -1823,7 +2000,7 @@
                 <w:sz w:val="20"/>
                 <w:szCs w:val="20"/>
               </w:rPr>
-              <w:t xml:space="preserve">Technical score: moderate (patient-device linkage gaps). Readiness score: moderate (plausible values, but temporal coverage below threshold for some patients).</w:t>
+              <w:t>Technical score: moderate (patient-device linkage gaps). Readiness score: moderate (plausible values, but temporal coverage below threshold for some patients).</w:t>
             </w:r>
           </w:p>
         </w:tc>
@@ -1833,16 +2010,13 @@
       <w:pPr>
         <w:spacing w:after="80"/>
       </w:pPr>
-      <w:r>
-        <w:t xml:space="preserve"/>
-      </w:r>
     </w:p>
     <w:p>
       <w:pPr>
         <w:pStyle w:val="Heading3"/>
       </w:pPr>
       <w:r>
-        <w:t xml:space="preserve">Use Case: CGM-Based Diabetes Risk Stratification</w:t>
+        <w:t>Use Case: CGM-Based Diabetes Risk Stratification</w:t>
       </w:r>
     </w:p>
     <w:p>
@@ -1850,64 +2024,70 @@
         <w:spacing w:after="100"/>
       </w:pPr>
       <w:r>
-        <w:t xml:space="preserve">Objective: identify patients with deteriorating glycemic control or at risk of diabetes complications using longitudinal CGM data.</w:t>
-      </w:r>
-    </w:p>
-    <w:p>
-      <w:pPr>
-        <w:spacing w:after="80"/>
-      </w:pPr>
-      <w:r>
-        <w:t xml:space="preserve"/>
-      </w:r>
+        <w:t>Objective: identify patients with deteriorating glycemic control or at risk of diabetes complications using longitudinal CGM data.</w:t>
+      </w:r>
+    </w:p>
+    <w:p>
+      <w:pPr>
+        <w:spacing w:after="80"/>
+      </w:pPr>
     </w:p>
     <w:p>
       <w:pPr>
         <w:spacing w:after="100"/>
       </w:pPr>
       <w:r>
-        <w:t xml:space="preserve">Required variables: CGM glucose time series, Patient demographics (age, sex), Diabetes diagnosis status, Medication data (insulin, metformin). Optional: HbA1c from lab data.</w:t>
-      </w:r>
-    </w:p>
-    <w:p>
-      <w:pPr>
-        <w:spacing w:after="80"/>
-      </w:pPr>
-      <w:r>
-        <w:t xml:space="preserve"/>
-      </w:r>
+        <w:lastRenderedPageBreak/>
+        <w:t>Required variables: CGM glucose time series, Patient demographics (age, sex), Diabetes diagnosis status, Medication data (insulin, metformin). Optional: HbA1c from lab data.</w:t>
+      </w:r>
+    </w:p>
+    <w:p>
+      <w:pPr>
+        <w:spacing w:after="80"/>
+      </w:pPr>
     </w:p>
     <w:tbl>
       <w:tblPr>
-        <w:tblW w:type="dxa" w:w="9360"/>
+        <w:tblW w:w="9360" w:type="dxa"/>
         <w:tblBorders>
-          <w:top w:val="single" w:color="auto" w:sz="4"/>
-          <w:left w:val="single" w:color="auto" w:sz="4"/>
-          <w:bottom w:val="single" w:color="auto" w:sz="4"/>
-          <w:right w:val="single" w:color="auto" w:sz="4"/>
-          <w:insideH w:val="single" w:color="auto" w:sz="4"/>
-          <w:insideV w:val="single" w:color="auto" w:sz="4"/>
+          <w:top w:val="single" w:sz="4" w:space="0" w:color="auto"/>
+          <w:left w:val="single" w:sz="4" w:space="0" w:color="auto"/>
+          <w:bottom w:val="single" w:sz="4" w:space="0" w:color="auto"/>
+          <w:right w:val="single" w:sz="4" w:space="0" w:color="auto"/>
+          <w:insideH w:val="single" w:sz="4" w:space="0" w:color="auto"/>
+          <w:insideV w:val="single" w:sz="4" w:space="0" w:color="auto"/>
         </w:tblBorders>
+        <w:tblCellMar>
+          <w:left w:w="10" w:type="dxa"/>
+          <w:right w:w="10" w:type="dxa"/>
+        </w:tblCellMar>
+        <w:tblLook w:val="0000" w:firstRow="0" w:lastRow="0" w:firstColumn="0" w:lastColumn="0" w:noHBand="0" w:noVBand="0"/>
       </w:tblPr>
       <w:tblGrid>
         <w:gridCol w:w="9360"/>
       </w:tblGrid>
       <w:tr>
+        <w:tblPrEx>
+          <w:tblCellMar>
+            <w:top w:w="0" w:type="dxa"/>
+            <w:bottom w:w="0" w:type="dxa"/>
+          </w:tblCellMar>
+        </w:tblPrEx>
         <w:tc>
           <w:tcPr>
-            <w:tcW w:type="dxa" w:w="9360"/>
+            <w:tcW w:w="9360" w:type="dxa"/>
             <w:tcBorders>
-              <w:top w:val="single" w:color="C0392B" w:sz="4"/>
-              <w:left w:val="single" w:color="C0392B" w:sz="8"/>
-              <w:bottom w:val="single" w:color="C0392B" w:sz="4"/>
-              <w:right w:val="single" w:color="C0392B" w:sz="4"/>
+              <w:top w:val="single" w:sz="4" w:space="0" w:color="C0392B"/>
+              <w:left w:val="single" w:sz="8" w:space="0" w:color="C0392B"/>
+              <w:bottom w:val="single" w:sz="4" w:space="0" w:color="C0392B"/>
+              <w:right w:val="single" w:sz="4" w:space="0" w:color="C0392B"/>
             </w:tcBorders>
-            <w:shd w:fill="FDE8E8" w:val="clear"/>
+            <w:shd w:val="clear" w:color="auto" w:fill="FDE8E8"/>
             <w:tcMar>
-              <w:top w:type="dxa" w:w="120"/>
-              <w:left w:type="dxa" w:w="200"/>
-              <w:bottom w:type="dxa" w:w="120"/>
-              <w:right w:type="dxa" w:w="200"/>
+              <w:top w:w="120" w:type="dxa"/>
+              <w:left w:w="200" w:type="dxa"/>
+              <w:bottom w:w="120" w:type="dxa"/>
+              <w:right w:w="200" w:type="dxa"/>
             </w:tcMar>
           </w:tcPr>
           <w:p>
@@ -1922,7 +2102,7 @@
                 <w:sz w:val="20"/>
                 <w:szCs w:val="20"/>
               </w:rPr>
-              <w:t xml:space="preserve">Before Remediation</w:t>
+              <w:t>Before Remediation</w:t>
             </w:r>
           </w:p>
           <w:p>
@@ -1936,7 +2116,7 @@
                 <w:sz w:val="20"/>
                 <w:szCs w:val="20"/>
               </w:rPr>
-              <w:t xml:space="preserve">•  CGM temporal coverage below threshold for a significant portion of patients (≤70% over 14 days)</w:t>
+              <w:t>•  CGM temporal coverage below threshold for a significant portion of patients (≤70% over 14 days)</w:t>
             </w:r>
           </w:p>
           <w:p>
@@ -1950,7 +2130,7 @@
                 <w:sz w:val="20"/>
                 <w:szCs w:val="20"/>
               </w:rPr>
-              <w:t xml:space="preserve">•  Patient-device linkage failures reduce usable population</w:t>
+              <w:t>•  Patient-device linkage failures reduce usable population</w:t>
             </w:r>
           </w:p>
           <w:p>
@@ -1964,7 +2144,7 @@
                 <w:sz w:val="20"/>
                 <w:szCs w:val="20"/>
               </w:rPr>
-              <w:t xml:space="preserve">•  Derived metrics (TIR) inconsistent across device manufacturers</w:t>
+              <w:t>•  Derived metrics (TIR) inconsistent across device manufacturers</w:t>
             </w:r>
           </w:p>
           <w:p>
@@ -1978,12 +2158,12 @@
                 <w:sz w:val="20"/>
                 <w:szCs w:val="20"/>
               </w:rPr>
-              <w:t xml:space="preserve">•  Blockers: insufficient temporal density, identity linkage issues, cross-manufacturer inconsistency</w:t>
-            </w:r>
-          </w:p>
-          <w:p>
-            <w:pPr>
-              <w:spacing w:after="0" w:before="80"/>
+              <w:t>•  Blockers: insufficient temporal density, identity linkage issues, cross-manufacturer inconsistency</w:t>
+            </w:r>
+          </w:p>
+          <w:p>
+            <w:pPr>
+              <w:spacing w:before="80"/>
             </w:pPr>
             <w:r>
               <w:rPr>
@@ -2001,7 +2181,7 @@
                 <w:sz w:val="20"/>
                 <w:szCs w:val="20"/>
               </w:rPr>
-              <w:t xml:space="preserve">Diabetes Risk Stratification — NOT READY</w:t>
+              <w:t>Diabetes Risk Stratification — NOT READY</w:t>
             </w:r>
           </w:p>
         </w:tc>
@@ -2011,41 +2191,49 @@
       <w:pPr>
         <w:spacing w:after="80"/>
       </w:pPr>
-      <w:r>
-        <w:t xml:space="preserve"/>
-      </w:r>
     </w:p>
     <w:tbl>
       <w:tblPr>
-        <w:tblW w:type="dxa" w:w="9360"/>
+        <w:tblW w:w="9360" w:type="dxa"/>
         <w:tblBorders>
-          <w:top w:val="single" w:color="auto" w:sz="4"/>
-          <w:left w:val="single" w:color="auto" w:sz="4"/>
-          <w:bottom w:val="single" w:color="auto" w:sz="4"/>
-          <w:right w:val="single" w:color="auto" w:sz="4"/>
-          <w:insideH w:val="single" w:color="auto" w:sz="4"/>
-          <w:insideV w:val="single" w:color="auto" w:sz="4"/>
+          <w:top w:val="single" w:sz="4" w:space="0" w:color="auto"/>
+          <w:left w:val="single" w:sz="4" w:space="0" w:color="auto"/>
+          <w:bottom w:val="single" w:sz="4" w:space="0" w:color="auto"/>
+          <w:right w:val="single" w:sz="4" w:space="0" w:color="auto"/>
+          <w:insideH w:val="single" w:sz="4" w:space="0" w:color="auto"/>
+          <w:insideV w:val="single" w:sz="4" w:space="0" w:color="auto"/>
         </w:tblBorders>
+        <w:tblCellMar>
+          <w:left w:w="10" w:type="dxa"/>
+          <w:right w:w="10" w:type="dxa"/>
+        </w:tblCellMar>
+        <w:tblLook w:val="0000" w:firstRow="0" w:lastRow="0" w:firstColumn="0" w:lastColumn="0" w:noHBand="0" w:noVBand="0"/>
       </w:tblPr>
       <w:tblGrid>
         <w:gridCol w:w="9360"/>
       </w:tblGrid>
       <w:tr>
+        <w:tblPrEx>
+          <w:tblCellMar>
+            <w:top w:w="0" w:type="dxa"/>
+            <w:bottom w:w="0" w:type="dxa"/>
+          </w:tblCellMar>
+        </w:tblPrEx>
         <w:tc>
           <w:tcPr>
-            <w:tcW w:type="dxa" w:w="9360"/>
+            <w:tcW w:w="9360" w:type="dxa"/>
             <w:tcBorders>
-              <w:top w:val="single" w:color="C08020" w:sz="4"/>
-              <w:left w:val="single" w:color="C08020" w:sz="8"/>
-              <w:bottom w:val="single" w:color="C08020" w:sz="4"/>
-              <w:right w:val="single" w:color="C08020" w:sz="4"/>
+              <w:top w:val="single" w:sz="4" w:space="0" w:color="C08020"/>
+              <w:left w:val="single" w:sz="8" w:space="0" w:color="C08020"/>
+              <w:bottom w:val="single" w:sz="4" w:space="0" w:color="C08020"/>
+              <w:right w:val="single" w:sz="4" w:space="0" w:color="C08020"/>
             </w:tcBorders>
-            <w:shd w:fill="FDF6E8" w:val="clear"/>
+            <w:shd w:val="clear" w:color="auto" w:fill="FDF6E8"/>
             <w:tcMar>
-              <w:top w:type="dxa" w:w="120"/>
-              <w:left w:type="dxa" w:w="200"/>
-              <w:bottom w:type="dxa" w:w="120"/>
-              <w:right w:type="dxa" w:w="200"/>
+              <w:top w:w="120" w:type="dxa"/>
+              <w:left w:w="200" w:type="dxa"/>
+              <w:bottom w:w="120" w:type="dxa"/>
+              <w:right w:w="200" w:type="dxa"/>
             </w:tcMar>
           </w:tcPr>
           <w:p>
@@ -2060,7 +2248,7 @@
                 <w:sz w:val="20"/>
                 <w:szCs w:val="20"/>
               </w:rPr>
-              <w:t xml:space="preserve">Remediation Actions</w:t>
+              <w:t>Remediation Actions</w:t>
             </w:r>
           </w:p>
           <w:p>
@@ -2074,7 +2262,7 @@
                 <w:sz w:val="20"/>
                 <w:szCs w:val="20"/>
               </w:rPr>
-              <w:t xml:space="preserve">•  Improve patient-device linkage by standardizing patient ID handling in device ingestion pipeline</w:t>
+              <w:t>•  Improve patient-device linkage by standardizing patient ID handling in device ingestion pipeline</w:t>
             </w:r>
           </w:p>
           <w:p>
@@ -2088,7 +2276,7 @@
                 <w:sz w:val="20"/>
                 <w:szCs w:val="20"/>
               </w:rPr>
-              <w:t xml:space="preserve">•  Recompute all derived metrics (TIR, GMI) from raw glucose time series to normalize across manufacturers</w:t>
+              <w:t>•  Recompute all derived metrics (TIR, GMI) from raw glucose time series to normalize across manufacturers</w:t>
             </w:r>
           </w:p>
           <w:p>
@@ -2102,7 +2290,7 @@
                 <w:sz w:val="20"/>
                 <w:szCs w:val="20"/>
               </w:rPr>
-              <w:t xml:space="preserve">•  Flag patients with insufficient coverage and implement outreach to improve device adherence</w:t>
+              <w:t>•  Flag patients with insufficient coverage and implement outreach to improve device adherence</w:t>
             </w:r>
           </w:p>
         </w:tc>
@@ -2112,41 +2300,49 @@
       <w:pPr>
         <w:spacing w:after="80"/>
       </w:pPr>
-      <w:r>
-        <w:t xml:space="preserve"/>
-      </w:r>
     </w:p>
     <w:tbl>
       <w:tblPr>
-        <w:tblW w:type="dxa" w:w="9360"/>
+        <w:tblW w:w="9360" w:type="dxa"/>
         <w:tblBorders>
-          <w:top w:val="single" w:color="auto" w:sz="4"/>
-          <w:left w:val="single" w:color="auto" w:sz="4"/>
-          <w:bottom w:val="single" w:color="auto" w:sz="4"/>
-          <w:right w:val="single" w:color="auto" w:sz="4"/>
-          <w:insideH w:val="single" w:color="auto" w:sz="4"/>
-          <w:insideV w:val="single" w:color="auto" w:sz="4"/>
+          <w:top w:val="single" w:sz="4" w:space="0" w:color="auto"/>
+          <w:left w:val="single" w:sz="4" w:space="0" w:color="auto"/>
+          <w:bottom w:val="single" w:sz="4" w:space="0" w:color="auto"/>
+          <w:right w:val="single" w:sz="4" w:space="0" w:color="auto"/>
+          <w:insideH w:val="single" w:sz="4" w:space="0" w:color="auto"/>
+          <w:insideV w:val="single" w:sz="4" w:space="0" w:color="auto"/>
         </w:tblBorders>
+        <w:tblCellMar>
+          <w:left w:w="10" w:type="dxa"/>
+          <w:right w:w="10" w:type="dxa"/>
+        </w:tblCellMar>
+        <w:tblLook w:val="0000" w:firstRow="0" w:lastRow="0" w:firstColumn="0" w:lastColumn="0" w:noHBand="0" w:noVBand="0"/>
       </w:tblPr>
       <w:tblGrid>
         <w:gridCol w:w="9360"/>
       </w:tblGrid>
       <w:tr>
+        <w:tblPrEx>
+          <w:tblCellMar>
+            <w:top w:w="0" w:type="dxa"/>
+            <w:bottom w:w="0" w:type="dxa"/>
+          </w:tblCellMar>
+        </w:tblPrEx>
         <w:tc>
           <w:tcPr>
-            <w:tcW w:type="dxa" w:w="9360"/>
+            <w:tcW w:w="9360" w:type="dxa"/>
             <w:tcBorders>
-              <w:top w:val="single" w:color="2A7A6F" w:sz="4"/>
-              <w:left w:val="single" w:color="2A7A6F" w:sz="8"/>
-              <w:bottom w:val="single" w:color="2A7A6F" w:sz="4"/>
-              <w:right w:val="single" w:color="2A7A6F" w:sz="4"/>
+              <w:top w:val="single" w:sz="4" w:space="0" w:color="2A7A6F"/>
+              <w:left w:val="single" w:sz="8" w:space="0" w:color="2A7A6F"/>
+              <w:bottom w:val="single" w:sz="4" w:space="0" w:color="2A7A6F"/>
+              <w:right w:val="single" w:sz="4" w:space="0" w:color="2A7A6F"/>
             </w:tcBorders>
-            <w:shd w:fill="EAF4F1" w:val="clear"/>
+            <w:shd w:val="clear" w:color="auto" w:fill="EAF4F1"/>
             <w:tcMar>
-              <w:top w:type="dxa" w:w="120"/>
-              <w:left w:type="dxa" w:w="200"/>
-              <w:bottom w:type="dxa" w:w="120"/>
-              <w:right w:type="dxa" w:w="200"/>
+              <w:top w:w="120" w:type="dxa"/>
+              <w:left w:w="200" w:type="dxa"/>
+              <w:bottom w:w="120" w:type="dxa"/>
+              <w:right w:w="200" w:type="dxa"/>
             </w:tcMar>
           </w:tcPr>
           <w:p>
@@ -2161,7 +2357,7 @@
                 <w:sz w:val="20"/>
                 <w:szCs w:val="20"/>
               </w:rPr>
-              <w:t xml:space="preserve">After Remediation</w:t>
+              <w:t>After Remediation</w:t>
             </w:r>
           </w:p>
           <w:p>
@@ -2175,7 +2371,7 @@
                 <w:sz w:val="20"/>
                 <w:szCs w:val="20"/>
               </w:rPr>
-              <w:t xml:space="preserve">•  Improved patient-device linkage increases usable patient population</w:t>
+              <w:t>•  Improved patient-device linkage increases usable patient population</w:t>
             </w:r>
           </w:p>
           <w:p>
@@ -2189,7 +2385,7 @@
                 <w:sz w:val="20"/>
                 <w:szCs w:val="20"/>
               </w:rPr>
-              <w:t xml:space="preserve">•  Temporal coverage meets threshold for majority of enrolled patients</w:t>
+              <w:t>•  Temporal coverage meets threshold for majority of enrolled patients</w:t>
             </w:r>
           </w:p>
           <w:p>
@@ -2203,7 +2399,7 @@
                 <w:sz w:val="20"/>
                 <w:szCs w:val="20"/>
               </w:rPr>
-              <w:t xml:space="preserve">•  Derived metrics are consistent across device types</w:t>
+              <w:t>•  Derived metrics are consistent across device types</w:t>
             </w:r>
           </w:p>
           <w:p>
@@ -2217,12 +2413,12 @@
                 <w:sz w:val="20"/>
                 <w:szCs w:val="20"/>
               </w:rPr>
-              <w:t xml:space="preserve">•  Capability unlocked: ability to run glycemic control algorithms and identify high-risk patients for care coordination</w:t>
-            </w:r>
-          </w:p>
-          <w:p>
-            <w:pPr>
-              <w:spacing w:after="0" w:before="80"/>
+              <w:t>•  Capability unlocked: ability to run glycemic control algorithms and identify high-risk patients for care coordination</w:t>
+            </w:r>
+          </w:p>
+          <w:p>
+            <w:pPr>
+              <w:spacing w:before="80"/>
             </w:pPr>
             <w:r>
               <w:rPr>
@@ -2240,7 +2436,7 @@
                 <w:sz w:val="20"/>
                 <w:szCs w:val="20"/>
               </w:rPr>
-              <w:t xml:space="preserve">Diabetes Risk Stratification — PARTIALLY READY → READY (depending on site thresholds)</w:t>
+              <w:t>Diabetes Risk Stratification — PARTIALLY READY → READY (depending on site thresholds)</w:t>
             </w:r>
           </w:p>
         </w:tc>
@@ -2250,43 +2446,34 @@
       <w:pPr>
         <w:spacing w:after="80"/>
       </w:pPr>
-      <w:r>
-        <w:t xml:space="preserve"/>
-      </w:r>
     </w:p>
     <w:p>
       <w:pPr>
         <w:spacing w:after="100"/>
       </w:pPr>
       <w:r>
-        <w:t xml:space="preserve">The full device event model, device-specific check registry, and concordance logic are documented in the companion Device Data Model &amp; Readiness Extension document.</w:t>
-      </w:r>
-    </w:p>
-    <w:p>
-      <w:pPr>
-        <w:spacing w:after="80"/>
-      </w:pPr>
-      <w:r>
-        <w:t xml:space="preserve"/>
-      </w:r>
+        <w:t>The full device event model, device-specific check registry, and concordance logic are documented in the companion Device Data Model &amp; Readiness Extension document.</w:t>
+      </w:r>
+    </w:p>
+    <w:p>
+      <w:pPr>
+        <w:spacing w:after="80"/>
+      </w:pPr>
     </w:p>
     <w:p>
       <w:pPr>
         <w:pBdr>
-          <w:bottom w:val="single" w:color="D0DCE8" w:sz="4" w:space="1"/>
+          <w:bottom w:val="single" w:sz="4" w:space="1" w:color="D0DCE8"/>
         </w:pBdr>
-        <w:spacing w:after="120" w:before="120"/>
-      </w:pPr>
-      <w:r>
-        <w:t xml:space="preserve"/>
-      </w:r>
+        <w:spacing w:before="120" w:after="120"/>
+      </w:pPr>
     </w:p>
     <w:p>
       <w:pPr>
         <w:pStyle w:val="Heading2"/>
       </w:pPr>
       <w:r>
-        <w:t xml:space="preserve">Data Sufficiency vs. Data Quality</w:t>
+        <w:t>Data Sufficiency vs. Data Quality</w:t>
       </w:r>
     </w:p>
     <w:p>
@@ -2294,16 +2481,13 @@
         <w:spacing w:after="100"/>
       </w:pPr>
       <w:r>
-        <w:t xml:space="preserve">A variable may be technically correct and clinically plausible but still insufficient for a given use case due to lack of temporal density or population coverage. The methodology distinguishes between two related but distinct concepts:</w:t>
-      </w:r>
-    </w:p>
-    <w:p>
-      <w:pPr>
-        <w:spacing w:after="80"/>
-      </w:pPr>
-      <w:r>
-        <w:t xml:space="preserve"/>
-      </w:r>
+        <w:t>A variable may be technically correct and clinically plausible but still insufficient for a given use case due to lack of temporal density or population coverage. The methodology distinguishes between two related but distinct concepts:</w:t>
+      </w:r>
+    </w:p>
+    <w:p>
+      <w:pPr>
+        <w:spacing w:after="80"/>
+      </w:pPr>
     </w:p>
     <w:p>
       <w:pPr>
@@ -2317,16 +2501,13 @@
         <w:t xml:space="preserve">Data quality — </w:t>
       </w:r>
       <w:r>
-        <w:t xml:space="preserve">correctness of the data: values are valid, mapped, linked, and temporally coherent.</w:t>
-      </w:r>
-    </w:p>
-    <w:p>
-      <w:pPr>
-        <w:spacing w:after="80"/>
-      </w:pPr>
-      <w:r>
-        <w:t xml:space="preserve"/>
-      </w:r>
+        <w:t>correctness of the data: values are valid, mapped, linked, and temporally coherent.</w:t>
+      </w:r>
+    </w:p>
+    <w:p>
+      <w:pPr>
+        <w:spacing w:after="80"/>
+      </w:pPr>
     </w:p>
     <w:p>
       <w:pPr>
@@ -2340,66 +2521,58 @@
         <w:t xml:space="preserve">Data sufficiency — </w:t>
       </w:r>
       <w:r>
-        <w:t xml:space="preserve">availability of the data for use: enough records are present, with adequate coverage and density, to support the intended analysis.</w:t>
-      </w:r>
-    </w:p>
-    <w:p>
-      <w:pPr>
-        <w:spacing w:after="80"/>
-      </w:pPr>
-      <w:r>
-        <w:t xml:space="preserve"/>
-      </w:r>
+        <w:t>availability of the data for use: enough records are present, with adequate coverage and density, to support the intended analysis.</w:t>
+      </w:r>
+    </w:p>
+    <w:p>
+      <w:pPr>
+        <w:spacing w:after="80"/>
+      </w:pPr>
     </w:p>
     <w:p>
       <w:pPr>
         <w:spacing w:after="100"/>
       </w:pPr>
       <w:r>
-        <w:t xml:space="preserve">This distinction is especially important for device data, where a CGM feed may produce plausible glucose values but still fall below the temporal density threshold required for TIR computation or risk stratification. A site can have high data quality and low data sufficiency simultaneously — and both must be addressed for a use case to be viable.</w:t>
-      </w:r>
-    </w:p>
-    <w:p>
-      <w:pPr>
-        <w:spacing w:after="80"/>
-      </w:pPr>
-      <w:r>
-        <w:t xml:space="preserve"/>
-      </w:r>
+        <w:t xml:space="preserve">This distinction is especially important for device data, where a CGM feed may produce plausible glucose values but still fall below the temporal density threshold required for TIR </w:t>
+      </w:r>
+      <w:r>
+        <w:lastRenderedPageBreak/>
+        <w:t>computation or risk stratification. A site can have high data quality and low data sufficiency simultaneously — and both must be addressed for a use case to be viable.</w:t>
+      </w:r>
+    </w:p>
+    <w:p>
+      <w:pPr>
+        <w:spacing w:after="80"/>
+      </w:pPr>
     </w:p>
     <w:p>
       <w:pPr>
         <w:spacing w:after="100"/>
       </w:pPr>
       <w:r>
-        <w:t xml:space="preserve">Derived metrics such as TIR and GMI are treated as outputs of the data evaluation, not inputs to the readiness assessment. Their reliability depends on the underlying data quality and sufficiency of the raw time series.</w:t>
-      </w:r>
-    </w:p>
-    <w:p>
-      <w:pPr>
-        <w:spacing w:after="80"/>
-      </w:pPr>
-      <w:r>
-        <w:t xml:space="preserve"/>
-      </w:r>
+        <w:t>Derived metrics such as TIR and GMI are treated as outputs of the data evaluation, not inputs to the readiness assessment. Their reliability depends on the underlying data quality and sufficiency of the raw time series.</w:t>
+      </w:r>
+    </w:p>
+    <w:p>
+      <w:pPr>
+        <w:spacing w:after="80"/>
+      </w:pPr>
     </w:p>
     <w:p>
       <w:pPr>
         <w:pBdr>
-          <w:bottom w:val="single" w:color="D0DCE8" w:sz="4" w:space="1"/>
+          <w:bottom w:val="single" w:sz="4" w:space="1" w:color="D0DCE8"/>
         </w:pBdr>
-        <w:spacing w:after="120" w:before="120"/>
-      </w:pPr>
-      <w:r>
-        <w:t xml:space="preserve"/>
-      </w:r>
+        <w:spacing w:before="120" w:after="120"/>
+      </w:pPr>
     </w:p>
     <w:p>
       <w:pPr>
         <w:pStyle w:val="Heading2"/>
       </w:pPr>
       <w:r>
-        <w:t xml:space="preserve">Score Interpretation and Progressive Disclosure</w:t>
+        <w:t>Score Interpretation and Progressive Disclosure</w:t>
       </w:r>
     </w:p>
     <w:p>
@@ -2407,23 +2580,20 @@
         <w:spacing w:after="100"/>
       </w:pPr>
       <w:r>
-        <w:t xml:space="preserve">Readiness outputs are designed for multiple audiences. Clinical and operational leaders see use-case readiness status and key blockers. Program managers see variable-level scores and domain detail. Data infrastructure teams see individual check results and remediation steps. The same underlying scoring system serves all three levels.</w:t>
-      </w:r>
-    </w:p>
-    <w:p>
-      <w:pPr>
-        <w:spacing w:after="80"/>
-      </w:pPr>
-      <w:r>
-        <w:t xml:space="preserve"/>
-      </w:r>
+        <w:t>Readiness outputs are designed for multiple audiences. Clinical and operational leaders see use-case readiness status and key blockers. Program managers see variable-level scores and domain detail. Data infrastructure teams see individual check results and remediation steps. The same underlying scoring system serves all three levels.</w:t>
+      </w:r>
+    </w:p>
+    <w:p>
+      <w:pPr>
+        <w:spacing w:after="80"/>
+      </w:pPr>
     </w:p>
     <w:p>
       <w:pPr>
         <w:pStyle w:val="Heading2"/>
       </w:pPr>
       <w:r>
-        <w:t xml:space="preserve">Methodology Development</w:t>
+        <w:t>Methodology Development</w:t>
       </w:r>
     </w:p>
     <w:p>
@@ -2431,102 +2601,215 @@
         <w:spacing w:after="100"/>
       </w:pPr>
       <w:r>
-        <w:t xml:space="preserve">The methodology is being developed collaboratively with academic data quality partners and will be released under an open-source framework. Companion documents include the Technical Specification (check registry and scoring model) and the Device Data Model &amp; Readiness Extension (device-specific implementation).</w:t>
+        <w:t>This methodology sits in the lineage of Michael Kahn's foundational data quality framework, which established variable-level evaluation across conformance, completeness, and plausibility as the organizing principle for healthcare data quality assessment. The Oros methodology carries that foundation forward through a fit-for-purpose, use-case-conditional lens: data quality is evaluated not in the abstract but relative to the specific operational program the data must support.</w:t>
+      </w:r>
+    </w:p>
+    <w:p>
+      <w:pPr>
+        <w:spacing w:after="100"/>
+      </w:pPr>
+      <w:r>
+        <w:t>This extension was developed in collaboration with Hanieh Razzaghi (CHOP / University of Pennsylvania), a clinical informatics expert whose prior work includes variable-level metadata repository design, OMOP CDM implementation, and OHDSI research infrastructure. The clinical knowledge engineering approach — shared variable library, condition modules as organized configurations, Use Case Specifications as operational execution objects — reflects her input directly.</w:t>
+      </w:r>
+    </w:p>
+    <w:p>
+      <w:pPr>
+        <w:spacing w:after="100"/>
+      </w:pPr>
+      <w:r>
+        <w:t>Condition modules are the mechanism by which the platform extends to new clinical domains. Each condition module is a self-contained configuration artifact that defines the variables, use cases, thresholds, and terminology value sets for a condition. The diabetes module is the first. Hypertension and heart failure are scoped as subsequent modules. Condition modules are designed to be authored by clinical knowledge engineering contributors without touching engine code, and to serve simultaneously as technical artifacts, governance deliverables, and fundable contributions that condition-specific philanthropic funders can support and attribute.</w:t>
+      </w:r>
+    </w:p>
+    <w:p>
+      <w:pPr>
+        <w:spacing w:after="100"/>
+      </w:pPr>
+      <w:r>
+        <w:t>The methodology and all platform assets are being released under an open-source framework (MIT license). Companion documents include the Architecture Specification (canonical object model), the Technical Specification (check registry and scoring model), and the Device Data Model and Readiness Extension (device-specific implementation).</w:t>
       </w:r>
     </w:p>
     <w:sectPr>
-      <w:pgSz w:w="12240" w:h="15840" w:orient="portrait"/>
+      <w:pgSz w:w="12240" w:h="15840"/>
       <w:pgMar w:top="1440" w:right="1440" w:bottom="1080" w:left="1440" w:header="708" w:footer="708" w:gutter="0"/>
-      <w:pgNumType/>
+      <w:cols w:space="720"/>
       <w:docGrid w:linePitch="360"/>
     </w:sectPr>
   </w:body>
 </w:document>
 </file>
 
-<file path=word/comments.xml><?xml version="1.0" encoding="utf-8"?>
-<w:comments xmlns:cx="http://schemas.microsoft.com/office/drawing/2014/chartex" xmlns:cx1="http://schemas.microsoft.com/office/drawing/2015/9/8/chartex" xmlns:cx2="http://schemas.microsoft.com/office/drawing/2015/10/21/chartex" xmlns:cx3="http://schemas.microsoft.com/office/drawing/2016/5/9/chartex" xmlns:cx4="http://schemas.microsoft.com/office/drawing/2016/5/10/chartex" xmlns:cx5="http://schemas.microsoft.com/office/drawing/2016/5/11/chartex" xmlns:cx6="http://schemas.microsoft.com/office/drawing/2016/5/12/chartex" xmlns:cx7="http://schemas.microsoft.com/office/drawing/2016/5/13/chartex" xmlns:cx8="http://schemas.microsoft.com/office/drawing/2016/5/14/chartex" xmlns:mc="http://schemas.openxmlformats.org/markup-compatibility/2006" xmlns:aink="http://schemas.microsoft.com/office/drawing/2016/ink" xmlns:am3d="http://schemas.microsoft.com/office/drawing/2017/model3d" xmlns:o="urn:schemas-microsoft-com:office:office" xmlns:r="http://schemas.openxmlformats.org/officeDocument/2006/relationships" xmlns:m="http://schemas.openxmlformats.org/officeDocument/2006/math" xmlns:v="urn:schemas-microsoft-com:vml" xmlns:wp14="http://schemas.microsoft.com/office/word/2010/wordprocessingDrawing" xmlns:wp="http://schemas.openxmlformats.org/drawingml/2006/wordprocessingDrawing" xmlns:w10="urn:schemas-microsoft-com:office:word" xmlns:w="http://schemas.openxmlformats.org/wordprocessingml/2006/main" xmlns:w14="http://schemas.microsoft.com/office/word/2010/wordml" xmlns:w15="http://schemas.microsoft.com/office/word/2012/wordml" xmlns:w16cex="http://schemas.microsoft.com/office/word/2018/wordml/cex" xmlns:w16cid="http://schemas.microsoft.com/office/word/2016/wordml/cid" xmlns:w16="http://schemas.microsoft.com/office/word/2018/wordml" xmlns:w16sdtdh="http://schemas.microsoft.com/office/word/2020/wordml/sdtdatahash" xmlns:w16se="http://schemas.microsoft.com/office/word/2015/wordml/symex" xmlns:wpg="http://schemas.microsoft.com/office/word/2010/wordprocessingGroup" xmlns:wpi="http://schemas.microsoft.com/office/word/2010/wordprocessingInk" xmlns:wne="http://schemas.microsoft.com/office/word/2006/wordml" xmlns:wps="http://schemas.microsoft.com/office/word/2010/wordprocessingShape"/>
-</file>
-
-<file path=word/endnotes.xml><?xml version="1.0" encoding="utf-8"?>
-<w:endnotes xmlns:wpc="http://schemas.microsoft.com/office/word/2010/wordprocessingCanvas" xmlns:mc="http://schemas.openxmlformats.org/markup-compatibility/2006" xmlns:o="urn:schemas-microsoft-com:office:office" xmlns:r="http://schemas.openxmlformats.org/officeDocument/2006/relationships" xmlns:m="http://schemas.openxmlformats.org/officeDocument/2006/math" xmlns:v="urn:schemas-microsoft-com:vml" xmlns:wp14="http://schemas.microsoft.com/office/word/2010/wordprocessingDrawing" xmlns:wp="http://schemas.openxmlformats.org/drawingml/2006/wordprocessingDrawing" xmlns:w10="urn:schemas-microsoft-com:office:word" xmlns:w="http://schemas.openxmlformats.org/wordprocessingml/2006/main" xmlns:w14="http://schemas.microsoft.com/office/word/2010/wordml" xmlns:w15="http://schemas.microsoft.com/office/word/2012/wordml" xmlns:wpg="http://schemas.microsoft.com/office/word/2010/wordprocessingGroup" xmlns:wpi="http://schemas.microsoft.com/office/word/2010/wordprocessingInk" xmlns:wne="http://schemas.microsoft.com/office/word/2006/wordml" xmlns:wps="http://schemas.microsoft.com/office/word/2010/wordprocessingShape" mc:Ignorable="w14 w15 wp14">
-  <w:endnote w:type="separator" w:id="-1">
-    <w:p>
-      <w:pPr>
-        <w:spacing w:after="0" w:line="240" w:lineRule="auto"/>
-      </w:pPr>
-      <w:r>
-        <w:rPr>
-          <w:rStyle w:val="EndnoteReference"/>
-        </w:rPr>
-        <w:endnoteRef/>
-      </w:r>
-      <w:r>
-        <w:separator/>
-      </w:r>
-    </w:p>
-  </w:endnote>
-  <w:endnote w:type="continuationSeparator" w:id="0">
-    <w:p>
-      <w:pPr>
-        <w:spacing w:after="0" w:line="240" w:lineRule="auto"/>
-      </w:pPr>
-      <w:r>
-        <w:rPr>
-          <w:rStyle w:val="EndnoteReference"/>
-        </w:rPr>
-        <w:endnoteRef/>
-      </w:r>
-      <w:r>
-        <w:continuationSeparator/>
-      </w:r>
-    </w:p>
-  </w:endnote>
-</w:endnotes>
-</file>
-
-<file path=word/footnotes.xml><?xml version="1.0" encoding="utf-8"?>
-<w:footnotes xmlns:wpc="http://schemas.microsoft.com/office/word/2010/wordprocessingCanvas" xmlns:mc="http://schemas.openxmlformats.org/markup-compatibility/2006" xmlns:o="urn:schemas-microsoft-com:office:office" xmlns:r="http://schemas.openxmlformats.org/officeDocument/2006/relationships" xmlns:m="http://schemas.openxmlformats.org/officeDocument/2006/math" xmlns:v="urn:schemas-microsoft-com:vml" xmlns:wp14="http://schemas.microsoft.com/office/word/2010/wordprocessingDrawing" xmlns:wp="http://schemas.openxmlformats.org/drawingml/2006/wordprocessingDrawing" xmlns:w10="urn:schemas-microsoft-com:office:word" xmlns:w="http://schemas.openxmlformats.org/wordprocessingml/2006/main" xmlns:w14="http://schemas.microsoft.com/office/word/2010/wordml" xmlns:w15="http://schemas.microsoft.com/office/word/2012/wordml" xmlns:wpg="http://schemas.microsoft.com/office/word/2010/wordprocessingGroup" xmlns:wpi="http://schemas.microsoft.com/office/word/2010/wordprocessingInk" xmlns:wne="http://schemas.microsoft.com/office/word/2006/wordml" xmlns:wps="http://schemas.microsoft.com/office/word/2010/wordprocessingShape" mc:Ignorable="w14 w15 wp14">
-  <w:footnote w:type="separator" w:id="-1">
-    <w:p>
-      <w:pPr>
-        <w:spacing w:after="0" w:line="240" w:lineRule="auto"/>
-      </w:pPr>
-      <w:r>
-        <w:rPr>
-          <w:rStyle w:val="FootnoteReference"/>
-        </w:rPr>
-        <w:footnoteRef/>
-      </w:r>
-      <w:r>
-        <w:separator/>
-      </w:r>
-    </w:p>
-  </w:footnote>
-  <w:footnote w:type="continuationSeparator" w:id="0">
-    <w:p>
-      <w:pPr>
-        <w:spacing w:after="0" w:line="240" w:lineRule="auto"/>
-      </w:pPr>
-      <w:r>
-        <w:rPr>
-          <w:rStyle w:val="FootnoteReference"/>
-        </w:rPr>
-        <w:footnoteRef/>
-      </w:r>
-      <w:r>
-        <w:continuationSeparator/>
-      </w:r>
-    </w:p>
-  </w:footnote>
-</w:footnotes>
-</file>
-
 <file path=word/numbering.xml><?xml version="1.0" encoding="utf-8"?>
-<w:numbering xmlns:wpc="http://schemas.microsoft.com/office/word/2010/wordprocessingCanvas" xmlns:mc="http://schemas.openxmlformats.org/markup-compatibility/2006" xmlns:o="urn:schemas-microsoft-com:office:office" xmlns:r="http://schemas.openxmlformats.org/officeDocument/2006/relationships" xmlns:m="http://schemas.openxmlformats.org/officeDocument/2006/math" xmlns:v="urn:schemas-microsoft-com:vml" xmlns:wp14="http://schemas.microsoft.com/office/word/2010/wordprocessingDrawing" xmlns:wp="http://schemas.openxmlformats.org/drawingml/2006/wordprocessingDrawing" xmlns:w10="urn:schemas-microsoft-com:office:word" xmlns:w="http://schemas.openxmlformats.org/wordprocessingml/2006/main" xmlns:w14="http://schemas.microsoft.com/office/word/2010/wordml" xmlns:w15="http://schemas.microsoft.com/office/word/2012/wordml" xmlns:wpg="http://schemas.microsoft.com/office/word/2010/wordprocessingGroup" xmlns:wpi="http://schemas.microsoft.com/office/word/2010/wordprocessingInk" xmlns:wne="http://schemas.microsoft.com/office/word/2006/wordml" xmlns:wps="http://schemas.microsoft.com/office/word/2010/wordprocessingShape" mc:Ignorable="w14 w15 wp14">
+<w:numbering xmlns:wpc="http://schemas.microsoft.com/office/word/2010/wordprocessingCanvas" xmlns:cx="http://schemas.microsoft.com/office/drawing/2014/chartex" xmlns:cx1="http://schemas.microsoft.com/office/drawing/2015/9/8/chartex" xmlns:cx2="http://schemas.microsoft.com/office/drawing/2015/10/21/chartex" xmlns:cx3="http://schemas.microsoft.com/office/drawing/2016/5/9/chartex" xmlns:cx4="http://schemas.microsoft.com/office/drawing/2016/5/10/chartex" xmlns:cx5="http://schemas.microsoft.com/office/drawing/2016/5/11/chartex" xmlns:cx6="http://schemas.microsoft.com/office/drawing/2016/5/12/chartex" xmlns:cx7="http://schemas.microsoft.com/office/drawing/2016/5/13/chartex" xmlns:cx8="http://schemas.microsoft.com/office/drawing/2016/5/14/chartex" xmlns:mc="http://schemas.openxmlformats.org/markup-compatibility/2006" xmlns:aink="http://schemas.microsoft.com/office/drawing/2016/ink" xmlns:am3d="http://schemas.microsoft.com/office/drawing/2017/model3d" xmlns:o="urn:schemas-microsoft-com:office:office" xmlns:oel="http://schemas.microsoft.com/office/2019/extlst" xmlns:r="http://schemas.openxmlformats.org/officeDocument/2006/relationships" xmlns:m="http://schemas.openxmlformats.org/officeDocument/2006/math" xmlns:v="urn:schemas-microsoft-com:vml" xmlns:wp14="http://schemas.microsoft.com/office/word/2010/wordprocessingDrawing" xmlns:wp="http://schemas.openxmlformats.org/drawingml/2006/wordprocessingDrawing" xmlns:w10="urn:schemas-microsoft-com:office:word" xmlns:w="http://schemas.openxmlformats.org/wordprocessingml/2006/main" xmlns:w14="http://schemas.microsoft.com/office/word/2010/wordml" xmlns:w15="http://schemas.microsoft.com/office/word/2012/wordml" xmlns:w16cex="http://schemas.microsoft.com/office/word/2018/wordml/cex" xmlns:w16cid="http://schemas.microsoft.com/office/word/2016/wordml/cid" xmlns:w16="http://schemas.microsoft.com/office/word/2018/wordml" xmlns:w16du="http://schemas.microsoft.com/office/word/2023/wordml/word16du" xmlns:w16sdtdh="http://schemas.microsoft.com/office/word/2020/wordml/sdtdatahash" xmlns:w16sdtfl="http://schemas.microsoft.com/office/word/2024/wordml/sdtformatlock" xmlns:w16se="http://schemas.microsoft.com/office/word/2015/wordml/symex" xmlns:wpg="http://schemas.microsoft.com/office/word/2010/wordprocessingGroup" xmlns:wpi="http://schemas.microsoft.com/office/word/2010/wordprocessingInk" xmlns:wne="http://schemas.microsoft.com/office/word/2006/wordml" xmlns:wps="http://schemas.microsoft.com/office/word/2010/wordprocessingShape" mc:Ignorable="w14 w15 w16se w16cid w16 w16cex w16sdtdh w16sdtfl w16du wp14">
+  <w:abstractNum w:abstractNumId="0" w15:restartNumberingAfterBreak="0">
+    <w:nsid w:val="04F13CA7"/>
+    <w:multiLevelType w:val="hybridMultilevel"/>
+    <w:tmpl w:val="451CBC14"/>
+    <w:lvl w:ilvl="0" w:tplc="01AA1F54">
+      <w:start w:val="1"/>
+      <w:numFmt w:val="decimal"/>
+      <w:lvlText w:val="%1."/>
+      <w:lvlJc w:val="left"/>
+      <w:pPr>
+        <w:spacing w:after="60"/>
+        <w:ind w:left="600" w:hanging="300"/>
+      </w:pPr>
+    </w:lvl>
+    <w:lvl w:ilvl="1" w:tplc="5E6CCB8E">
+      <w:numFmt w:val="decimal"/>
+      <w:lvlText w:val=""/>
+      <w:lvlJc w:val="left"/>
+    </w:lvl>
+    <w:lvl w:ilvl="2" w:tplc="875C35CC">
+      <w:numFmt w:val="decimal"/>
+      <w:lvlText w:val=""/>
+      <w:lvlJc w:val="left"/>
+    </w:lvl>
+    <w:lvl w:ilvl="3" w:tplc="1D72173A">
+      <w:numFmt w:val="decimal"/>
+      <w:lvlText w:val=""/>
+      <w:lvlJc w:val="left"/>
+    </w:lvl>
+    <w:lvl w:ilvl="4" w:tplc="6192717C">
+      <w:numFmt w:val="decimal"/>
+      <w:lvlText w:val=""/>
+      <w:lvlJc w:val="left"/>
+    </w:lvl>
+    <w:lvl w:ilvl="5" w:tplc="028AB6D8">
+      <w:numFmt w:val="decimal"/>
+      <w:lvlText w:val=""/>
+      <w:lvlJc w:val="left"/>
+    </w:lvl>
+    <w:lvl w:ilvl="6" w:tplc="FA30A25E">
+      <w:numFmt w:val="decimal"/>
+      <w:lvlText w:val=""/>
+      <w:lvlJc w:val="left"/>
+    </w:lvl>
+    <w:lvl w:ilvl="7" w:tplc="71126100">
+      <w:numFmt w:val="decimal"/>
+      <w:lvlText w:val=""/>
+      <w:lvlJc w:val="left"/>
+    </w:lvl>
+    <w:lvl w:ilvl="8" w:tplc="D9F065C6">
+      <w:numFmt w:val="decimal"/>
+      <w:lvlText w:val=""/>
+      <w:lvlJc w:val="left"/>
+    </w:lvl>
+  </w:abstractNum>
   <w:abstractNum w:abstractNumId="1" w15:restartNumberingAfterBreak="0">
+    <w:nsid w:val="0F4040E6"/>
     <w:multiLevelType w:val="hybridMultilevel"/>
-    <w:lvl w:ilvl="0" w15:tentative="1">
+    <w:tmpl w:val="D85CF86C"/>
+    <w:lvl w:ilvl="0" w:tplc="D3645492">
+      <w:start w:val="1"/>
+      <w:numFmt w:val="bullet"/>
+      <w:lvlText w:val="•"/>
+      <w:lvlJc w:val="left"/>
+      <w:pPr>
+        <w:spacing w:after="60"/>
+        <w:ind w:left="600" w:hanging="300"/>
+      </w:pPr>
+    </w:lvl>
+    <w:lvl w:ilvl="1" w:tplc="FB6265FE">
+      <w:numFmt w:val="decimal"/>
+      <w:lvlText w:val=""/>
+      <w:lvlJc w:val="left"/>
+    </w:lvl>
+    <w:lvl w:ilvl="2" w:tplc="2728B0B6">
+      <w:numFmt w:val="decimal"/>
+      <w:lvlText w:val=""/>
+      <w:lvlJc w:val="left"/>
+    </w:lvl>
+    <w:lvl w:ilvl="3" w:tplc="E7147458">
+      <w:numFmt w:val="decimal"/>
+      <w:lvlText w:val=""/>
+      <w:lvlJc w:val="left"/>
+    </w:lvl>
+    <w:lvl w:ilvl="4" w:tplc="AE3A8C78">
+      <w:numFmt w:val="decimal"/>
+      <w:lvlText w:val=""/>
+      <w:lvlJc w:val="left"/>
+    </w:lvl>
+    <w:lvl w:ilvl="5" w:tplc="439C3A28">
+      <w:numFmt w:val="decimal"/>
+      <w:lvlText w:val=""/>
+      <w:lvlJc w:val="left"/>
+    </w:lvl>
+    <w:lvl w:ilvl="6" w:tplc="9740D7C4">
+      <w:numFmt w:val="decimal"/>
+      <w:lvlText w:val=""/>
+      <w:lvlJc w:val="left"/>
+    </w:lvl>
+    <w:lvl w:ilvl="7" w:tplc="FD0EA718">
+      <w:numFmt w:val="decimal"/>
+      <w:lvlText w:val=""/>
+      <w:lvlJc w:val="left"/>
+    </w:lvl>
+    <w:lvl w:ilvl="8" w:tplc="AEC439F8">
+      <w:numFmt w:val="decimal"/>
+      <w:lvlText w:val=""/>
+      <w:lvlJc w:val="left"/>
+    </w:lvl>
+  </w:abstractNum>
+  <w:abstractNum w:abstractNumId="2" w15:restartNumberingAfterBreak="0">
+    <w:nsid w:val="26C20B61"/>
+    <w:multiLevelType w:val="hybridMultilevel"/>
+    <w:tmpl w:val="784C9D84"/>
+    <w:lvl w:ilvl="0" w:tplc="80269830">
+      <w:start w:val="1"/>
+      <w:numFmt w:val="bullet"/>
+      <w:lvlText w:val="•"/>
+      <w:lvlJc w:val="left"/>
+      <w:pPr>
+        <w:spacing w:after="60"/>
+        <w:ind w:left="600" w:hanging="300"/>
+      </w:pPr>
+    </w:lvl>
+    <w:lvl w:ilvl="1" w:tplc="EA463E20">
+      <w:numFmt w:val="decimal"/>
+      <w:lvlText w:val=""/>
+      <w:lvlJc w:val="left"/>
+    </w:lvl>
+    <w:lvl w:ilvl="2" w:tplc="C4A0BF98">
+      <w:numFmt w:val="decimal"/>
+      <w:lvlText w:val=""/>
+      <w:lvlJc w:val="left"/>
+    </w:lvl>
+    <w:lvl w:ilvl="3" w:tplc="BA6099F6">
+      <w:numFmt w:val="decimal"/>
+      <w:lvlText w:val=""/>
+      <w:lvlJc w:val="left"/>
+    </w:lvl>
+    <w:lvl w:ilvl="4" w:tplc="FA6809AE">
+      <w:numFmt w:val="decimal"/>
+      <w:lvlText w:val=""/>
+      <w:lvlJc w:val="left"/>
+    </w:lvl>
+    <w:lvl w:ilvl="5" w:tplc="9D94AEEA">
+      <w:numFmt w:val="decimal"/>
+      <w:lvlText w:val=""/>
+      <w:lvlJc w:val="left"/>
+    </w:lvl>
+    <w:lvl w:ilvl="6" w:tplc="F2A64F5E">
+      <w:numFmt w:val="decimal"/>
+      <w:lvlText w:val=""/>
+      <w:lvlJc w:val="left"/>
+    </w:lvl>
+    <w:lvl w:ilvl="7" w:tplc="4AF8740C">
+      <w:numFmt w:val="decimal"/>
+      <w:lvlText w:val=""/>
+      <w:lvlJc w:val="left"/>
+    </w:lvl>
+    <w:lvl w:ilvl="8" w:tplc="57EC7F50">
+      <w:numFmt w:val="decimal"/>
+      <w:lvlText w:val=""/>
+      <w:lvlJc w:val="left"/>
+    </w:lvl>
+  </w:abstractNum>
+  <w:abstractNum w:abstractNumId="3" w15:restartNumberingAfterBreak="0">
+    <w:nsid w:val="311D62E9"/>
+    <w:multiLevelType w:val="hybridMultilevel"/>
+    <w:tmpl w:val="C6229396"/>
+    <w:lvl w:ilvl="0" w:tplc="83E09A06">
       <w:start w:val="1"/>
       <w:numFmt w:val="bullet"/>
       <w:lvlText w:val="●"/>
@@ -2535,7 +2818,7 @@
         <w:ind w:left="720" w:hanging="360"/>
       </w:pPr>
     </w:lvl>
-    <w:lvl w:ilvl="1" w15:tentative="1">
+    <w:lvl w:ilvl="1" w:tplc="462464D8">
       <w:start w:val="1"/>
       <w:numFmt w:val="bullet"/>
       <w:lvlText w:val="○"/>
@@ -2544,7 +2827,7 @@
         <w:ind w:left="1440" w:hanging="360"/>
       </w:pPr>
     </w:lvl>
-    <w:lvl w:ilvl="2" w15:tentative="1">
+    <w:lvl w:ilvl="2" w:tplc="436CE9AC">
       <w:start w:val="1"/>
       <w:numFmt w:val="bullet"/>
       <w:lvlText w:val="■"/>
@@ -2553,7 +2836,7 @@
         <w:ind w:left="2160" w:hanging="360"/>
       </w:pPr>
     </w:lvl>
-    <w:lvl w:ilvl="3" w15:tentative="1">
+    <w:lvl w:ilvl="3" w:tplc="00FACAEC">
       <w:start w:val="1"/>
       <w:numFmt w:val="bullet"/>
       <w:lvlText w:val="●"/>
@@ -2562,7 +2845,7 @@
         <w:ind w:left="2880" w:hanging="360"/>
       </w:pPr>
     </w:lvl>
-    <w:lvl w:ilvl="4" w15:tentative="1">
+    <w:lvl w:ilvl="4" w:tplc="6BA04068">
       <w:start w:val="1"/>
       <w:numFmt w:val="bullet"/>
       <w:lvlText w:val="○"/>
@@ -2571,7 +2854,7 @@
         <w:ind w:left="3600" w:hanging="360"/>
       </w:pPr>
     </w:lvl>
-    <w:lvl w:ilvl="5" w15:tentative="1">
+    <w:lvl w:ilvl="5" w:tplc="4CB2D62A">
       <w:start w:val="1"/>
       <w:numFmt w:val="bullet"/>
       <w:lvlText w:val="■"/>
@@ -2580,7 +2863,7 @@
         <w:ind w:left="4320" w:hanging="360"/>
       </w:pPr>
     </w:lvl>
-    <w:lvl w:ilvl="6" w15:tentative="1">
+    <w:lvl w:ilvl="6" w:tplc="8F1CA6C6">
       <w:start w:val="1"/>
       <w:numFmt w:val="bullet"/>
       <w:lvlText w:val="●"/>
@@ -2589,7 +2872,7 @@
         <w:ind w:left="5040" w:hanging="360"/>
       </w:pPr>
     </w:lvl>
-    <w:lvl w:ilvl="7" w15:tentative="1">
+    <w:lvl w:ilvl="7" w:tplc="7940315C">
       <w:start w:val="1"/>
       <w:numFmt w:val="bullet"/>
       <w:lvlText w:val="●"/>
@@ -2598,7 +2881,7 @@
         <w:ind w:left="5760" w:hanging="360"/>
       </w:pPr>
     </w:lvl>
-    <w:lvl w:ilvl="8" w15:tentative="1">
+    <w:lvl w:ilvl="8" w:tplc="DCD226AE">
       <w:start w:val="1"/>
       <w:numFmt w:val="bullet"/>
       <w:lvlText w:val="●"/>
@@ -2608,9 +2891,11 @@
       </w:pPr>
     </w:lvl>
   </w:abstractNum>
-  <w:abstractNum w:abstractNumId="2" w15:restartNumberingAfterBreak="0">
+  <w:abstractNum w:abstractNumId="4" w15:restartNumberingAfterBreak="0">
+    <w:nsid w:val="31C34A7D"/>
     <w:multiLevelType w:val="hybridMultilevel"/>
-    <w:lvl w:ilvl="0" w15:tentative="1">
+    <w:tmpl w:val="D7C6871E"/>
+    <w:lvl w:ilvl="0" w:tplc="E8849B24">
       <w:start w:val="1"/>
       <w:numFmt w:val="bullet"/>
       <w:lvlText w:val="•"/>
@@ -2620,10 +2905,52 @@
         <w:ind w:left="600" w:hanging="300"/>
       </w:pPr>
     </w:lvl>
+    <w:lvl w:ilvl="1" w:tplc="453ED4B2">
+      <w:numFmt w:val="decimal"/>
+      <w:lvlText w:val=""/>
+      <w:lvlJc w:val="left"/>
+    </w:lvl>
+    <w:lvl w:ilvl="2" w:tplc="3F308A20">
+      <w:numFmt w:val="decimal"/>
+      <w:lvlText w:val=""/>
+      <w:lvlJc w:val="left"/>
+    </w:lvl>
+    <w:lvl w:ilvl="3" w:tplc="8CA0591C">
+      <w:numFmt w:val="decimal"/>
+      <w:lvlText w:val=""/>
+      <w:lvlJc w:val="left"/>
+    </w:lvl>
+    <w:lvl w:ilvl="4" w:tplc="F2869634">
+      <w:numFmt w:val="decimal"/>
+      <w:lvlText w:val=""/>
+      <w:lvlJc w:val="left"/>
+    </w:lvl>
+    <w:lvl w:ilvl="5" w:tplc="F4E831F4">
+      <w:numFmt w:val="decimal"/>
+      <w:lvlText w:val=""/>
+      <w:lvlJc w:val="left"/>
+    </w:lvl>
+    <w:lvl w:ilvl="6" w:tplc="E7CE6176">
+      <w:numFmt w:val="decimal"/>
+      <w:lvlText w:val=""/>
+      <w:lvlJc w:val="left"/>
+    </w:lvl>
+    <w:lvl w:ilvl="7" w:tplc="58644A32">
+      <w:numFmt w:val="decimal"/>
+      <w:lvlText w:val=""/>
+      <w:lvlJc w:val="left"/>
+    </w:lvl>
+    <w:lvl w:ilvl="8" w:tplc="B240E774">
+      <w:numFmt w:val="decimal"/>
+      <w:lvlText w:val=""/>
+      <w:lvlJc w:val="left"/>
+    </w:lvl>
   </w:abstractNum>
-  <w:abstractNum w:abstractNumId="3" w15:restartNumberingAfterBreak="0">
+  <w:abstractNum w:abstractNumId="5" w15:restartNumberingAfterBreak="0">
+    <w:nsid w:val="48CF779A"/>
     <w:multiLevelType w:val="hybridMultilevel"/>
-    <w:lvl w:ilvl="0" w15:tentative="1">
+    <w:tmpl w:val="596E518A"/>
+    <w:lvl w:ilvl="0" w:tplc="992A8FAC">
       <w:start w:val="1"/>
       <w:numFmt w:val="bullet"/>
       <w:lvlText w:val="•"/>
@@ -2633,10 +2960,52 @@
         <w:ind w:left="600" w:hanging="300"/>
       </w:pPr>
     </w:lvl>
+    <w:lvl w:ilvl="1" w:tplc="2AA8BA84">
+      <w:numFmt w:val="decimal"/>
+      <w:lvlText w:val=""/>
+      <w:lvlJc w:val="left"/>
+    </w:lvl>
+    <w:lvl w:ilvl="2" w:tplc="CA105E7A">
+      <w:numFmt w:val="decimal"/>
+      <w:lvlText w:val=""/>
+      <w:lvlJc w:val="left"/>
+    </w:lvl>
+    <w:lvl w:ilvl="3" w:tplc="CEA4F4E6">
+      <w:numFmt w:val="decimal"/>
+      <w:lvlText w:val=""/>
+      <w:lvlJc w:val="left"/>
+    </w:lvl>
+    <w:lvl w:ilvl="4" w:tplc="DB221FAE">
+      <w:numFmt w:val="decimal"/>
+      <w:lvlText w:val=""/>
+      <w:lvlJc w:val="left"/>
+    </w:lvl>
+    <w:lvl w:ilvl="5" w:tplc="D200CF5A">
+      <w:numFmt w:val="decimal"/>
+      <w:lvlText w:val=""/>
+      <w:lvlJc w:val="left"/>
+    </w:lvl>
+    <w:lvl w:ilvl="6" w:tplc="685AA554">
+      <w:numFmt w:val="decimal"/>
+      <w:lvlText w:val=""/>
+      <w:lvlJc w:val="left"/>
+    </w:lvl>
+    <w:lvl w:ilvl="7" w:tplc="0E0AFA8A">
+      <w:numFmt w:val="decimal"/>
+      <w:lvlText w:val=""/>
+      <w:lvlJc w:val="left"/>
+    </w:lvl>
+    <w:lvl w:ilvl="8" w:tplc="22B851B4">
+      <w:numFmt w:val="decimal"/>
+      <w:lvlText w:val=""/>
+      <w:lvlJc w:val="left"/>
+    </w:lvl>
   </w:abstractNum>
-  <w:abstractNum w:abstractNumId="4" w15:restartNumberingAfterBreak="0">
+  <w:abstractNum w:abstractNumId="6" w15:restartNumberingAfterBreak="0">
+    <w:nsid w:val="55DA502E"/>
     <w:multiLevelType w:val="hybridMultilevel"/>
-    <w:lvl w:ilvl="0" w15:tentative="1">
+    <w:tmpl w:val="745433C2"/>
+    <w:lvl w:ilvl="0" w:tplc="F00C9678">
       <w:start w:val="1"/>
       <w:numFmt w:val="bullet"/>
       <w:lvlText w:val="•"/>
@@ -2646,10 +3015,52 @@
         <w:ind w:left="600" w:hanging="300"/>
       </w:pPr>
     </w:lvl>
+    <w:lvl w:ilvl="1" w:tplc="F2F064B4">
+      <w:numFmt w:val="decimal"/>
+      <w:lvlText w:val=""/>
+      <w:lvlJc w:val="left"/>
+    </w:lvl>
+    <w:lvl w:ilvl="2" w:tplc="BB764E08">
+      <w:numFmt w:val="decimal"/>
+      <w:lvlText w:val=""/>
+      <w:lvlJc w:val="left"/>
+    </w:lvl>
+    <w:lvl w:ilvl="3" w:tplc="125CBC4E">
+      <w:numFmt w:val="decimal"/>
+      <w:lvlText w:val=""/>
+      <w:lvlJc w:val="left"/>
+    </w:lvl>
+    <w:lvl w:ilvl="4" w:tplc="71D69570">
+      <w:numFmt w:val="decimal"/>
+      <w:lvlText w:val=""/>
+      <w:lvlJc w:val="left"/>
+    </w:lvl>
+    <w:lvl w:ilvl="5" w:tplc="8F9E1ED6">
+      <w:numFmt w:val="decimal"/>
+      <w:lvlText w:val=""/>
+      <w:lvlJc w:val="left"/>
+    </w:lvl>
+    <w:lvl w:ilvl="6" w:tplc="5B007D34">
+      <w:numFmt w:val="decimal"/>
+      <w:lvlText w:val=""/>
+      <w:lvlJc w:val="left"/>
+    </w:lvl>
+    <w:lvl w:ilvl="7" w:tplc="D1625BFE">
+      <w:numFmt w:val="decimal"/>
+      <w:lvlText w:val=""/>
+      <w:lvlJc w:val="left"/>
+    </w:lvl>
+    <w:lvl w:ilvl="8" w:tplc="8B42EE3A">
+      <w:numFmt w:val="decimal"/>
+      <w:lvlText w:val=""/>
+      <w:lvlJc w:val="left"/>
+    </w:lvl>
   </w:abstractNum>
-  <w:abstractNum w:abstractNumId="5" w15:restartNumberingAfterBreak="0">
+  <w:abstractNum w:abstractNumId="7" w15:restartNumberingAfterBreak="0">
+    <w:nsid w:val="605E4613"/>
     <w:multiLevelType w:val="hybridMultilevel"/>
-    <w:lvl w:ilvl="0" w15:tentative="1">
+    <w:tmpl w:val="0E66CDE2"/>
+    <w:lvl w:ilvl="0" w:tplc="D7B83910">
       <w:start w:val="1"/>
       <w:numFmt w:val="bullet"/>
       <w:lvlText w:val="•"/>
@@ -2659,10 +3070,52 @@
         <w:ind w:left="600" w:hanging="300"/>
       </w:pPr>
     </w:lvl>
+    <w:lvl w:ilvl="1" w:tplc="9652342A">
+      <w:numFmt w:val="decimal"/>
+      <w:lvlText w:val=""/>
+      <w:lvlJc w:val="left"/>
+    </w:lvl>
+    <w:lvl w:ilvl="2" w:tplc="BD8AEE40">
+      <w:numFmt w:val="decimal"/>
+      <w:lvlText w:val=""/>
+      <w:lvlJc w:val="left"/>
+    </w:lvl>
+    <w:lvl w:ilvl="3" w:tplc="AC8CE38A">
+      <w:numFmt w:val="decimal"/>
+      <w:lvlText w:val=""/>
+      <w:lvlJc w:val="left"/>
+    </w:lvl>
+    <w:lvl w:ilvl="4" w:tplc="E9CCC1CA">
+      <w:numFmt w:val="decimal"/>
+      <w:lvlText w:val=""/>
+      <w:lvlJc w:val="left"/>
+    </w:lvl>
+    <w:lvl w:ilvl="5" w:tplc="DB6C7934">
+      <w:numFmt w:val="decimal"/>
+      <w:lvlText w:val=""/>
+      <w:lvlJc w:val="left"/>
+    </w:lvl>
+    <w:lvl w:ilvl="6" w:tplc="463CFC72">
+      <w:numFmt w:val="decimal"/>
+      <w:lvlText w:val=""/>
+      <w:lvlJc w:val="left"/>
+    </w:lvl>
+    <w:lvl w:ilvl="7" w:tplc="413AD690">
+      <w:numFmt w:val="decimal"/>
+      <w:lvlText w:val=""/>
+      <w:lvlJc w:val="left"/>
+    </w:lvl>
+    <w:lvl w:ilvl="8" w:tplc="00A294E0">
+      <w:numFmt w:val="decimal"/>
+      <w:lvlText w:val=""/>
+      <w:lvlJc w:val="left"/>
+    </w:lvl>
   </w:abstractNum>
-  <w:abstractNum w:abstractNumId="6" w15:restartNumberingAfterBreak="0">
+  <w:abstractNum w:abstractNumId="8" w15:restartNumberingAfterBreak="0">
+    <w:nsid w:val="677073EA"/>
     <w:multiLevelType w:val="hybridMultilevel"/>
-    <w:lvl w:ilvl="0" w15:tentative="1">
+    <w:tmpl w:val="2FFAF214"/>
+    <w:lvl w:ilvl="0" w:tplc="9642D552">
       <w:start w:val="1"/>
       <w:numFmt w:val="bullet"/>
       <w:lvlText w:val="•"/>
@@ -2672,71 +3125,72 @@
         <w:ind w:left="600" w:hanging="300"/>
       </w:pPr>
     </w:lvl>
+    <w:lvl w:ilvl="1" w:tplc="4D52A6A2">
+      <w:numFmt w:val="decimal"/>
+      <w:lvlText w:val=""/>
+      <w:lvlJc w:val="left"/>
+    </w:lvl>
+    <w:lvl w:ilvl="2" w:tplc="4738816E">
+      <w:numFmt w:val="decimal"/>
+      <w:lvlText w:val=""/>
+      <w:lvlJc w:val="left"/>
+    </w:lvl>
+    <w:lvl w:ilvl="3" w:tplc="E9561030">
+      <w:numFmt w:val="decimal"/>
+      <w:lvlText w:val=""/>
+      <w:lvlJc w:val="left"/>
+    </w:lvl>
+    <w:lvl w:ilvl="4" w:tplc="5F7EE2C8">
+      <w:numFmt w:val="decimal"/>
+      <w:lvlText w:val=""/>
+      <w:lvlJc w:val="left"/>
+    </w:lvl>
+    <w:lvl w:ilvl="5" w:tplc="BC3A72CC">
+      <w:numFmt w:val="decimal"/>
+      <w:lvlText w:val=""/>
+      <w:lvlJc w:val="left"/>
+    </w:lvl>
+    <w:lvl w:ilvl="6" w:tplc="7CB482EE">
+      <w:numFmt w:val="decimal"/>
+      <w:lvlText w:val=""/>
+      <w:lvlJc w:val="left"/>
+    </w:lvl>
+    <w:lvl w:ilvl="7" w:tplc="55483118">
+      <w:numFmt w:val="decimal"/>
+      <w:lvlText w:val=""/>
+      <w:lvlJc w:val="left"/>
+    </w:lvl>
+    <w:lvl w:ilvl="8" w:tplc="F10C15AC">
+      <w:numFmt w:val="decimal"/>
+      <w:lvlText w:val=""/>
+      <w:lvlJc w:val="left"/>
+    </w:lvl>
   </w:abstractNum>
-  <w:abstractNum w:abstractNumId="7" w15:restartNumberingAfterBreak="0">
-    <w:multiLevelType w:val="hybridMultilevel"/>
-    <w:lvl w:ilvl="0" w15:tentative="1">
-      <w:start w:val="1"/>
-      <w:numFmt w:val="bullet"/>
-      <w:lvlText w:val="•"/>
-      <w:lvlJc w:val="left"/>
-      <w:pPr>
-        <w:spacing w:after="60"/>
-        <w:ind w:left="600" w:hanging="300"/>
-      </w:pPr>
-    </w:lvl>
-  </w:abstractNum>
-  <w:abstractNum w:abstractNumId="8" w15:restartNumberingAfterBreak="0">
-    <w:multiLevelType w:val="hybridMultilevel"/>
-    <w:lvl w:ilvl="0" w15:tentative="1">
-      <w:start w:val="1"/>
-      <w:numFmt w:val="bullet"/>
-      <w:lvlText w:val="•"/>
-      <w:lvlJc w:val="left"/>
-      <w:pPr>
-        <w:spacing w:after="60"/>
-        <w:ind w:left="600" w:hanging="300"/>
-      </w:pPr>
-    </w:lvl>
-  </w:abstractNum>
-  <w:abstractNum w:abstractNumId="9" w15:restartNumberingAfterBreak="0">
-    <w:multiLevelType w:val="hybridMultilevel"/>
-    <w:lvl w:ilvl="0" w15:tentative="1">
-      <w:start w:val="1"/>
-      <w:numFmt w:val="decimal"/>
-      <w:lvlText w:val="%1."/>
-      <w:lvlJc w:val="left"/>
-      <w:pPr>
-        <w:spacing w:after="60"/>
-        <w:ind w:left="600" w:hanging="300"/>
-      </w:pPr>
-    </w:lvl>
-  </w:abstractNum>
-  <w:num w:numId="1">
-    <w:abstractNumId w:val="1"/>
-    <w:lvlOverride w:ilvl="0">
-      <w:startOverride w:val="1"/>
-    </w:lvlOverride>
-  </w:num>
-  <w:num w:numId="2">
-    <w:abstractNumId w:val="2"/>
-    <w:lvlOverride w:ilvl="0">
-      <w:startOverride w:val="1"/>
-    </w:lvlOverride>
-  </w:num>
-  <w:num w:numId="3">
+  <w:num w:numId="1" w16cid:durableId="1514879097">
     <w:abstractNumId w:val="3"/>
     <w:lvlOverride w:ilvl="0">
       <w:startOverride w:val="1"/>
     </w:lvlOverride>
   </w:num>
-  <w:num w:numId="4">
+  <w:num w:numId="2" w16cid:durableId="2120906274">
+    <w:abstractNumId w:val="7"/>
+    <w:lvlOverride w:ilvl="0">
+      <w:startOverride w:val="1"/>
+    </w:lvlOverride>
+  </w:num>
+  <w:num w:numId="3" w16cid:durableId="1674332352">
+    <w:abstractNumId w:val="8"/>
+    <w:lvlOverride w:ilvl="0">
+      <w:startOverride w:val="1"/>
+    </w:lvlOverride>
+  </w:num>
+  <w:num w:numId="4" w16cid:durableId="1363167617">
     <w:abstractNumId w:val="4"/>
     <w:lvlOverride w:ilvl="0">
       <w:startOverride w:val="1"/>
     </w:lvlOverride>
   </w:num>
-  <w:num w:numId="5">
+  <w:num w:numId="5" w16cid:durableId="923952517">
     <w:abstractNumId w:val="5"/>
     <w:lvlOverride w:ilvl="0">
       <w:startOverride w:val="1"/>
@@ -2746,65 +3200,457 @@
 </file>
 
 <file path=word/styles.xml><?xml version="1.0" encoding="utf-8"?>
-<w:styles xmlns:mc="http://schemas.openxmlformats.org/markup-compatibility/2006" xmlns:r="http://schemas.openxmlformats.org/officeDocument/2006/relationships" xmlns:w="http://schemas.openxmlformats.org/wordprocessingml/2006/main" xmlns:w14="http://schemas.microsoft.com/office/word/2010/wordml" xmlns:w15="http://schemas.microsoft.com/office/word/2012/wordml" mc:Ignorable="w14 w15">
+<w:styles xmlns:mc="http://schemas.openxmlformats.org/markup-compatibility/2006" xmlns:r="http://schemas.openxmlformats.org/officeDocument/2006/relationships" xmlns:w="http://schemas.openxmlformats.org/wordprocessingml/2006/main" xmlns:w14="http://schemas.microsoft.com/office/word/2010/wordml" xmlns:w15="http://schemas.microsoft.com/office/word/2012/wordml" xmlns:w16cex="http://schemas.microsoft.com/office/word/2018/wordml/cex" xmlns:w16cid="http://schemas.microsoft.com/office/word/2016/wordml/cid" xmlns:w16="http://schemas.microsoft.com/office/word/2018/wordml" xmlns:w16du="http://schemas.microsoft.com/office/word/2023/wordml/word16du" xmlns:w16sdtdh="http://schemas.microsoft.com/office/word/2020/wordml/sdtdatahash" xmlns:w16sdtfl="http://schemas.microsoft.com/office/word/2024/wordml/sdtformatlock" xmlns:w16se="http://schemas.microsoft.com/office/word/2015/wordml/symex" mc:Ignorable="w14 w15 w16se w16cid w16 w16cex w16sdtdh w16sdtfl w16du">
   <w:docDefaults>
     <w:rPrDefault>
       <w:rPr>
-        <w:rFonts w:ascii="Arial" w:cs="Arial" w:eastAsia="Arial" w:hAnsi="Arial"/>
+        <w:rFonts w:ascii="Arial" w:eastAsia="Arial" w:hAnsi="Arial" w:cs="Arial"/>
         <w:sz w:val="22"/>
         <w:szCs w:val="22"/>
+        <w:lang w:val="en-US" w:eastAsia="en-US" w:bidi="ar-SA"/>
       </w:rPr>
     </w:rPrDefault>
     <w:pPrDefault/>
   </w:docDefaults>
-  <w:style w:type="paragraph" w:styleId="Title">
-    <w:name w:val="Title"/>
-    <w:basedOn w:val="Normal"/>
-    <w:next w:val="Normal"/>
+  <w:latentStyles w:defLockedState="0" w:defUIPriority="99" w:defSemiHidden="0" w:defUnhideWhenUsed="0" w:defQFormat="0" w:count="376">
+    <w:lsdException w:name="Normal" w:uiPriority="0" w:qFormat="1"/>
+    <w:lsdException w:name="heading 1" w:uiPriority="9" w:qFormat="1"/>
+    <w:lsdException w:name="heading 2" w:semiHidden="1" w:uiPriority="9" w:unhideWhenUsed="1" w:qFormat="1"/>
+    <w:lsdException w:name="heading 3" w:semiHidden="1" w:uiPriority="9" w:unhideWhenUsed="1" w:qFormat="1"/>
+    <w:lsdException w:name="heading 4" w:semiHidden="1" w:uiPriority="9" w:unhideWhenUsed="1" w:qFormat="1"/>
+    <w:lsdException w:name="heading 5" w:semiHidden="1" w:uiPriority="9" w:unhideWhenUsed="1" w:qFormat="1"/>
+    <w:lsdException w:name="heading 6" w:semiHidden="1" w:uiPriority="9" w:unhideWhenUsed="1" w:qFormat="1"/>
+    <w:lsdException w:name="heading 7" w:semiHidden="1" w:uiPriority="9" w:unhideWhenUsed="1" w:qFormat="1"/>
+    <w:lsdException w:name="heading 8" w:semiHidden="1" w:uiPriority="9" w:unhideWhenUsed="1" w:qFormat="1"/>
+    <w:lsdException w:name="heading 9" w:semiHidden="1" w:uiPriority="9" w:unhideWhenUsed="1" w:qFormat="1"/>
+    <w:lsdException w:name="index 1" w:semiHidden="1" w:unhideWhenUsed="1"/>
+    <w:lsdException w:name="index 2" w:semiHidden="1" w:unhideWhenUsed="1"/>
+    <w:lsdException w:name="index 3" w:semiHidden="1" w:unhideWhenUsed="1"/>
+    <w:lsdException w:name="index 4" w:semiHidden="1" w:unhideWhenUsed="1"/>
+    <w:lsdException w:name="index 5" w:semiHidden="1" w:unhideWhenUsed="1"/>
+    <w:lsdException w:name="index 6" w:semiHidden="1" w:unhideWhenUsed="1"/>
+    <w:lsdException w:name="index 7" w:semiHidden="1" w:unhideWhenUsed="1"/>
+    <w:lsdException w:name="index 8" w:semiHidden="1" w:unhideWhenUsed="1"/>
+    <w:lsdException w:name="index 9" w:semiHidden="1" w:unhideWhenUsed="1"/>
+    <w:lsdException w:name="toc 1" w:semiHidden="1" w:uiPriority="39" w:unhideWhenUsed="1"/>
+    <w:lsdException w:name="toc 2" w:semiHidden="1" w:uiPriority="39" w:unhideWhenUsed="1"/>
+    <w:lsdException w:name="toc 3" w:semiHidden="1" w:uiPriority="39" w:unhideWhenUsed="1"/>
+    <w:lsdException w:name="toc 4" w:semiHidden="1" w:uiPriority="39" w:unhideWhenUsed="1"/>
+    <w:lsdException w:name="toc 5" w:semiHidden="1" w:uiPriority="39" w:unhideWhenUsed="1"/>
+    <w:lsdException w:name="toc 6" w:semiHidden="1" w:uiPriority="39" w:unhideWhenUsed="1"/>
+    <w:lsdException w:name="toc 7" w:semiHidden="1" w:uiPriority="39" w:unhideWhenUsed="1"/>
+    <w:lsdException w:name="toc 8" w:semiHidden="1" w:uiPriority="39" w:unhideWhenUsed="1"/>
+    <w:lsdException w:name="toc 9" w:semiHidden="1" w:uiPriority="39" w:unhideWhenUsed="1"/>
+    <w:lsdException w:name="Normal Indent" w:semiHidden="1" w:unhideWhenUsed="1"/>
+    <w:lsdException w:name="footnote text" w:semiHidden="1" w:unhideWhenUsed="1"/>
+    <w:lsdException w:name="annotation text" w:semiHidden="1" w:unhideWhenUsed="1"/>
+    <w:lsdException w:name="header" w:semiHidden="1" w:unhideWhenUsed="1"/>
+    <w:lsdException w:name="footer" w:semiHidden="1" w:unhideWhenUsed="1"/>
+    <w:lsdException w:name="index heading" w:semiHidden="1" w:unhideWhenUsed="1"/>
+    <w:lsdException w:name="caption" w:semiHidden="1" w:uiPriority="35" w:unhideWhenUsed="1" w:qFormat="1"/>
+    <w:lsdException w:name="table of figures" w:semiHidden="1" w:unhideWhenUsed="1"/>
+    <w:lsdException w:name="envelope address" w:semiHidden="1" w:unhideWhenUsed="1"/>
+    <w:lsdException w:name="envelope return" w:semiHidden="1" w:unhideWhenUsed="1"/>
+    <w:lsdException w:name="footnote reference" w:semiHidden="1" w:unhideWhenUsed="1"/>
+    <w:lsdException w:name="annotation reference" w:semiHidden="1" w:unhideWhenUsed="1"/>
+    <w:lsdException w:name="line number" w:semiHidden="1" w:unhideWhenUsed="1"/>
+    <w:lsdException w:name="page number" w:semiHidden="1" w:unhideWhenUsed="1"/>
+    <w:lsdException w:name="endnote reference" w:semiHidden="1" w:unhideWhenUsed="1"/>
+    <w:lsdException w:name="endnote text" w:semiHidden="1" w:unhideWhenUsed="1"/>
+    <w:lsdException w:name="table of authorities" w:semiHidden="1" w:unhideWhenUsed="1"/>
+    <w:lsdException w:name="macro" w:semiHidden="1" w:unhideWhenUsed="1"/>
+    <w:lsdException w:name="toa heading" w:semiHidden="1" w:unhideWhenUsed="1"/>
+    <w:lsdException w:name="List" w:semiHidden="1" w:unhideWhenUsed="1"/>
+    <w:lsdException w:name="List Bullet" w:semiHidden="1" w:unhideWhenUsed="1"/>
+    <w:lsdException w:name="List Number" w:semiHidden="1" w:unhideWhenUsed="1"/>
+    <w:lsdException w:name="List 2" w:semiHidden="1" w:unhideWhenUsed="1"/>
+    <w:lsdException w:name="List 3" w:semiHidden="1" w:unhideWhenUsed="1"/>
+    <w:lsdException w:name="List 4" w:semiHidden="1" w:unhideWhenUsed="1"/>
+    <w:lsdException w:name="List 5" w:semiHidden="1" w:unhideWhenUsed="1"/>
+    <w:lsdException w:name="List Bullet 2" w:semiHidden="1" w:unhideWhenUsed="1"/>
+    <w:lsdException w:name="List Bullet 3" w:semiHidden="1" w:unhideWhenUsed="1"/>
+    <w:lsdException w:name="List Bullet 4" w:semiHidden="1" w:unhideWhenUsed="1"/>
+    <w:lsdException w:name="List Bullet 5" w:semiHidden="1" w:unhideWhenUsed="1"/>
+    <w:lsdException w:name="List Number 2" w:semiHidden="1" w:unhideWhenUsed="1"/>
+    <w:lsdException w:name="List Number 3" w:semiHidden="1" w:unhideWhenUsed="1"/>
+    <w:lsdException w:name="List Number 4" w:semiHidden="1" w:unhideWhenUsed="1"/>
+    <w:lsdException w:name="List Number 5" w:semiHidden="1" w:unhideWhenUsed="1"/>
+    <w:lsdException w:name="Title" w:uiPriority="10" w:qFormat="1"/>
+    <w:lsdException w:name="Closing" w:semiHidden="1" w:unhideWhenUsed="1"/>
+    <w:lsdException w:name="Signature" w:semiHidden="1" w:unhideWhenUsed="1"/>
+    <w:lsdException w:name="Default Paragraph Font" w:semiHidden="1" w:uiPriority="1" w:unhideWhenUsed="1"/>
+    <w:lsdException w:name="Body Text" w:semiHidden="1" w:unhideWhenUsed="1"/>
+    <w:lsdException w:name="Body Text Indent" w:semiHidden="1" w:unhideWhenUsed="1"/>
+    <w:lsdException w:name="List Continue" w:semiHidden="1" w:unhideWhenUsed="1"/>
+    <w:lsdException w:name="List Continue 2" w:semiHidden="1" w:unhideWhenUsed="1"/>
+    <w:lsdException w:name="List Continue 3" w:semiHidden="1" w:unhideWhenUsed="1"/>
+    <w:lsdException w:name="List Continue 4" w:semiHidden="1" w:unhideWhenUsed="1"/>
+    <w:lsdException w:name="List Continue 5" w:semiHidden="1" w:unhideWhenUsed="1"/>
+    <w:lsdException w:name="Message Header" w:semiHidden="1" w:unhideWhenUsed="1"/>
+    <w:lsdException w:name="Subtitle" w:uiPriority="11" w:qFormat="1"/>
+    <w:lsdException w:name="Salutation" w:semiHidden="1" w:unhideWhenUsed="1"/>
+    <w:lsdException w:name="Date" w:semiHidden="1" w:unhideWhenUsed="1"/>
+    <w:lsdException w:name="Body Text First Indent" w:semiHidden="1" w:unhideWhenUsed="1"/>
+    <w:lsdException w:name="Body Text First Indent 2" w:semiHidden="1" w:unhideWhenUsed="1"/>
+    <w:lsdException w:name="Note Heading" w:semiHidden="1" w:unhideWhenUsed="1"/>
+    <w:lsdException w:name="Body Text 2" w:semiHidden="1" w:unhideWhenUsed="1"/>
+    <w:lsdException w:name="Body Text 3" w:semiHidden="1" w:unhideWhenUsed="1"/>
+    <w:lsdException w:name="Body Text Indent 2" w:semiHidden="1" w:unhideWhenUsed="1"/>
+    <w:lsdException w:name="Body Text Indent 3" w:semiHidden="1" w:unhideWhenUsed="1"/>
+    <w:lsdException w:name="Block Text" w:semiHidden="1" w:unhideWhenUsed="1"/>
+    <w:lsdException w:name="Hyperlink" w:semiHidden="1" w:unhideWhenUsed="1"/>
+    <w:lsdException w:name="FollowedHyperlink" w:semiHidden="1" w:unhideWhenUsed="1"/>
+    <w:lsdException w:name="Strong" w:uiPriority="22" w:qFormat="1"/>
+    <w:lsdException w:name="Emphasis" w:uiPriority="20" w:qFormat="1"/>
+    <w:lsdException w:name="Document Map" w:semiHidden="1" w:unhideWhenUsed="1"/>
+    <w:lsdException w:name="Plain Text" w:semiHidden="1" w:unhideWhenUsed="1"/>
+    <w:lsdException w:name="E-mail Signature" w:semiHidden="1" w:unhideWhenUsed="1"/>
+    <w:lsdException w:name="HTML Top of Form" w:semiHidden="1" w:unhideWhenUsed="1"/>
+    <w:lsdException w:name="HTML Bottom of Form" w:semiHidden="1" w:unhideWhenUsed="1"/>
+    <w:lsdException w:name="Normal (Web)" w:semiHidden="1" w:unhideWhenUsed="1"/>
+    <w:lsdException w:name="HTML Acronym" w:semiHidden="1" w:unhideWhenUsed="1"/>
+    <w:lsdException w:name="HTML Address" w:semiHidden="1" w:unhideWhenUsed="1"/>
+    <w:lsdException w:name="HTML Cite" w:semiHidden="1" w:unhideWhenUsed="1"/>
+    <w:lsdException w:name="HTML Code" w:semiHidden="1" w:unhideWhenUsed="1"/>
+    <w:lsdException w:name="HTML Definition" w:semiHidden="1" w:unhideWhenUsed="1"/>
+    <w:lsdException w:name="HTML Keyboard" w:semiHidden="1" w:unhideWhenUsed="1"/>
+    <w:lsdException w:name="HTML Preformatted" w:semiHidden="1" w:unhideWhenUsed="1"/>
+    <w:lsdException w:name="HTML Sample" w:semiHidden="1" w:unhideWhenUsed="1"/>
+    <w:lsdException w:name="HTML Typewriter" w:semiHidden="1" w:unhideWhenUsed="1"/>
+    <w:lsdException w:name="HTML Variable" w:semiHidden="1" w:unhideWhenUsed="1"/>
+    <w:lsdException w:name="Normal Table" w:semiHidden="1" w:unhideWhenUsed="1"/>
+    <w:lsdException w:name="annotation subject" w:semiHidden="1" w:unhideWhenUsed="1"/>
+    <w:lsdException w:name="No List" w:semiHidden="1" w:unhideWhenUsed="1"/>
+    <w:lsdException w:name="Outline List 1" w:semiHidden="1" w:unhideWhenUsed="1"/>
+    <w:lsdException w:name="Outline List 2" w:semiHidden="1" w:unhideWhenUsed="1"/>
+    <w:lsdException w:name="Outline List 3" w:semiHidden="1" w:unhideWhenUsed="1"/>
+    <w:lsdException w:name="Table Simple 1" w:semiHidden="1" w:unhideWhenUsed="1"/>
+    <w:lsdException w:name="Table Simple 2" w:semiHidden="1" w:unhideWhenUsed="1"/>
+    <w:lsdException w:name="Table Simple 3" w:semiHidden="1" w:unhideWhenUsed="1"/>
+    <w:lsdException w:name="Table Classic 1" w:semiHidden="1" w:unhideWhenUsed="1"/>
+    <w:lsdException w:name="Table Classic 2" w:semiHidden="1" w:unhideWhenUsed="1"/>
+    <w:lsdException w:name="Table Classic 3" w:semiHidden="1" w:unhideWhenUsed="1"/>
+    <w:lsdException w:name="Table Classic 4" w:semiHidden="1" w:unhideWhenUsed="1"/>
+    <w:lsdException w:name="Table Colorful 1" w:semiHidden="1" w:unhideWhenUsed="1"/>
+    <w:lsdException w:name="Table Colorful 2" w:semiHidden="1" w:unhideWhenUsed="1"/>
+    <w:lsdException w:name="Table Colorful 3" w:semiHidden="1" w:unhideWhenUsed="1"/>
+    <w:lsdException w:name="Table Columns 1" w:semiHidden="1" w:unhideWhenUsed="1"/>
+    <w:lsdException w:name="Table Columns 2" w:semiHidden="1" w:unhideWhenUsed="1"/>
+    <w:lsdException w:name="Table Columns 3" w:semiHidden="1" w:unhideWhenUsed="1"/>
+    <w:lsdException w:name="Table Columns 4" w:semiHidden="1" w:unhideWhenUsed="1"/>
+    <w:lsdException w:name="Table Columns 5" w:semiHidden="1" w:unhideWhenUsed="1"/>
+    <w:lsdException w:name="Table Grid 1" w:semiHidden="1" w:unhideWhenUsed="1"/>
+    <w:lsdException w:name="Table Grid 2" w:semiHidden="1" w:unhideWhenUsed="1"/>
+    <w:lsdException w:name="Table Grid 3" w:semiHidden="1" w:unhideWhenUsed="1"/>
+    <w:lsdException w:name="Table Grid 4" w:semiHidden="1" w:unhideWhenUsed="1"/>
+    <w:lsdException w:name="Table Grid 5" w:semiHidden="1" w:unhideWhenUsed="1"/>
+    <w:lsdException w:name="Table Grid 6" w:semiHidden="1" w:unhideWhenUsed="1"/>
+    <w:lsdException w:name="Table Grid 7" w:semiHidden="1" w:unhideWhenUsed="1"/>
+    <w:lsdException w:name="Table Grid 8" w:semiHidden="1" w:unhideWhenUsed="1"/>
+    <w:lsdException w:name="Table List 1" w:semiHidden="1" w:unhideWhenUsed="1"/>
+    <w:lsdException w:name="Table List 2" w:semiHidden="1" w:unhideWhenUsed="1"/>
+    <w:lsdException w:name="Table List 3" w:semiHidden="1" w:unhideWhenUsed="1"/>
+    <w:lsdException w:name="Table List 4" w:semiHidden="1" w:unhideWhenUsed="1"/>
+    <w:lsdException w:name="Table List 5" w:semiHidden="1" w:unhideWhenUsed="1"/>
+    <w:lsdException w:name="Table List 6" w:semiHidden="1" w:unhideWhenUsed="1"/>
+    <w:lsdException w:name="Table List 7" w:semiHidden="1" w:unhideWhenUsed="1"/>
+    <w:lsdException w:name="Table List 8" w:semiHidden="1" w:unhideWhenUsed="1"/>
+    <w:lsdException w:name="Table 3D effects 1" w:semiHidden="1" w:unhideWhenUsed="1"/>
+    <w:lsdException w:name="Table 3D effects 2" w:semiHidden="1" w:unhideWhenUsed="1"/>
+    <w:lsdException w:name="Table 3D effects 3" w:semiHidden="1" w:unhideWhenUsed="1"/>
+    <w:lsdException w:name="Table Contemporary" w:semiHidden="1" w:unhideWhenUsed="1"/>
+    <w:lsdException w:name="Table Elegant" w:semiHidden="1" w:unhideWhenUsed="1"/>
+    <w:lsdException w:name="Table Professional" w:semiHidden="1" w:unhideWhenUsed="1"/>
+    <w:lsdException w:name="Table Subtle 1" w:semiHidden="1" w:unhideWhenUsed="1"/>
+    <w:lsdException w:name="Table Subtle 2" w:semiHidden="1" w:unhideWhenUsed="1"/>
+    <w:lsdException w:name="Table Web 1" w:semiHidden="1" w:unhideWhenUsed="1"/>
+    <w:lsdException w:name="Table Web 2" w:semiHidden="1" w:unhideWhenUsed="1"/>
+    <w:lsdException w:name="Table Web 3" w:semiHidden="1" w:unhideWhenUsed="1"/>
+    <w:lsdException w:name="Balloon Text" w:semiHidden="1" w:unhideWhenUsed="1"/>
+    <w:lsdException w:name="Table Grid" w:uiPriority="39"/>
+    <w:lsdException w:name="Table Theme" w:semiHidden="1" w:unhideWhenUsed="1"/>
+    <w:lsdException w:name="Placeholder Text" w:semiHidden="1"/>
+    <w:lsdException w:name="No Spacing" w:uiPriority="1" w:qFormat="1"/>
+    <w:lsdException w:name="Light Shading" w:uiPriority="60"/>
+    <w:lsdException w:name="Light List" w:uiPriority="61"/>
+    <w:lsdException w:name="Light Grid" w:uiPriority="62"/>
+    <w:lsdException w:name="Medium Shading 1" w:uiPriority="63"/>
+    <w:lsdException w:name="Medium Shading 2" w:uiPriority="64"/>
+    <w:lsdException w:name="Medium List 1" w:uiPriority="65"/>
+    <w:lsdException w:name="Medium List 2" w:uiPriority="66"/>
+    <w:lsdException w:name="Medium Grid 1" w:uiPriority="67"/>
+    <w:lsdException w:name="Medium Grid 2" w:uiPriority="68"/>
+    <w:lsdException w:name="Medium Grid 3" w:uiPriority="69"/>
+    <w:lsdException w:name="Dark List" w:uiPriority="70"/>
+    <w:lsdException w:name="Colorful Shading" w:uiPriority="71"/>
+    <w:lsdException w:name="Colorful List" w:uiPriority="72"/>
+    <w:lsdException w:name="Colorful Grid" w:uiPriority="73"/>
+    <w:lsdException w:name="Light Shading Accent 1" w:uiPriority="60"/>
+    <w:lsdException w:name="Light List Accent 1" w:uiPriority="61"/>
+    <w:lsdException w:name="Light Grid Accent 1" w:uiPriority="62"/>
+    <w:lsdException w:name="Medium Shading 1 Accent 1" w:uiPriority="63"/>
+    <w:lsdException w:name="Medium Shading 2 Accent 1" w:uiPriority="64"/>
+    <w:lsdException w:name="Medium List 1 Accent 1" w:uiPriority="65"/>
+    <w:lsdException w:name="Revision" w:semiHidden="1"/>
+    <w:lsdException w:name="List Paragraph" w:uiPriority="34" w:qFormat="1"/>
+    <w:lsdException w:name="Quote" w:uiPriority="29" w:qFormat="1"/>
+    <w:lsdException w:name="Intense Quote" w:uiPriority="30" w:qFormat="1"/>
+    <w:lsdException w:name="Medium List 2 Accent 1" w:uiPriority="66"/>
+    <w:lsdException w:name="Medium Grid 1 Accent 1" w:uiPriority="67"/>
+    <w:lsdException w:name="Medium Grid 2 Accent 1" w:uiPriority="68"/>
+    <w:lsdException w:name="Medium Grid 3 Accent 1" w:uiPriority="69"/>
+    <w:lsdException w:name="Dark List Accent 1" w:uiPriority="70"/>
+    <w:lsdException w:name="Colorful Shading Accent 1" w:uiPriority="71"/>
+    <w:lsdException w:name="Colorful List Accent 1" w:uiPriority="72"/>
+    <w:lsdException w:name="Colorful Grid Accent 1" w:uiPriority="73"/>
+    <w:lsdException w:name="Light Shading Accent 2" w:uiPriority="60"/>
+    <w:lsdException w:name="Light List Accent 2" w:uiPriority="61"/>
+    <w:lsdException w:name="Light Grid Accent 2" w:uiPriority="62"/>
+    <w:lsdException w:name="Medium Shading 1 Accent 2" w:uiPriority="63"/>
+    <w:lsdException w:name="Medium Shading 2 Accent 2" w:uiPriority="64"/>
+    <w:lsdException w:name="Medium List 1 Accent 2" w:uiPriority="65"/>
+    <w:lsdException w:name="Medium List 2 Accent 2" w:uiPriority="66"/>
+    <w:lsdException w:name="Medium Grid 1 Accent 2" w:uiPriority="67"/>
+    <w:lsdException w:name="Medium Grid 2 Accent 2" w:uiPriority="68"/>
+    <w:lsdException w:name="Medium Grid 3 Accent 2" w:uiPriority="69"/>
+    <w:lsdException w:name="Dark List Accent 2" w:uiPriority="70"/>
+    <w:lsdException w:name="Colorful Shading Accent 2" w:uiPriority="71"/>
+    <w:lsdException w:name="Colorful List Accent 2" w:uiPriority="72"/>
+    <w:lsdException w:name="Colorful Grid Accent 2" w:uiPriority="73"/>
+    <w:lsdException w:name="Light Shading Accent 3" w:uiPriority="60"/>
+    <w:lsdException w:name="Light List Accent 3" w:uiPriority="61"/>
+    <w:lsdException w:name="Light Grid Accent 3" w:uiPriority="62"/>
+    <w:lsdException w:name="Medium Shading 1 Accent 3" w:uiPriority="63"/>
+    <w:lsdException w:name="Medium Shading 2 Accent 3" w:uiPriority="64"/>
+    <w:lsdException w:name="Medium List 1 Accent 3" w:uiPriority="65"/>
+    <w:lsdException w:name="Medium List 2 Accent 3" w:uiPriority="66"/>
+    <w:lsdException w:name="Medium Grid 1 Accent 3" w:uiPriority="67"/>
+    <w:lsdException w:name="Medium Grid 2 Accent 3" w:uiPriority="68"/>
+    <w:lsdException w:name="Medium Grid 3 Accent 3" w:uiPriority="69"/>
+    <w:lsdException w:name="Dark List Accent 3" w:uiPriority="70"/>
+    <w:lsdException w:name="Colorful Shading Accent 3" w:uiPriority="71"/>
+    <w:lsdException w:name="Colorful List Accent 3" w:uiPriority="72"/>
+    <w:lsdException w:name="Colorful Grid Accent 3" w:uiPriority="73"/>
+    <w:lsdException w:name="Light Shading Accent 4" w:uiPriority="60"/>
+    <w:lsdException w:name="Light List Accent 4" w:uiPriority="61"/>
+    <w:lsdException w:name="Light Grid Accent 4" w:uiPriority="62"/>
+    <w:lsdException w:name="Medium Shading 1 Accent 4" w:uiPriority="63"/>
+    <w:lsdException w:name="Medium Shading 2 Accent 4" w:uiPriority="64"/>
+    <w:lsdException w:name="Medium List 1 Accent 4" w:uiPriority="65"/>
+    <w:lsdException w:name="Medium List 2 Accent 4" w:uiPriority="66"/>
+    <w:lsdException w:name="Medium Grid 1 Accent 4" w:uiPriority="67"/>
+    <w:lsdException w:name="Medium Grid 2 Accent 4" w:uiPriority="68"/>
+    <w:lsdException w:name="Medium Grid 3 Accent 4" w:uiPriority="69"/>
+    <w:lsdException w:name="Dark List Accent 4" w:uiPriority="70"/>
+    <w:lsdException w:name="Colorful Shading Accent 4" w:uiPriority="71"/>
+    <w:lsdException w:name="Colorful List Accent 4" w:uiPriority="72"/>
+    <w:lsdException w:name="Colorful Grid Accent 4" w:uiPriority="73"/>
+    <w:lsdException w:name="Light Shading Accent 5" w:uiPriority="60"/>
+    <w:lsdException w:name="Light List Accent 5" w:uiPriority="61"/>
+    <w:lsdException w:name="Light Grid Accent 5" w:uiPriority="62"/>
+    <w:lsdException w:name="Medium Shading 1 Accent 5" w:uiPriority="63"/>
+    <w:lsdException w:name="Medium Shading 2 Accent 5" w:uiPriority="64"/>
+    <w:lsdException w:name="Medium List 1 Accent 5" w:uiPriority="65"/>
+    <w:lsdException w:name="Medium List 2 Accent 5" w:uiPriority="66"/>
+    <w:lsdException w:name="Medium Grid 1 Accent 5" w:uiPriority="67"/>
+    <w:lsdException w:name="Medium Grid 2 Accent 5" w:uiPriority="68"/>
+    <w:lsdException w:name="Medium Grid 3 Accent 5" w:uiPriority="69"/>
+    <w:lsdException w:name="Dark List Accent 5" w:uiPriority="70"/>
+    <w:lsdException w:name="Colorful Shading Accent 5" w:uiPriority="71"/>
+    <w:lsdException w:name="Colorful List Accent 5" w:uiPriority="72"/>
+    <w:lsdException w:name="Colorful Grid Accent 5" w:uiPriority="73"/>
+    <w:lsdException w:name="Light Shading Accent 6" w:uiPriority="60"/>
+    <w:lsdException w:name="Light List Accent 6" w:uiPriority="61"/>
+    <w:lsdException w:name="Light Grid Accent 6" w:uiPriority="62"/>
+    <w:lsdException w:name="Medium Shading 1 Accent 6" w:uiPriority="63"/>
+    <w:lsdException w:name="Medium Shading 2 Accent 6" w:uiPriority="64"/>
+    <w:lsdException w:name="Medium List 1 Accent 6" w:uiPriority="65"/>
+    <w:lsdException w:name="Medium List 2 Accent 6" w:uiPriority="66"/>
+    <w:lsdException w:name="Medium Grid 1 Accent 6" w:uiPriority="67"/>
+    <w:lsdException w:name="Medium Grid 2 Accent 6" w:uiPriority="68"/>
+    <w:lsdException w:name="Medium Grid 3 Accent 6" w:uiPriority="69"/>
+    <w:lsdException w:name="Dark List Accent 6" w:uiPriority="70"/>
+    <w:lsdException w:name="Colorful Shading Accent 6" w:uiPriority="71"/>
+    <w:lsdException w:name="Colorful List Accent 6" w:uiPriority="72"/>
+    <w:lsdException w:name="Colorful Grid Accent 6" w:uiPriority="73"/>
+    <w:lsdException w:name="Subtle Emphasis" w:uiPriority="19" w:qFormat="1"/>
+    <w:lsdException w:name="Intense Emphasis" w:uiPriority="21" w:qFormat="1"/>
+    <w:lsdException w:name="Subtle Reference" w:uiPriority="31" w:qFormat="1"/>
+    <w:lsdException w:name="Intense Reference" w:uiPriority="32" w:qFormat="1"/>
+    <w:lsdException w:name="Book Title" w:uiPriority="33" w:qFormat="1"/>
+    <w:lsdException w:name="Bibliography" w:semiHidden="1" w:uiPriority="37" w:unhideWhenUsed="1"/>
+    <w:lsdException w:name="TOC Heading" w:semiHidden="1" w:uiPriority="39" w:unhideWhenUsed="1" w:qFormat="1"/>
+    <w:lsdException w:name="Plain Table 1" w:uiPriority="41"/>
+    <w:lsdException w:name="Plain Table 2" w:uiPriority="42"/>
+    <w:lsdException w:name="Plain Table 3" w:uiPriority="43"/>
+    <w:lsdException w:name="Plain Table 4" w:uiPriority="44"/>
+    <w:lsdException w:name="Plain Table 5" w:uiPriority="45"/>
+    <w:lsdException w:name="Grid Table Light" w:uiPriority="40"/>
+    <w:lsdException w:name="Grid Table 1 Light" w:uiPriority="46"/>
+    <w:lsdException w:name="Grid Table 2" w:uiPriority="47"/>
+    <w:lsdException w:name="Grid Table 3" w:uiPriority="48"/>
+    <w:lsdException w:name="Grid Table 4" w:uiPriority="49"/>
+    <w:lsdException w:name="Grid Table 5 Dark" w:uiPriority="50"/>
+    <w:lsdException w:name="Grid Table 6 Colorful" w:uiPriority="51"/>
+    <w:lsdException w:name="Grid Table 7 Colorful" w:uiPriority="52"/>
+    <w:lsdException w:name="Grid Table 1 Light Accent 1" w:uiPriority="46"/>
+    <w:lsdException w:name="Grid Table 2 Accent 1" w:uiPriority="47"/>
+    <w:lsdException w:name="Grid Table 3 Accent 1" w:uiPriority="48"/>
+    <w:lsdException w:name="Grid Table 4 Accent 1" w:uiPriority="49"/>
+    <w:lsdException w:name="Grid Table 5 Dark Accent 1" w:uiPriority="50"/>
+    <w:lsdException w:name="Grid Table 6 Colorful Accent 1" w:uiPriority="51"/>
+    <w:lsdException w:name="Grid Table 7 Colorful Accent 1" w:uiPriority="52"/>
+    <w:lsdException w:name="Grid Table 1 Light Accent 2" w:uiPriority="46"/>
+    <w:lsdException w:name="Grid Table 2 Accent 2" w:uiPriority="47"/>
+    <w:lsdException w:name="Grid Table 3 Accent 2" w:uiPriority="48"/>
+    <w:lsdException w:name="Grid Table 4 Accent 2" w:uiPriority="49"/>
+    <w:lsdException w:name="Grid Table 5 Dark Accent 2" w:uiPriority="50"/>
+    <w:lsdException w:name="Grid Table 6 Colorful Accent 2" w:uiPriority="51"/>
+    <w:lsdException w:name="Grid Table 7 Colorful Accent 2" w:uiPriority="52"/>
+    <w:lsdException w:name="Grid Table 1 Light Accent 3" w:uiPriority="46"/>
+    <w:lsdException w:name="Grid Table 2 Accent 3" w:uiPriority="47"/>
+    <w:lsdException w:name="Grid Table 3 Accent 3" w:uiPriority="48"/>
+    <w:lsdException w:name="Grid Table 4 Accent 3" w:uiPriority="49"/>
+    <w:lsdException w:name="Grid Table 5 Dark Accent 3" w:uiPriority="50"/>
+    <w:lsdException w:name="Grid Table 6 Colorful Accent 3" w:uiPriority="51"/>
+    <w:lsdException w:name="Grid Table 7 Colorful Accent 3" w:uiPriority="52"/>
+    <w:lsdException w:name="Grid Table 1 Light Accent 4" w:uiPriority="46"/>
+    <w:lsdException w:name="Grid Table 2 Accent 4" w:uiPriority="47"/>
+    <w:lsdException w:name="Grid Table 3 Accent 4" w:uiPriority="48"/>
+    <w:lsdException w:name="Grid Table 4 Accent 4" w:uiPriority="49"/>
+    <w:lsdException w:name="Grid Table 5 Dark Accent 4" w:uiPriority="50"/>
+    <w:lsdException w:name="Grid Table 6 Colorful Accent 4" w:uiPriority="51"/>
+    <w:lsdException w:name="Grid Table 7 Colorful Accent 4" w:uiPriority="52"/>
+    <w:lsdException w:name="Grid Table 1 Light Accent 5" w:uiPriority="46"/>
+    <w:lsdException w:name="Grid Table 2 Accent 5" w:uiPriority="47"/>
+    <w:lsdException w:name="Grid Table 3 Accent 5" w:uiPriority="48"/>
+    <w:lsdException w:name="Grid Table 4 Accent 5" w:uiPriority="49"/>
+    <w:lsdException w:name="Grid Table 5 Dark Accent 5" w:uiPriority="50"/>
+    <w:lsdException w:name="Grid Table 6 Colorful Accent 5" w:uiPriority="51"/>
+    <w:lsdException w:name="Grid Table 7 Colorful Accent 5" w:uiPriority="52"/>
+    <w:lsdException w:name="Grid Table 1 Light Accent 6" w:uiPriority="46"/>
+    <w:lsdException w:name="Grid Table 2 Accent 6" w:uiPriority="47"/>
+    <w:lsdException w:name="Grid Table 3 Accent 6" w:uiPriority="48"/>
+    <w:lsdException w:name="Grid Table 4 Accent 6" w:uiPriority="49"/>
+    <w:lsdException w:name="Grid Table 5 Dark Accent 6" w:uiPriority="50"/>
+    <w:lsdException w:name="Grid Table 6 Colorful Accent 6" w:uiPriority="51"/>
+    <w:lsdException w:name="Grid Table 7 Colorful Accent 6" w:uiPriority="52"/>
+    <w:lsdException w:name="List Table 1 Light" w:uiPriority="46"/>
+    <w:lsdException w:name="List Table 2" w:uiPriority="47"/>
+    <w:lsdException w:name="List Table 3" w:uiPriority="48"/>
+    <w:lsdException w:name="List Table 4" w:uiPriority="49"/>
+    <w:lsdException w:name="List Table 5 Dark" w:uiPriority="50"/>
+    <w:lsdException w:name="List Table 6 Colorful" w:uiPriority="51"/>
+    <w:lsdException w:name="List Table 7 Colorful" w:uiPriority="52"/>
+    <w:lsdException w:name="List Table 1 Light Accent 1" w:uiPriority="46"/>
+    <w:lsdException w:name="List Table 2 Accent 1" w:uiPriority="47"/>
+    <w:lsdException w:name="List Table 3 Accent 1" w:uiPriority="48"/>
+    <w:lsdException w:name="List Table 4 Accent 1" w:uiPriority="49"/>
+    <w:lsdException w:name="List Table 5 Dark Accent 1" w:uiPriority="50"/>
+    <w:lsdException w:name="List Table 6 Colorful Accent 1" w:uiPriority="51"/>
+    <w:lsdException w:name="List Table 7 Colorful Accent 1" w:uiPriority="52"/>
+    <w:lsdException w:name="List Table 1 Light Accent 2" w:uiPriority="46"/>
+    <w:lsdException w:name="List Table 2 Accent 2" w:uiPriority="47"/>
+    <w:lsdException w:name="List Table 3 Accent 2" w:uiPriority="48"/>
+    <w:lsdException w:name="List Table 4 Accent 2" w:uiPriority="49"/>
+    <w:lsdException w:name="List Table 5 Dark Accent 2" w:uiPriority="50"/>
+    <w:lsdException w:name="List Table 6 Colorful Accent 2" w:uiPriority="51"/>
+    <w:lsdException w:name="List Table 7 Colorful Accent 2" w:uiPriority="52"/>
+    <w:lsdException w:name="List Table 1 Light Accent 3" w:uiPriority="46"/>
+    <w:lsdException w:name="List Table 2 Accent 3" w:uiPriority="47"/>
+    <w:lsdException w:name="List Table 3 Accent 3" w:uiPriority="48"/>
+    <w:lsdException w:name="List Table 4 Accent 3" w:uiPriority="49"/>
+    <w:lsdException w:name="List Table 5 Dark Accent 3" w:uiPriority="50"/>
+    <w:lsdException w:name="List Table 6 Colorful Accent 3" w:uiPriority="51"/>
+    <w:lsdException w:name="List Table 7 Colorful Accent 3" w:uiPriority="52"/>
+    <w:lsdException w:name="List Table 1 Light Accent 4" w:uiPriority="46"/>
+    <w:lsdException w:name="List Table 2 Accent 4" w:uiPriority="47"/>
+    <w:lsdException w:name="List Table 3 Accent 4" w:uiPriority="48"/>
+    <w:lsdException w:name="List Table 4 Accent 4" w:uiPriority="49"/>
+    <w:lsdException w:name="List Table 5 Dark Accent 4" w:uiPriority="50"/>
+    <w:lsdException w:name="List Table 6 Colorful Accent 4" w:uiPriority="51"/>
+    <w:lsdException w:name="List Table 7 Colorful Accent 4" w:uiPriority="52"/>
+    <w:lsdException w:name="List Table 1 Light Accent 5" w:uiPriority="46"/>
+    <w:lsdException w:name="List Table 2 Accent 5" w:uiPriority="47"/>
+    <w:lsdException w:name="List Table 3 Accent 5" w:uiPriority="48"/>
+    <w:lsdException w:name="List Table 4 Accent 5" w:uiPriority="49"/>
+    <w:lsdException w:name="List Table 5 Dark Accent 5" w:uiPriority="50"/>
+    <w:lsdException w:name="List Table 6 Colorful Accent 5" w:uiPriority="51"/>
+    <w:lsdException w:name="List Table 7 Colorful Accent 5" w:uiPriority="52"/>
+    <w:lsdException w:name="List Table 1 Light Accent 6" w:uiPriority="46"/>
+    <w:lsdException w:name="List Table 2 Accent 6" w:uiPriority="47"/>
+    <w:lsdException w:name="List Table 3 Accent 6" w:uiPriority="48"/>
+    <w:lsdException w:name="List Table 4 Accent 6" w:uiPriority="49"/>
+    <w:lsdException w:name="List Table 5 Dark Accent 6" w:uiPriority="50"/>
+    <w:lsdException w:name="List Table 6 Colorful Accent 6" w:uiPriority="51"/>
+    <w:lsdException w:name="List Table 7 Colorful Accent 6" w:uiPriority="52"/>
+    <w:lsdException w:name="Mention" w:semiHidden="1" w:unhideWhenUsed="1"/>
+    <w:lsdException w:name="Smart Hyperlink" w:semiHidden="1" w:unhideWhenUsed="1"/>
+    <w:lsdException w:name="Hashtag" w:semiHidden="1" w:unhideWhenUsed="1"/>
+    <w:lsdException w:name="Unresolved Mention" w:semiHidden="1" w:unhideWhenUsed="1"/>
+    <w:lsdException w:name="Smart Link" w:semiHidden="1" w:unhideWhenUsed="1"/>
+  </w:latentStyles>
+  <w:style w:type="paragraph" w:default="1" w:styleId="Normal">
+    <w:name w:val="Normal"/>
     <w:qFormat/>
-    <w:rPr>
-      <w:sz w:val="56"/>
-      <w:szCs w:val="56"/>
-    </w:rPr>
   </w:style>
   <w:style w:type="paragraph" w:styleId="Heading1">
-    <w:name w:val="Heading 1"/>
-    <w:basedOn w:val="Normal"/>
-    <w:next w:val="Normal"/>
+    <w:name w:val="heading 1"/>
+    <w:uiPriority w:val="9"/>
     <w:qFormat/>
+    <w:pPr>
+      <w:spacing w:before="240" w:after="120"/>
+      <w:outlineLvl w:val="0"/>
+    </w:pPr>
     <w:rPr>
-      <w:color w:val="2E74B5"/>
+      <w:b/>
+      <w:bCs/>
+      <w:color w:val="1F3864"/>
       <w:sz w:val="32"/>
       <w:szCs w:val="32"/>
     </w:rPr>
   </w:style>
   <w:style w:type="paragraph" w:styleId="Heading2">
-    <w:name w:val="Heading 2"/>
-    <w:basedOn w:val="Normal"/>
-    <w:next w:val="Normal"/>
+    <w:name w:val="heading 2"/>
+    <w:uiPriority w:val="9"/>
+    <w:unhideWhenUsed/>
     <w:qFormat/>
+    <w:pPr>
+      <w:spacing w:before="200" w:after="80"/>
+      <w:outlineLvl w:val="1"/>
+    </w:pPr>
     <w:rPr>
-      <w:color w:val="2E74B5"/>
+      <w:b/>
+      <w:bCs/>
+      <w:color w:val="2E5F9E"/>
       <w:sz w:val="26"/>
       <w:szCs w:val="26"/>
     </w:rPr>
   </w:style>
   <w:style w:type="paragraph" w:styleId="Heading3">
-    <w:name w:val="Heading 3"/>
-    <w:basedOn w:val="Normal"/>
-    <w:next w:val="Normal"/>
+    <w:name w:val="heading 3"/>
+    <w:uiPriority w:val="9"/>
+    <w:unhideWhenUsed/>
     <w:qFormat/>
+    <w:pPr>
+      <w:spacing w:before="140" w:after="60"/>
+      <w:outlineLvl w:val="2"/>
+    </w:pPr>
     <w:rPr>
-      <w:color w:val="1F4D78"/>
-      <w:sz w:val="24"/>
-      <w:szCs w:val="24"/>
+      <w:b/>
+      <w:bCs/>
+      <w:color w:val="1F3864"/>
     </w:rPr>
   </w:style>
   <w:style w:type="paragraph" w:styleId="Heading4">
-    <w:name w:val="Heading 4"/>
-    <w:basedOn w:val="Normal"/>
-    <w:next w:val="Normal"/>
+    <w:name w:val="heading 4"/>
+    <w:uiPriority w:val="9"/>
+    <w:semiHidden/>
+    <w:unhideWhenUsed/>
     <w:qFormat/>
+    <w:pPr>
+      <w:outlineLvl w:val="3"/>
+    </w:pPr>
     <w:rPr>
       <w:i/>
       <w:iCs/>
@@ -2812,27 +3658,69 @@
     </w:rPr>
   </w:style>
   <w:style w:type="paragraph" w:styleId="Heading5">
-    <w:name w:val="Heading 5"/>
-    <w:basedOn w:val="Normal"/>
-    <w:next w:val="Normal"/>
+    <w:name w:val="heading 5"/>
+    <w:uiPriority w:val="9"/>
+    <w:semiHidden/>
+    <w:unhideWhenUsed/>
     <w:qFormat/>
+    <w:pPr>
+      <w:outlineLvl w:val="4"/>
+    </w:pPr>
     <w:rPr>
       <w:color w:val="2E74B5"/>
     </w:rPr>
   </w:style>
   <w:style w:type="paragraph" w:styleId="Heading6">
-    <w:name w:val="Heading 6"/>
-    <w:basedOn w:val="Normal"/>
-    <w:next w:val="Normal"/>
+    <w:name w:val="heading 6"/>
+    <w:uiPriority w:val="9"/>
+    <w:semiHidden/>
+    <w:unhideWhenUsed/>
     <w:qFormat/>
+    <w:pPr>
+      <w:outlineLvl w:val="5"/>
+    </w:pPr>
     <w:rPr>
       <w:color w:val="1F4D78"/>
     </w:rPr>
   </w:style>
-  <w:style w:type="paragraph" w:styleId="Strong">
-    <w:name w:val="Strong"/>
-    <w:basedOn w:val="Normal"/>
-    <w:next w:val="Normal"/>
+  <w:style w:type="character" w:default="1" w:styleId="DefaultParagraphFont">
+    <w:name w:val="Default Paragraph Font"/>
+    <w:uiPriority w:val="1"/>
+    <w:semiHidden/>
+    <w:unhideWhenUsed/>
+  </w:style>
+  <w:style w:type="table" w:default="1" w:styleId="TableNormal">
+    <w:name w:val="Normal Table"/>
+    <w:uiPriority w:val="99"/>
+    <w:semiHidden/>
+    <w:unhideWhenUsed/>
+    <w:tblPr>
+      <w:tblInd w:w="0" w:type="dxa"/>
+      <w:tblCellMar>
+        <w:top w:w="0" w:type="dxa"/>
+        <w:left w:w="108" w:type="dxa"/>
+        <w:bottom w:w="0" w:type="dxa"/>
+        <w:right w:w="108" w:type="dxa"/>
+      </w:tblCellMar>
+    </w:tblPr>
+  </w:style>
+  <w:style w:type="numbering" w:default="1" w:styleId="NoList">
+    <w:name w:val="No List"/>
+    <w:uiPriority w:val="99"/>
+    <w:semiHidden/>
+    <w:unhideWhenUsed/>
+  </w:style>
+  <w:style w:type="paragraph" w:styleId="Title">
+    <w:name w:val="Title"/>
+    <w:uiPriority w:val="10"/>
+    <w:qFormat/>
+    <w:rPr>
+      <w:sz w:val="56"/>
+      <w:szCs w:val="56"/>
+    </w:rPr>
+  </w:style>
+  <w:style w:type="paragraph" w:customStyle="1" w:styleId="Strong1">
+    <w:name w:val="Strong1"/>
     <w:qFormat/>
     <w:rPr>
       <w:b/>
@@ -2841,12 +3729,10 @@
   </w:style>
   <w:style w:type="paragraph" w:styleId="ListParagraph">
     <w:name w:val="List Paragraph"/>
-    <w:basedOn w:val="Normal"/>
     <w:qFormat/>
   </w:style>
   <w:style w:type="character" w:styleId="Hyperlink">
     <w:name w:val="Hyperlink"/>
-    <w:basedOn w:val="DefaultParagraphFont"/>
     <w:uiPriority w:val="99"/>
     <w:unhideWhenUsed/>
     <w:rPr>
@@ -2856,7 +3742,6 @@
   </w:style>
   <w:style w:type="character" w:styleId="FootnoteReference">
     <w:name w:val="footnote reference"/>
-    <w:basedOn w:val="DefaultParagraphFont"/>
     <w:uiPriority w:val="99"/>
     <w:semiHidden/>
     <w:unhideWhenUsed/>
@@ -2866,22 +3751,17 @@
   </w:style>
   <w:style w:type="paragraph" w:styleId="FootnoteText">
     <w:name w:val="footnote text"/>
-    <w:basedOn w:val="Normal"/>
     <w:link w:val="FootnoteTextChar"/>
     <w:uiPriority w:val="99"/>
     <w:semiHidden/>
     <w:unhideWhenUsed/>
-    <w:pPr>
-      <w:spacing w:after="0" w:line="240" w:lineRule="auto"/>
-    </w:pPr>
     <w:rPr>
       <w:sz w:val="20"/>
       <w:szCs w:val="20"/>
     </w:rPr>
   </w:style>
-  <w:style w:type="character" w:styleId="FootnoteTextChar">
+  <w:style w:type="character" w:customStyle="1" w:styleId="FootnoteTextChar">
     <w:name w:val="Footnote Text Char"/>
-    <w:basedOn w:val="DefaultParagraphFont"/>
     <w:link w:val="FootnoteText"/>
     <w:uiPriority w:val="99"/>
     <w:semiHidden/>
@@ -2893,7 +3773,6 @@
   </w:style>
   <w:style w:type="character" w:styleId="EndnoteReference">
     <w:name w:val="endnote reference"/>
-    <w:basedOn w:val="DefaultParagraphFont"/>
     <w:uiPriority w:val="99"/>
     <w:semiHidden/>
     <w:unhideWhenUsed/>
@@ -2903,22 +3782,17 @@
   </w:style>
   <w:style w:type="paragraph" w:styleId="EndnoteText">
     <w:name w:val="endnote text"/>
-    <w:basedOn w:val="Normal"/>
     <w:link w:val="EndnoteTextChar"/>
     <w:uiPriority w:val="99"/>
     <w:semiHidden/>
     <w:unhideWhenUsed/>
-    <w:pPr>
-      <w:spacing w:after="0" w:line="240" w:lineRule="auto"/>
-    </w:pPr>
     <w:rPr>
       <w:sz w:val="20"/>
       <w:szCs w:val="20"/>
     </w:rPr>
   </w:style>
-  <w:style w:type="character" w:styleId="EndnoteTextChar">
+  <w:style w:type="character" w:customStyle="1" w:styleId="EndnoteTextChar">
     <w:name w:val="Endnote Text Char"/>
-    <w:basedOn w:val="DefaultParagraphFont"/>
     <w:link w:val="EndnoteText"/>
     <w:uiPriority w:val="99"/>
     <w:semiHidden/>
@@ -2928,59 +3802,320 @@
       <w:szCs w:val="20"/>
     </w:rPr>
   </w:style>
-  <w:style w:type="paragraph" w:styleId="Heading1">
-    <w:name w:val="Heading 1"/>
-    <w:basedOn w:val="Normal"/>
-    <w:next w:val="Normal"/>
-    <w:qFormat/>
-    <w:pPr>
-      <w:spacing w:after="120" w:before="240"/>
-      <w:outlineLvl w:val="0"/>
-    </w:pPr>
-    <w:rPr>
-      <w:rFonts w:ascii="Arial" w:cs="Arial" w:eastAsia="Arial" w:hAnsi="Arial"/>
-      <w:b/>
-      <w:bCs/>
-      <w:color w:val="1F3864"/>
-      <w:sz w:val="32"/>
-      <w:szCs w:val="32"/>
-    </w:rPr>
-  </w:style>
-  <w:style w:type="paragraph" w:styleId="Heading2">
-    <w:name w:val="Heading 2"/>
-    <w:basedOn w:val="Normal"/>
-    <w:next w:val="Normal"/>
-    <w:qFormat/>
-    <w:pPr>
-      <w:spacing w:after="80" w:before="200"/>
-      <w:outlineLvl w:val="1"/>
-    </w:pPr>
-    <w:rPr>
-      <w:rFonts w:ascii="Arial" w:cs="Arial" w:eastAsia="Arial" w:hAnsi="Arial"/>
-      <w:b/>
-      <w:bCs/>
-      <w:color w:val="2E5F9E"/>
-      <w:sz w:val="26"/>
-      <w:szCs w:val="26"/>
-    </w:rPr>
-  </w:style>
-  <w:style w:type="paragraph" w:styleId="Heading3">
-    <w:name w:val="Heading 3"/>
-    <w:basedOn w:val="Normal"/>
-    <w:next w:val="Normal"/>
-    <w:qFormat/>
-    <w:pPr>
-      <w:spacing w:after="60" w:before="140"/>
-      <w:outlineLvl w:val="2"/>
-    </w:pPr>
-    <w:rPr>
-      <w:rFonts w:ascii="Arial" w:cs="Arial" w:eastAsia="Arial" w:hAnsi="Arial"/>
-      <w:b/>
-      <w:bCs/>
-      <w:color w:val="1F3864"/>
-      <w:sz w:val="22"/>
-      <w:szCs w:val="22"/>
-    </w:rPr>
-  </w:style>
 </w:styles>
+</file>
+
+<file path=word/theme/theme1.xml><?xml version="1.0" encoding="utf-8"?>
+<a:theme xmlns:a="http://schemas.openxmlformats.org/drawingml/2006/main" name="Office Theme">
+  <a:themeElements>
+    <a:clrScheme name="Office">
+      <a:dk1>
+        <a:sysClr val="windowText" lastClr="000000"/>
+      </a:dk1>
+      <a:lt1>
+        <a:sysClr val="window" lastClr="FFFFFF"/>
+      </a:lt1>
+      <a:dk2>
+        <a:srgbClr val="0E2841"/>
+      </a:dk2>
+      <a:lt2>
+        <a:srgbClr val="E8E8E8"/>
+      </a:lt2>
+      <a:accent1>
+        <a:srgbClr val="156082"/>
+      </a:accent1>
+      <a:accent2>
+        <a:srgbClr val="E97132"/>
+      </a:accent2>
+      <a:accent3>
+        <a:srgbClr val="196B24"/>
+      </a:accent3>
+      <a:accent4>
+        <a:srgbClr val="0F9ED5"/>
+      </a:accent4>
+      <a:accent5>
+        <a:srgbClr val="A02B93"/>
+      </a:accent5>
+      <a:accent6>
+        <a:srgbClr val="4EA72E"/>
+      </a:accent6>
+      <a:hlink>
+        <a:srgbClr val="467886"/>
+      </a:hlink>
+      <a:folHlink>
+        <a:srgbClr val="96607D"/>
+      </a:folHlink>
+    </a:clrScheme>
+    <a:fontScheme name="Office">
+      <a:majorFont>
+        <a:latin typeface="Aptos Display" panose="02110004020202020204"/>
+        <a:ea typeface=""/>
+        <a:cs typeface=""/>
+        <a:font script="Jpan" typeface="游ゴシック Light"/>
+        <a:font script="Hang" typeface="맑은 고딕"/>
+        <a:font script="Hans" typeface="等线 Light"/>
+        <a:font script="Hant" typeface="新細明體"/>
+        <a:font script="Arab" typeface="Times New Roman"/>
+        <a:font script="Hebr" typeface="Times New Roman"/>
+        <a:font script="Thai" typeface="Angsana New"/>
+        <a:font script="Ethi" typeface="Nyala"/>
+        <a:font script="Beng" typeface="Vrinda"/>
+        <a:font script="Gujr" typeface="Shruti"/>
+        <a:font script="Khmr" typeface="MoolBoran"/>
+        <a:font script="Knda" typeface="Tunga"/>
+        <a:font script="Guru" typeface="Raavi"/>
+        <a:font script="Cans" typeface="Euphemia"/>
+        <a:font script="Cher" typeface="Plantagenet Cherokee"/>
+        <a:font script="Yiii" typeface="Microsoft Yi Baiti"/>
+        <a:font script="Tibt" typeface="Microsoft Himalaya"/>
+        <a:font script="Thaa" typeface="MV Boli"/>
+        <a:font script="Deva" typeface="Mangal"/>
+        <a:font script="Telu" typeface="Gautami"/>
+        <a:font script="Taml" typeface="Latha"/>
+        <a:font script="Syrc" typeface="Estrangelo Edessa"/>
+        <a:font script="Orya" typeface="Kalinga"/>
+        <a:font script="Mlym" typeface="Kartika"/>
+        <a:font script="Laoo" typeface="DokChampa"/>
+        <a:font script="Sinh" typeface="Iskoola Pota"/>
+        <a:font script="Mong" typeface="Mongolian Baiti"/>
+        <a:font script="Viet" typeface="Times New Roman"/>
+        <a:font script="Uigh" typeface="Microsoft Uighur"/>
+        <a:font script="Geor" typeface="Sylfaen"/>
+        <a:font script="Armn" typeface="Arial"/>
+        <a:font script="Bugi" typeface="Leelawadee UI"/>
+        <a:font script="Bopo" typeface="Microsoft JhengHei"/>
+        <a:font script="Java" typeface="Javanese Text"/>
+        <a:font script="Lisu" typeface="Segoe UI"/>
+        <a:font script="Mymr" typeface="Myanmar Text"/>
+        <a:font script="Nkoo" typeface="Ebrima"/>
+        <a:font script="Olck" typeface="Nirmala UI"/>
+        <a:font script="Osma" typeface="Ebrima"/>
+        <a:font script="Phag" typeface="Phagspa"/>
+        <a:font script="Syrn" typeface="Estrangelo Edessa"/>
+        <a:font script="Syrj" typeface="Estrangelo Edessa"/>
+        <a:font script="Syre" typeface="Estrangelo Edessa"/>
+        <a:font script="Sora" typeface="Nirmala UI"/>
+        <a:font script="Tale" typeface="Microsoft Tai Le"/>
+        <a:font script="Talu" typeface="Microsoft New Tai Lue"/>
+        <a:font script="Tfng" typeface="Ebrima"/>
+      </a:majorFont>
+      <a:minorFont>
+        <a:latin typeface="Aptos" panose="02110004020202020204"/>
+        <a:ea typeface=""/>
+        <a:cs typeface=""/>
+        <a:font script="Jpan" typeface="游明朝"/>
+        <a:font script="Hang" typeface="맑은 고딕"/>
+        <a:font script="Hans" typeface="等线"/>
+        <a:font script="Hant" typeface="新細明體"/>
+        <a:font script="Arab" typeface="Arial"/>
+        <a:font script="Hebr" typeface="Arial"/>
+        <a:font script="Thai" typeface="Cordia New"/>
+        <a:font script="Ethi" typeface="Nyala"/>
+        <a:font script="Beng" typeface="Vrinda"/>
+        <a:font script="Gujr" typeface="Shruti"/>
+        <a:font script="Khmr" typeface="DaunPenh"/>
+        <a:font script="Knda" typeface="Tunga"/>
+        <a:font script="Guru" typeface="Raavi"/>
+        <a:font script="Cans" typeface="Euphemia"/>
+        <a:font script="Cher" typeface="Plantagenet Cherokee"/>
+        <a:font script="Yiii" typeface="Microsoft Yi Baiti"/>
+        <a:font script="Tibt" typeface="Microsoft Himalaya"/>
+        <a:font script="Thaa" typeface="MV Boli"/>
+        <a:font script="Deva" typeface="Mangal"/>
+        <a:font script="Telu" typeface="Gautami"/>
+        <a:font script="Taml" typeface="Latha"/>
+        <a:font script="Syrc" typeface="Estrangelo Edessa"/>
+        <a:font script="Orya" typeface="Kalinga"/>
+        <a:font script="Mlym" typeface="Kartika"/>
+        <a:font script="Laoo" typeface="DokChampa"/>
+        <a:font script="Sinh" typeface="Iskoola Pota"/>
+        <a:font script="Mong" typeface="Mongolian Baiti"/>
+        <a:font script="Viet" typeface="Arial"/>
+        <a:font script="Uigh" typeface="Microsoft Uighur"/>
+        <a:font script="Geor" typeface="Sylfaen"/>
+        <a:font script="Armn" typeface="Arial"/>
+        <a:font script="Bugi" typeface="Leelawadee UI"/>
+        <a:font script="Bopo" typeface="Microsoft JhengHei"/>
+        <a:font script="Java" typeface="Javanese Text"/>
+        <a:font script="Lisu" typeface="Segoe UI"/>
+        <a:font script="Mymr" typeface="Myanmar Text"/>
+        <a:font script="Nkoo" typeface="Ebrima"/>
+        <a:font script="Olck" typeface="Nirmala UI"/>
+        <a:font script="Osma" typeface="Ebrima"/>
+        <a:font script="Phag" typeface="Phagspa"/>
+        <a:font script="Syrn" typeface="Estrangelo Edessa"/>
+        <a:font script="Syrj" typeface="Estrangelo Edessa"/>
+        <a:font script="Syre" typeface="Estrangelo Edessa"/>
+        <a:font script="Sora" typeface="Nirmala UI"/>
+        <a:font script="Tale" typeface="Microsoft Tai Le"/>
+        <a:font script="Talu" typeface="Microsoft New Tai Lue"/>
+        <a:font script="Tfng" typeface="Ebrima"/>
+      </a:minorFont>
+    </a:fontScheme>
+    <a:fmtScheme name="Office">
+      <a:fillStyleLst>
+        <a:solidFill>
+          <a:schemeClr val="phClr"/>
+        </a:solidFill>
+        <a:gradFill rotWithShape="1">
+          <a:gsLst>
+            <a:gs pos="0">
+              <a:schemeClr val="phClr">
+                <a:lumMod val="110000"/>
+                <a:satMod val="105000"/>
+                <a:tint val="67000"/>
+              </a:schemeClr>
+            </a:gs>
+            <a:gs pos="50000">
+              <a:schemeClr val="phClr">
+                <a:lumMod val="105000"/>
+                <a:satMod val="103000"/>
+                <a:tint val="73000"/>
+              </a:schemeClr>
+            </a:gs>
+            <a:gs pos="100000">
+              <a:schemeClr val="phClr">
+                <a:lumMod val="105000"/>
+                <a:satMod val="109000"/>
+                <a:tint val="81000"/>
+              </a:schemeClr>
+            </a:gs>
+          </a:gsLst>
+          <a:lin ang="5400000" scaled="0"/>
+        </a:gradFill>
+        <a:gradFill rotWithShape="1">
+          <a:gsLst>
+            <a:gs pos="0">
+              <a:schemeClr val="phClr">
+                <a:satMod val="103000"/>
+                <a:lumMod val="102000"/>
+                <a:tint val="94000"/>
+              </a:schemeClr>
+            </a:gs>
+            <a:gs pos="50000">
+              <a:schemeClr val="phClr">
+                <a:satMod val="110000"/>
+                <a:lumMod val="100000"/>
+                <a:shade val="100000"/>
+              </a:schemeClr>
+            </a:gs>
+            <a:gs pos="100000">
+              <a:schemeClr val="phClr">
+                <a:lumMod val="99000"/>
+                <a:satMod val="120000"/>
+                <a:shade val="78000"/>
+              </a:schemeClr>
+            </a:gs>
+          </a:gsLst>
+          <a:lin ang="5400000" scaled="0"/>
+        </a:gradFill>
+      </a:fillStyleLst>
+      <a:lnStyleLst>
+        <a:ln w="12700" cap="flat" cmpd="sng" algn="ctr">
+          <a:solidFill>
+            <a:schemeClr val="phClr"/>
+          </a:solidFill>
+          <a:prstDash val="solid"/>
+          <a:miter lim="800000"/>
+        </a:ln>
+        <a:ln w="19050" cap="flat" cmpd="sng" algn="ctr">
+          <a:solidFill>
+            <a:schemeClr val="phClr"/>
+          </a:solidFill>
+          <a:prstDash val="solid"/>
+          <a:miter lim="800000"/>
+        </a:ln>
+        <a:ln w="25400" cap="flat" cmpd="sng" algn="ctr">
+          <a:solidFill>
+            <a:schemeClr val="phClr"/>
+          </a:solidFill>
+          <a:prstDash val="solid"/>
+          <a:miter lim="800000"/>
+        </a:ln>
+      </a:lnStyleLst>
+      <a:effectStyleLst>
+        <a:effectStyle>
+          <a:effectLst/>
+        </a:effectStyle>
+        <a:effectStyle>
+          <a:effectLst/>
+        </a:effectStyle>
+        <a:effectStyle>
+          <a:effectLst>
+            <a:outerShdw blurRad="57150" dist="19050" dir="5400000" algn="ctr" rotWithShape="0">
+              <a:srgbClr val="000000">
+                <a:alpha val="63000"/>
+              </a:srgbClr>
+            </a:outerShdw>
+          </a:effectLst>
+        </a:effectStyle>
+      </a:effectStyleLst>
+      <a:bgFillStyleLst>
+        <a:solidFill>
+          <a:schemeClr val="phClr"/>
+        </a:solidFill>
+        <a:solidFill>
+          <a:schemeClr val="phClr">
+            <a:tint val="95000"/>
+            <a:satMod val="170000"/>
+          </a:schemeClr>
+        </a:solidFill>
+        <a:gradFill rotWithShape="1">
+          <a:gsLst>
+            <a:gs pos="0">
+              <a:schemeClr val="phClr">
+                <a:tint val="93000"/>
+                <a:satMod val="150000"/>
+                <a:shade val="98000"/>
+                <a:lumMod val="102000"/>
+              </a:schemeClr>
+            </a:gs>
+            <a:gs pos="50000">
+              <a:schemeClr val="phClr">
+                <a:tint val="98000"/>
+                <a:satMod val="130000"/>
+                <a:shade val="90000"/>
+                <a:lumMod val="103000"/>
+              </a:schemeClr>
+            </a:gs>
+            <a:gs pos="100000">
+              <a:schemeClr val="phClr">
+                <a:shade val="63000"/>
+                <a:satMod val="120000"/>
+              </a:schemeClr>
+            </a:gs>
+          </a:gsLst>
+          <a:lin ang="5400000" scaled="0"/>
+        </a:gradFill>
+      </a:bgFillStyleLst>
+    </a:fmtScheme>
+  </a:themeElements>
+  <a:objectDefaults>
+    <a:lnDef>
+      <a:spPr/>
+      <a:bodyPr/>
+      <a:lstStyle/>
+      <a:style>
+        <a:lnRef idx="2">
+          <a:schemeClr val="accent1"/>
+        </a:lnRef>
+        <a:fillRef idx="0">
+          <a:schemeClr val="accent1"/>
+        </a:fillRef>
+        <a:effectRef idx="1">
+          <a:schemeClr val="accent1"/>
+        </a:effectRef>
+        <a:fontRef idx="minor">
+          <a:schemeClr val="tx1"/>
+        </a:fontRef>
+      </a:style>
+    </a:lnDef>
+  </a:objectDefaults>
+  <a:extraClrSchemeLst/>
+  <a:extLst>
+    <a:ext uri="{05A4C25C-085E-4340-85A3-A5531E510DB2}">
+      <thm15:themeFamily xmlns:thm15="http://schemas.microsoft.com/office/thememl/2012/main" name="Office Theme" id="{2E142A2C-CD16-42D6-873A-C26D2A0506FA}" vid="{1BDDFF52-6CD6-40A5-AB3C-68EB2F1E4D0A}"/>
+    </a:ext>
+  </a:extLst>
+</a:theme>
 </file>
</xml_diff>